<commit_message>
Bedienungsanleitung auf Version 1.1.1
Co-Authored-By: Claude Opus 5.5 (1M context) <noreply@anthropic.com>
Claude-Session: https://claude.ai/code/session_01Pp5W6sgm7Jz8Rpre9phZAZ
</commit_message>
<xml_diff>
--- a/docs/LeDoK-Bedienungsanleitung.docx
+++ b/docs/LeDoK-Bedienungsanleitung.docx
@@ -16,7 +16,7 @@
         <w:pStyle w:val="FirstParagraph"/>
       </w:pPr>
       <w:r>
-        <w:t xml:space="preserve">Stand: 20. Oktober 2026 · Version 1.1.0 Beta</w:t>
+        <w:t xml:space="preserve">Stand: 20. Oktober 2026 · Version 1.1.1 Beta</w:t>
       </w:r>
     </w:p>
     <w:bookmarkStart w:id="20" w:name="was-ledok-ist"/>
@@ -51,7 +51,7 @@
           <w:bCs/>
           <w:b/>
         </w:rPr>
-        <w:t xml:space="preserve">1.1.0 Beta</w:t>
+        <w:t xml:space="preserve">1.1.1 Beta</w:t>
       </w:r>
       <w:r>
         <w:t xml:space="preserve"> </w:t>
@@ -9415,7 +9415,7 @@
         <w:pStyle w:val="FirstParagraph"/>
       </w:pPr>
       <w:r>
-        <w:t xml:space="preserve">Unten rechts steht immer „Version 1.1.0 Beta“ (bzw. die aktuelle Nummer). Hat LeDoK ein neueres Update gefunden, steht dort „Update x.y.z verfügbar“. Ein Klick darauf öffnet den Versionsdialog; in der Desktop-App erreichst du ihn auch über das Menü</w:t>
+        <w:t xml:space="preserve">Unten rechts steht immer „Version 1.1.1 Beta“ (bzw. die aktuelle Nummer). Hat LeDoK ein neueres Update gefunden, steht dort „Update x.y.z verfügbar“. Ein Klick darauf öffnet den Versionsdialog; in der Desktop-App erreichst du ihn auch über das Menü</w:t>
       </w:r>
       <w:r>
         <w:t xml:space="preserve"> </w:t>

</xml_diff>

<commit_message>
Doku: Update-Suche mit Gründen und Mac-Berechtigungen
Co-Authored-By: Claude Opus 5.5 (1M context) <noreply@anthropic.com>
Claude-Session: https://claude.ai/code/session_01Pp5W6sgm7Jz8Rpre9phZAZ
</commit_message>
<xml_diff>
--- a/docs/LeDoK-Bedienungsanleitung.docx
+++ b/docs/LeDoK-Bedienungsanleitung.docx
@@ -9811,7 +9811,7 @@
         <w:t xml:space="preserve"> </w:t>
       </w:r>
       <w:r>
-        <w:t xml:space="preserve">(im Versionsdialog unter „Automatisch suchen“) sucht sofort.</w:t>
+        <w:t xml:space="preserve">(im Versionsdialog unter „Automatisch suchen“) sucht sofort. Findet LeDoK nichts, zeigt der Dialog, welche Ordner durchsucht wurden und warum eine gefundene Datei abgelehnt wurde (z. B. ungültige Signatur oder keine neuere Version) oder ein Ordner nicht lesbar war.</w:t>
       </w:r>
     </w:p>
     <w:p>
@@ -11103,6 +11103,48 @@
             </w:pPr>
             <w:r>
               <w:t xml:space="preserve">Diese oder eine neuere Version ist schon installiert. Nichts zu tun.</w:t>
+            </w:r>
+          </w:p>
+        </w:tc>
+      </w:tr>
+      <w:tr>
+        <w:tc>
+          <w:tcPr/>
+          <w:p>
+            <w:pPr>
+              <w:pStyle w:val="Compact"/>
+              <w:jc w:val="left"/>
+            </w:pPr>
+            <w:r>
+              <w:t xml:space="preserve">Mac: „Jetzt suchen“ meldet „Kein Zugriff“ auf den Download-Ordner</w:t>
+            </w:r>
+          </w:p>
+        </w:tc>
+        <w:tc>
+          <w:tcPr/>
+          <w:p>
+            <w:pPr>
+              <w:pStyle w:val="Compact"/>
+              <w:jc w:val="left"/>
+            </w:pPr>
+            <w:r>
+              <w:t xml:space="preserve">Systemeinstellungen → Datenschutz &amp; Sicherheit → Dateien und Ordner → LeDoK →</w:t>
+            </w:r>
+            <w:r>
+              <w:t xml:space="preserve"> </w:t>
+            </w:r>
+            <w:r>
+              <w:rPr>
+                <w:bCs/>
+                <w:b/>
+              </w:rPr>
+              <w:t xml:space="preserve">Downloads</w:t>
+            </w:r>
+            <w:r>
+              <w:t xml:space="preserve"> </w:t>
+            </w:r>
+            <w:r>
+              <w:t xml:space="preserve">erlauben. Ab dem nächsten Installer fragt der Mac beim ersten Mal selbst nach.</w:t>
             </w:r>
           </w:p>
         </w:tc>

</xml_diff>

<commit_message>
Listen: Kinder per Filter auswählen, Zahlungsbrief allgemein oder personalisiert
- Sammelliste: „Kinder auswählen …“ mit Filtern nach Name/Kürzel, Klasse und
  Jahrgangsstufe; Auswahl in l.kinder (null = alle Kinder)
- Zahlungsbriefe: Dialog mit personalisiert/allgemein und mit/ohne GiroCode,
  Wahl je Liste in l.brief
- Bedienungsanleitung, Technik-Doku, CHANGELOG und Version 1.1.3

Co-Authored-By: Claude Opus 5.5 (1M context) <noreply@anthropic.com>
Claude-Session: https://claude.ai/code/session_018A1gEo9fsWkdWxpiSwZqpL
</commit_message>
<xml_diff>
--- a/docs/LeDoK-Bedienungsanleitung.docx
+++ b/docs/LeDoK-Bedienungsanleitung.docx
@@ -16,7 +16,7 @@
         <w:pStyle w:val="FirstParagraph"/>
       </w:pPr>
       <w:r>
-        <w:t xml:space="preserve">Stand: 20. Oktober 2026 · Version 1.1.2 Beta</w:t>
+        <w:t>Stand: 20. Oktober 2026 · Version 1.1.3 Beta</w:t>
       </w:r>
     </w:p>
     <w:bookmarkStart w:id="20" w:name="was-ledok-ist"/>
@@ -51,7 +51,7 @@
           <w:bCs/>
           <w:b/>
         </w:rPr>
-        <w:t xml:space="preserve">1.1.2 Beta</w:t>
+        <w:t>1.1.3 Beta</w:t>
       </w:r>
       <w:r>
         <w:t xml:space="preserve"> </w:t>
@@ -5769,6 +5769,143 @@
       </w:pPr>
       <w:r>
         <w:rPr>
+          <w:b/>
+        </w:rPr>
+        <w:t>Kinder auswählen …</w:t>
+      </w:r>
+      <w:r>
+        <w:rPr/>
+        <w:t xml:space="preserve"> legt fest, wer auf der Liste steht. Neue Listen gelten für alle Kinder; über der Tabelle steht, wie viele es sind. Im Fenster grenzt du die Anzeige mit drei Filtern ein: </w:t>
+      </w:r>
+      <w:r>
+        <w:rPr>
+          <w:b/>
+        </w:rPr>
+        <w:t>Name</w:t>
+      </w:r>
+      <w:r>
+        <w:rPr/>
+        <w:t xml:space="preserve"> (bzw. Kürzel, solange oben „Kürzel“ eingestellt ist), </w:t>
+      </w:r>
+      <w:r>
+        <w:rPr>
+          <w:b/>
+        </w:rPr>
+        <w:t>Klasse</w:t>
+      </w:r>
+      <w:r>
+        <w:rPr/>
+        <w:t xml:space="preserve"> (deine eigene Klasse und z. B. 1a, 1b oder 2c bei Kindern aus anderen Klassen) und </w:t>
+      </w:r>
+      <w:r>
+        <w:rPr>
+          <w:b/>
+        </w:rPr>
+        <w:t>Jahrgangsstufe</w:t>
+      </w:r>
+      <w:r>
+        <w:rPr/>
+        <w:t xml:space="preserve">. Mit </w:t>
+      </w:r>
+      <w:r>
+        <w:rPr>
+          <w:b/>
+        </w:rPr>
+        <w:t>Angezeigte auswählen</w:t>
+      </w:r>
+      <w:r>
+        <w:rPr/>
+        <w:t xml:space="preserve"> und </w:t>
+      </w:r>
+      <w:r>
+        <w:rPr>
+          <w:b/>
+        </w:rPr>
+        <w:t>Angezeigte abwählen</w:t>
+      </w:r>
+      <w:r>
+        <w:rPr/>
+        <w:t xml:space="preserve"> setzt oder entfernst du die Haken aller angezeigten Kinder auf einmal, einzelne Kinder hakst du direkt an. Die Filter verändern nur die Anzeige; was angehakt ist, kommt mit </w:t>
+      </w:r>
+      <w:r>
+        <w:rPr>
+          <w:b/>
+        </w:rPr>
+        <w:t>Übernehmen</w:t>
+      </w:r>
+      <w:r>
+        <w:rPr/>
+        <w:t xml:space="preserve"> auf die Liste. Beispiel: Für einen Ausflug nur der 1. Jahrgangsstufe klickst du ohne Filter auf „Angezeigte abwählen“, wählst dann Jahrgangsstufe 1 und klickst „Angezeigte auswählen“.</w:t>
+      </w:r>
+    </w:p>
+    <w:p>
+      <w:pPr>
+        <w:pStyle w:val="CaptionedFigure"/>
+      </w:pPr>
+      <w:r>
+        <w:drawing>
+          <wp:inline>
+            <wp:extent cx="5399999" cy="3374999"/>
+            <wp:docPr id="145" name="Picture 145" descr="Kinder auswählen mit Filter nach Jahrgangsstufe"/>
+            <wp:cNvGraphicFramePr>
+              <a:graphicFrameLocks noChangeAspect="1"/>
+            </wp:cNvGraphicFramePr>
+            <a:graphic>
+              <a:graphicData uri="http://schemas.openxmlformats.org/drawingml/2006/picture">
+                <pic:pic>
+                  <pic:nvPicPr>
+                    <pic:cNvPr id="0" name="image.jpg"/>
+                    <pic:cNvPicPr/>
+                  </pic:nvPicPr>
+                  <pic:blipFill>
+                    <a:blip r:embed="rId9"/>
+                    <a:stretch>
+                      <a:fillRect/>
+                    </a:stretch>
+                  </pic:blipFill>
+                  <pic:spPr>
+                    <a:xfrm>
+                      <a:off x="0" y="0"/>
+                      <a:ext cx="5399999" cy="3374999"/>
+                    </a:xfrm>
+                    <a:prstGeom prst="rect"/>
+                  </pic:spPr>
+                </pic:pic>
+              </a:graphicData>
+            </a:graphic>
+          </wp:inline>
+        </w:drawing>
+      </w:r>
+    </w:p>
+    <w:p>
+      <w:pPr>
+        <w:pStyle w:val="ImageCaption"/>
+      </w:pPr>
+      <w:r>
+        <w:t xml:space="preserve">Kinder auswählen mit Filter nach Jahrgangsstufe</w:t>
+      </w:r>
+    </w:p>
+    <w:p>
+      <w:pPr>
+        <w:numPr>
+          <w:ilvl w:val="0"/>
+          <w:numId w:val="1017"/>
+        </w:numPr>
+      </w:pPr>
+      <w:r>
+        <w:rPr/>
+        <w:t>Sind alle Kinder angehakt, kommen später neu angelegte Kinder automatisch auf die Liste. Wählst du ein Kind ab, bei dem schon etwas eingetragen ist, fragt LeDoK nach; die Zahlung wird dann gelöscht und fällt aus der Summe und dem Kassenbuch. Liste drucken, Zahlungsbriefe und „Offene Listen“ auf Heute berücksichtigen nur die Kinder der Liste.</w:t>
+      </w:r>
+    </w:p>
+    <w:p>
+      <w:pPr>
+        <w:numPr>
+          <w:ilvl w:val="0"/>
+          <w:numId w:val="1017"/>
+        </w:numPr>
+      </w:pPr>
+      <w:r>
+        <w:rPr>
           <w:bCs/>
           <w:b/>
         </w:rPr>
@@ -5790,61 +5927,150 @@
       </w:pPr>
       <w:r>
         <w:rPr>
-          <w:bCs/>
-          <w:b/>
-        </w:rPr>
-        <w:t xml:space="preserve">Zahlungsbriefe drucken …</w:t>
-      </w:r>
-      <w:r>
-        <w:t xml:space="preserve"> </w:t>
-      </w:r>
-      <w:r>
-        <w:t xml:space="preserve">erzeugt für jedes Kind, das noch offen ist, einen Elternbrief mit Briefkopf. Den Text änderst du unter</w:t>
-      </w:r>
-      <w:r>
-        <w:t xml:space="preserve"> </w:t>
-      </w:r>
-      <w:r>
-        <w:rPr>
-          <w:bCs/>
-          <w:b/>
-        </w:rPr>
-        <w:t xml:space="preserve">Text des Zahlungsbriefs</w:t>
-      </w:r>
-      <w:r>
-        <w:t xml:space="preserve"> </w:t>
-      </w:r>
-      <w:r>
-        <w:t xml:space="preserve">mit den Platzhaltern {Vorname}, {Zweck}, {Betrag}, {Frist}, {Lehrkraft}, {Klasse} und {Schule};</w:t>
-      </w:r>
-      <w:r>
-        <w:t xml:space="preserve"> </w:t>
-      </w:r>
-      <w:r>
-        <w:rPr>
-          <w:bCs/>
-          <w:b/>
-        </w:rPr>
-        <w:t xml:space="preserve">Standardtext</w:t>
-      </w:r>
-      <w:r>
-        <w:t xml:space="preserve"> </w:t>
-      </w:r>
-      <w:r>
-        <w:t xml:space="preserve">stellt den mitgelieferten Text wieder her. Ist unter Klassenkasse eine gültige Bankverbindung eingetragen, stehen auf dem Brief die Überweisungsdaten und ein</w:t>
-      </w:r>
-      <w:r>
-        <w:t xml:space="preserve"> </w:t>
-      </w:r>
-      <w:r>
-        <w:rPr>
-          <w:bCs/>
-          <w:b/>
-        </w:rPr>
-        <w:t xml:space="preserve">GiroCode</w:t>
-      </w:r>
-      <w:r>
-        <w:t xml:space="preserve">: Die Eltern scannen ihn mit ihrer Banking-App, Empfänger, Betrag und Verwendungszweck sind dann schon ausgefüllt. Ohne Bankverbindung bekommt der Brief stattdessen einen Abschnitt zum Zurückgeben mit dem Bargeld.</w:t>
+          <w:b/>
+        </w:rPr>
+        <w:t>Zahlungsbriefe drucken …</w:t>
+      </w:r>
+      <w:r>
+        <w:rPr/>
+        <w:t xml:space="preserve"> öffnet ein Fenster mit zwei Fragen. </w:t>
+      </w:r>
+      <w:r>
+        <w:rPr>
+          <w:b/>
+        </w:rPr>
+        <w:t>Welches Dokument?</w:t>
+      </w:r>
+      <w:r>
+        <w:rPr/>
+        <w:t xml:space="preserve"> </w:t>
+      </w:r>
+      <w:r>
+        <w:rPr>
+          <w:b/>
+        </w:rPr>
+        <w:t>personalisiert</w:t>
+      </w:r>
+      <w:r>
+        <w:rPr/>
+        <w:t xml:space="preserve"> erzeugt für jedes Kind, das noch offen ist, einen eigenen Elternbrief mit Namen. </w:t>
+      </w:r>
+      <w:r>
+        <w:rPr>
+          <w:b/>
+        </w:rPr>
+        <w:t>allgemein</w:t>
+      </w:r>
+      <w:r>
+        <w:rPr/>
+        <w:t xml:space="preserve"> erzeugt einen einzigen Brief ohne Namen, den du kopierst und an alle austeilst, zum Beispiel schon bevor du mit dem Einsammeln beginnst. Im allgemeinen Brief wird aus „Liebe Eltern von {Vorname},“ einfach „Liebe Eltern,“, andere Stellen mit {Vorname} heißen „Ihr Kind“. </w:t>
+      </w:r>
+      <w:r>
+        <w:rPr>
+          <w:b/>
+        </w:rPr>
+        <w:t>Zahlungscode</w:t>
+      </w:r>
+      <w:r>
+        <w:rPr/>
+        <w:t xml:space="preserve">: </w:t>
+      </w:r>
+      <w:r>
+        <w:rPr>
+          <w:b/>
+        </w:rPr>
+        <w:t>mit GiroCode</w:t>
+      </w:r>
+      <w:r>
+        <w:rPr/>
+        <w:t xml:space="preserve"> druckt den QR-Code für die Banking-App dazu, </w:t>
+      </w:r>
+      <w:r>
+        <w:rPr>
+          <w:b/>
+        </w:rPr>
+        <w:t>ohne Zahlungscode</w:t>
+      </w:r>
+      <w:r>
+        <w:rPr/>
+        <w:t xml:space="preserve"> nur die Überweisungsdaten. LeDoK merkt sich deine Wahl je Liste. Den Text änderst du unter </w:t>
+      </w:r>
+      <w:r>
+        <w:rPr>
+          <w:b/>
+        </w:rPr>
+        <w:t>Text des Zahlungsbriefs</w:t>
+      </w:r>
+      <w:r>
+        <w:rPr/>
+        <w:t xml:space="preserve"> mit den Platzhaltern {Vorname}, {Zweck}, {Betrag}, {Frist}, {Lehrkraft}, {Klasse} und {Schule}; </w:t>
+      </w:r>
+      <w:r>
+        <w:rPr>
+          <w:b/>
+        </w:rPr>
+        <w:t>Standardtext</w:t>
+      </w:r>
+      <w:r>
+        <w:rPr/>
+        <w:t xml:space="preserve"> stellt den mitgelieferten Text wieder her. Ist unter Klassenkasse eine gültige Bankverbindung eingetragen, stehen auf dem Brief die Überweisungsdaten und auf Wunsch ein </w:t>
+      </w:r>
+      <w:r>
+        <w:rPr>
+          <w:b/>
+        </w:rPr>
+        <w:t>GiroCode</w:t>
+      </w:r>
+      <w:r>
+        <w:rPr/>
+        <w:t>: Die Eltern scannen ihn mit ihrer Banking-App, Empfänger, Betrag und Verwendungszweck sind dann schon ausgefüllt. Beim allgemeinen Brief endet der Verwendungszweck mit „Kind:“, und die Eltern ergänzen den Namen ihres Kindes. Ohne Bankverbindung ist „mit GiroCode“ nicht wählbar, und der Brief bekommt einen Abschnitt zum Zurückgeben mit dem Bargeld (beim allgemeinen Brief mit einer Zeile für den Namen des Kindes).</w:t>
+      </w:r>
+    </w:p>
+    <w:p>
+      <w:pPr>
+        <w:pStyle w:val="CaptionedFigure"/>
+      </w:pPr>
+      <w:r>
+        <w:drawing>
+          <wp:inline>
+            <wp:extent cx="5399999" cy="3374999"/>
+            <wp:docPr id="146" name="Picture 146" descr="Zahlungsbriefe: personalisiert oder allgemein, mit oder ohne GiroCode"/>
+            <wp:cNvGraphicFramePr>
+              <a:graphicFrameLocks noChangeAspect="1"/>
+            </wp:cNvGraphicFramePr>
+            <a:graphic>
+              <a:graphicData uri="http://schemas.openxmlformats.org/drawingml/2006/picture">
+                <pic:pic>
+                  <pic:nvPicPr>
+                    <pic:cNvPr id="0" name="image.jpg"/>
+                    <pic:cNvPicPr/>
+                  </pic:nvPicPr>
+                  <pic:blipFill>
+                    <a:blip r:embed="rId10"/>
+                    <a:stretch>
+                      <a:fillRect/>
+                    </a:stretch>
+                  </pic:blipFill>
+                  <pic:spPr>
+                    <a:xfrm>
+                      <a:off x="0" y="0"/>
+                      <a:ext cx="5399999" cy="3374999"/>
+                    </a:xfrm>
+                    <a:prstGeom prst="rect"/>
+                  </pic:spPr>
+                </pic:pic>
+              </a:graphicData>
+            </a:graphic>
+          </wp:inline>
+        </w:drawing>
+      </w:r>
+    </w:p>
+    <w:p>
+      <w:pPr>
+        <w:pStyle w:val="ImageCaption"/>
+      </w:pPr>
+      <w:r>
+        <w:t xml:space="preserve">Zahlungsbriefe: personalisiert oder allgemein, mit oder ohne GiroCode</w:t>
       </w:r>
     </w:p>
     <w:p>
@@ -5860,7 +6086,7 @@
           <wp:inline>
             <wp:extent cx="5399999" cy="3377454"/>
             <wp:effectExtent b="0" l="0" r="0" t="0"/>
-            <wp:docPr descr="Zahlungsbrief mit GiroCode in der Druckvorschau" title="" id="83" name="Picture"/>
+            <wp:docPr descr="Personalisierter Zahlungsbrief mit GiroCode in der Druckvorschau" title="" id="83" name="Picture"/>
             <a:graphic>
               <a:graphicData uri="http://schemas.openxmlformats.org/drawingml/2006/picture">
                 <pic:pic>
@@ -5907,7 +6133,54 @@
         <w:pStyle w:val="ImageCaption"/>
       </w:pPr>
       <w:r>
-        <w:t xml:space="preserve">Zahlungsbrief mit GiroCode in der Druckvorschau</w:t>
+        <w:t>Personalisierter Zahlungsbrief mit GiroCode in der Druckvorschau</w:t>
+      </w:r>
+    </w:p>
+    <w:p>
+      <w:pPr>
+        <w:pStyle w:val="CaptionedFigure"/>
+      </w:pPr>
+      <w:r>
+        <w:drawing>
+          <wp:inline>
+            <wp:extent cx="5399999" cy="3374999"/>
+            <wp:docPr id="147" name="Picture 147" descr="Allgemeiner Zahlungsbrief ohne Namen zum Kopieren"/>
+            <wp:cNvGraphicFramePr>
+              <a:graphicFrameLocks noChangeAspect="1"/>
+            </wp:cNvGraphicFramePr>
+            <a:graphic>
+              <a:graphicData uri="http://schemas.openxmlformats.org/drawingml/2006/picture">
+                <pic:pic>
+                  <pic:nvPicPr>
+                    <pic:cNvPr id="0" name="image.jpg"/>
+                    <pic:cNvPicPr/>
+                  </pic:nvPicPr>
+                  <pic:blipFill>
+                    <a:blip r:embed="rId11"/>
+                    <a:stretch>
+                      <a:fillRect/>
+                    </a:stretch>
+                  </pic:blipFill>
+                  <pic:spPr>
+                    <a:xfrm>
+                      <a:off x="0" y="0"/>
+                      <a:ext cx="5399999" cy="3374999"/>
+                    </a:xfrm>
+                    <a:prstGeom prst="rect"/>
+                  </pic:spPr>
+                </pic:pic>
+              </a:graphicData>
+            </a:graphic>
+          </wp:inline>
+        </w:drawing>
+      </w:r>
+    </w:p>
+    <w:p>
+      <w:pPr>
+        <w:pStyle w:val="ImageCaption"/>
+      </w:pPr>
+      <w:r>
+        <w:t xml:space="preserve">Allgemeiner Zahlungsbrief ohne Namen zum Kopieren</w:t>
       </w:r>
     </w:p>
     <w:p>
@@ -10559,7 +10832,7 @@
         <w:pStyle w:val="FirstParagraph"/>
       </w:pPr>
       <w:r>
-        <w:t xml:space="preserve">Unten rechts steht immer „Version 1.1.2 Beta“ (bzw. die aktuelle Nummer). Hat LeDoK ein neueres Update gefunden, steht dort „Update x.y.z verfügbar“. Ein Klick darauf öffnet den Versionsdialog; in der Desktop-App erreichst du ihn auch über das Menü</w:t>
+        <w:t>Unten rechts steht immer „Version 1.1.3 Beta“ (bzw. die aktuelle Nummer). Hat LeDoK ein neueres Update gefunden, steht dort „Update x.y.z verfügbar“. Ein Klick darauf öffnet den Versionsdialog; in der Desktop-App erreichst du ihn auch über das Menü</w:t>
       </w:r>
       <w:r>
         <w:t xml:space="preserve"> </w:t>

</xml_diff>

<commit_message>
Dienste: rollierender Dienstplan für Kinder (Tafeldienst usw.)
Co-Authored-By: Claude Opus 5.5 (1M context) <noreply@anthropic.com>
Claude-Session: https://claude.ai/code/session_01PuSatksBme3wWAfoLPP1pW
</commit_message>
<xml_diff>
--- a/docs/LeDoK-Bedienungsanleitung.docx
+++ b/docs/LeDoK-Bedienungsanleitung.docx
@@ -3311,6 +3311,33 @@
       </w:pPr>
       <w:r>
         <w:rPr>
+          <w:b/>
+        </w:rPr>
+        <w:t>Dienste:</w:t>
+      </w:r>
+      <w:r>
+        <w:t xml:space="preserve"> wer in dieser Runde Tafeldienst, Austeildienst usw. hat. Fehlt ein Kind, steht daneben eine Vertretung. </w:t>
+      </w:r>
+      <w:r>
+        <w:rPr>
+          <w:b/>
+        </w:rPr>
+        <w:t>Plan</w:t>
+      </w:r>
+      <w:r>
+        <w:t xml:space="preserve"> öffnet Listen → Dienste (Kapitel 5.7).</w:t>
+      </w:r>
+    </w:p>
+    <w:p>
+      <w:pPr>
+        <w:numPr>
+          <w:ilvl w:val="0"/>
+          <w:numId w:val="1010"/>
+        </w:numPr>
+        <w:pStyle w:val="Compact"/>
+      </w:pPr>
+      <w:r>
+        <w:rPr>
           <w:bCs/>
           <w:b/>
         </w:rPr>
@@ -5509,11 +5536,9 @@
         <w:t xml:space="preserve">Klassenkasse</w:t>
       </w:r>
       <w:r>
-        <w:t xml:space="preserve"> </w:t>
-      </w:r>
-      <w:r>
-        <w:t xml:space="preserve">und</w:t>
-      </w:r>
+        <w:t>,</w:t>
+      </w:r>
+      <w:r/>
       <w:r>
         <w:t xml:space="preserve"> </w:t>
       </w:r>
@@ -5523,6 +5548,16 @@
           <w:b/>
         </w:rPr>
         <w:t xml:space="preserve">Fehltage</w:t>
+      </w:r>
+      <w:r>
+        <w:t xml:space="preserve"> und </w:t>
+      </w:r>
+      <w:r>
+        <w:rPr>
+          <w:bCs/>
+          <w:b/>
+        </w:rPr>
+        <w:t xml:space="preserve">Dienste</w:t>
       </w:r>
       <w:r>
         <w:t xml:space="preserve">.</w:t>
@@ -6648,6 +6683,378 @@
       </w:pPr>
       <w:r>
         <w:t xml:space="preserve">Wer heute fehlt, zählt beim Fokustag und im Balken „Dein Tag“ nicht mit. In Erfassen und auf der Kind-Seite ist das Kind als „fehlt“ markiert.</w:t>
+      </w:r>
+    </w:p>
+    <w:p>
+      <w:pPr>
+        <w:pStyle w:val="FirstParagraph"/>
+      </w:pPr>
+      <w:r>
+        <w:rPr>
+          <w:b/>
+        </w:rPr>
+        <w:t>Dienste.</w:t>
+      </w:r>
+      <w:r>
+        <w:t xml:space="preserve"> Unter </w:t>
+      </w:r>
+      <w:r>
+        <w:rPr>
+          <w:b/>
+        </w:rPr>
+        <w:t>Listen → Dienste</w:t>
+      </w:r>
+      <w:r>
+        <w:t xml:space="preserve"> verteilst du die Klassendienste wie Tafeldienst, Austeildienst oder Blumendienst reihum an alle Kinder. LeDoK rechnet selbst aus, wer dran ist: Jede Runde kommen die nächsten Kinder der Reihe dran, und nach jedem Durchlauf der Klasse rücken die Dienste einen Platz weiter, damit jedes Kind mal jeden Dienst hat.</w:t>
+      </w:r>
+    </w:p>
+    <w:p>
+      <w:pPr>
+        <w:pStyle w:val="CaptionedFigure"/>
+      </w:pPr>
+      <w:r>
+        <w:drawing>
+          <wp:inline>
+            <wp:extent cx="5399999" cy="3374999"/>
+            <wp:effectExtent b="0" l="0" r="0" t="0"/>
+            <wp:docPr descr="Listen → Dienste" title="" id="148" name="Picture"/>
+            <a:graphic>
+              <a:graphicData uri="http://schemas.openxmlformats.org/drawingml/2006/picture">
+                <pic:pic>
+                  <pic:nvPicPr>
+                    <pic:cNvPr descr="jpg/43-dienste.jpg" id="149" name="Picture"/>
+                    <pic:cNvPicPr>
+                      <a:picLocks noChangeArrowheads="1" noChangeAspect="1"/>
+                    </pic:cNvPicPr>
+                  </pic:nvPicPr>
+                  <pic:blipFill>
+                    <a:blip r:embed="rId12"/>
+                    <a:stretch>
+                      <a:fillRect/>
+                    </a:stretch>
+                  </pic:blipFill>
+                  <pic:spPr bwMode="auto">
+                    <a:xfrm>
+                      <a:off x="0" y="0"/>
+                      <a:ext cx="5399999" cy="3374999"/>
+                    </a:xfrm>
+                    <a:prstGeom prst="rect">
+                      <a:avLst/>
+                    </a:prstGeom>
+                    <a:noFill/>
+                    <a:ln w="9525">
+                      <a:noFill/>
+                      <a:headEnd/>
+                      <a:tailEnd/>
+                    </a:ln>
+                  </pic:spPr>
+                </pic:pic>
+              </a:graphicData>
+            </a:graphic>
+          </wp:inline>
+        </w:drawing>
+      </w:r>
+    </w:p>
+    <w:p>
+      <w:pPr>
+        <w:pStyle w:val="ImageCaption"/>
+      </w:pPr>
+      <w:r>
+        <w:t>Listen → Dienste: wer in dieser Woche welchen Dienst hat</w:t>
+      </w:r>
+    </w:p>
+    <w:p>
+      <w:pPr>
+        <w:numPr>
+          <w:ilvl w:val="0"/>
+          <w:numId w:val="1018"/>
+        </w:numPr>
+        <w:pStyle w:val="Compact"/>
+      </w:pPr>
+      <w:r>
+        <w:rPr>
+          <w:b/>
+        </w:rPr>
+        <w:t>Dienste anlegen:</w:t>
+      </w:r>
+      <w:r>
+        <w:t xml:space="preserve"> Beim ersten Mal übernimmst du mit </w:t>
+      </w:r>
+      <w:r>
+        <w:rPr>
+          <w:b/>
+        </w:rPr>
+        <w:t>Vorschläge übernehmen</w:t>
+      </w:r>
+      <w:r>
+        <w:t xml:space="preserve"> sechs übliche Dienste. Mit </w:t>
+      </w:r>
+      <w:r>
+        <w:rPr>
+          <w:b/>
+        </w:rPr>
+        <w:t>＋ Dienst</w:t>
+      </w:r>
+      <w:r>
+        <w:t xml:space="preserve"> legst du weitere an, zum Beispiel „Lichtdienst“ oder „Klassentier füttern“. Je Dienst stellst du ein Zeichen (z. B. 🧽), den Namen und die Zahl der Kinder (1 bis 4) ein. Mit ↑ änderst du die Reihenfolge, mit ✕ löschst du einen Dienst.</w:t>
+      </w:r>
+    </w:p>
+    <w:p>
+      <w:pPr>
+        <w:numPr>
+          <w:ilvl w:val="0"/>
+          <w:numId w:val="1018"/>
+        </w:numPr>
+        <w:pStyle w:val="Compact"/>
+      </w:pPr>
+      <w:r>
+        <w:rPr>
+          <w:b/>
+        </w:rPr>
+        <w:t>Wechsel:</w:t>
+      </w:r>
+      <w:r>
+        <w:t xml:space="preserve"> jede Woche, alle zwei Wochen oder jeden Schultag. Am Wochenende zeigt LeDoK bei „jeden Schultag“ schon den Montag.</w:t>
+      </w:r>
+    </w:p>
+    <w:p>
+      <w:pPr>
+        <w:numPr>
+          <w:ilvl w:val="0"/>
+          <w:numId w:val="1018"/>
+        </w:numPr>
+        <w:pStyle w:val="Compact"/>
+      </w:pPr>
+      <w:r>
+        <w:rPr>
+          <w:b/>
+        </w:rPr>
+        <w:t>Wer macht mit:</w:t>
+      </w:r>
+      <w:r>
+        <w:t xml:space="preserve"> Alle Kinder der Klasse sind dabei, sortiert nach Kürzel. </w:t>
+      </w:r>
+      <w:r>
+        <w:rPr>
+          <w:b/>
+        </w:rPr>
+        <w:t>Reihenfolge mischen</w:t>
+      </w:r>
+      <w:r>
+        <w:t xml:space="preserve"> lost eine neue Reihenfolge aus, </w:t>
+      </w:r>
+      <w:r>
+        <w:rPr>
+          <w:b/>
+        </w:rPr>
+        <w:t>nach Kürzel</w:t>
+      </w:r>
+      <w:r>
+        <w:t xml:space="preserve"> stellt die alte wieder her. Tippst du ein Kind an, macht es gerade Pause (zum Beispiel bei einem gebrochenen Arm); ein zweiter Klick nimmt es wieder auf.</w:t>
+      </w:r>
+    </w:p>
+    <w:p>
+      <w:pPr>
+        <w:numPr>
+          <w:ilvl w:val="0"/>
+          <w:numId w:val="1018"/>
+        </w:numPr>
+        <w:pStyle w:val="Compact"/>
+      </w:pPr>
+      <w:r>
+        <w:rPr>
+          <w:b/>
+        </w:rPr>
+        <w:t>Tauschen:</w:t>
+      </w:r>
+      <w:r>
+        <w:t xml:space="preserve"> Oben siehst du die aktuelle Runde, mit ◀ und ▶ die davor und danach. Wählst du bei einem Dienst ein anderes Kind, tauschen die beiden ihre Plätze, nur für diese Runde. Hatte das gewählte Kind keinen Dienst, hat das bisherige diesmal frei. </w:t>
+      </w:r>
+      <w:r>
+        <w:rPr>
+          <w:b/>
+        </w:rPr>
+        <w:t>Änderungen dieser Runde zurücknehmen</w:t>
+      </w:r>
+      <w:r>
+        <w:t xml:space="preserve"> stellt den berechneten Plan wieder her.</w:t>
+      </w:r>
+    </w:p>
+    <w:p>
+      <w:pPr>
+        <w:numPr>
+          <w:ilvl w:val="0"/>
+          <w:numId w:val="1018"/>
+        </w:numPr>
+        <w:pStyle w:val="Compact"/>
+      </w:pPr>
+      <w:r>
+        <w:rPr>
+          <w:b/>
+        </w:rPr>
+        <w:t>Nach den Ferien:</w:t>
+      </w:r>
+      <w:r>
+        <w:t xml:space="preserve"> Der Plan läuft mit dem Kalender weiter. Sollen die Kinder weitermachen, die vor den Ferien dran gewesen wären, schiebst du ihn mit </w:t>
+      </w:r>
+      <w:r>
+        <w:rPr>
+          <w:b/>
+        </w:rPr>
+        <w:t>eine Runde zurück</w:t>
+      </w:r>
+      <w:r>
+        <w:t xml:space="preserve"> passend zurück.</w:t>
+      </w:r>
+    </w:p>
+    <w:p>
+      <w:pPr>
+        <w:pStyle w:val="CaptionedFigure"/>
+      </w:pPr>
+      <w:r>
+        <w:drawing>
+          <wp:inline>
+            <wp:extent cx="5399999" cy="3374999"/>
+            <wp:effectExtent b="0" l="0" r="0" t="0"/>
+            <wp:docPr descr="Dienste einstellen" title="" id="150" name="Picture"/>
+            <a:graphic>
+              <a:graphicData uri="http://schemas.openxmlformats.org/drawingml/2006/picture">
+                <pic:pic>
+                  <pic:nvPicPr>
+                    <pic:cNvPr descr="jpg/44-dienste-einstellen.jpg" id="151" name="Picture"/>
+                    <pic:cNvPicPr>
+                      <a:picLocks noChangeArrowheads="1" noChangeAspect="1"/>
+                    </pic:cNvPicPr>
+                  </pic:nvPicPr>
+                  <pic:blipFill>
+                    <a:blip r:embed="rId13"/>
+                    <a:stretch>
+                      <a:fillRect/>
+                    </a:stretch>
+                  </pic:blipFill>
+                  <pic:spPr bwMode="auto">
+                    <a:xfrm>
+                      <a:off x="0" y="0"/>
+                      <a:ext cx="5399999" cy="3374999"/>
+                    </a:xfrm>
+                    <a:prstGeom prst="rect">
+                      <a:avLst/>
+                    </a:prstGeom>
+                    <a:noFill/>
+                    <a:ln w="9525">
+                      <a:noFill/>
+                      <a:headEnd/>
+                      <a:tailEnd/>
+                    </a:ln>
+                  </pic:spPr>
+                </pic:pic>
+              </a:graphicData>
+            </a:graphic>
+          </wp:inline>
+        </w:drawing>
+      </w:r>
+    </w:p>
+    <w:p>
+      <w:pPr>
+        <w:pStyle w:val="ImageCaption"/>
+      </w:pPr>
+      <w:r>
+        <w:t>Dienste, Wechsel und wer mitmacht</w:t>
+      </w:r>
+    </w:p>
+    <w:p>
+      <w:pPr>
+        <w:pStyle w:val="BodyText"/>
+      </w:pPr>
+      <w:r>
+        <w:rPr>
+          <w:b/>
+        </w:rPr>
+        <w:t>Aushang drucken</w:t>
+      </w:r>
+      <w:r>
+        <w:t xml:space="preserve"> druckt den Plan der gezeigten Runde in großer Schrift mit den Vornamen der Kinder, darunter die nächsten fünf Runden. So hängst du ihn in der Klasse auf und die Kinder sehen selbst, wann sie dran sind.</w:t>
+      </w:r>
+    </w:p>
+    <w:p>
+      <w:pPr>
+        <w:pStyle w:val="CaptionedFigure"/>
+      </w:pPr>
+      <w:r>
+        <w:drawing>
+          <wp:inline>
+            <wp:extent cx="5399999" cy="3374999"/>
+            <wp:effectExtent b="0" l="0" r="0" t="0"/>
+            <wp:docPr descr="Aushang der Dienste" title="" id="152" name="Picture"/>
+            <a:graphic>
+              <a:graphicData uri="http://schemas.openxmlformats.org/drawingml/2006/picture">
+                <pic:pic>
+                  <pic:nvPicPr>
+                    <pic:cNvPr descr="jpg/46-dienste-aushang.jpg" id="153" name="Picture"/>
+                    <pic:cNvPicPr>
+                      <a:picLocks noChangeArrowheads="1" noChangeAspect="1"/>
+                    </pic:cNvPicPr>
+                  </pic:nvPicPr>
+                  <pic:blipFill>
+                    <a:blip r:embed="rId14"/>
+                    <a:stretch>
+                      <a:fillRect/>
+                    </a:stretch>
+                  </pic:blipFill>
+                  <pic:spPr bwMode="auto">
+                    <a:xfrm>
+                      <a:off x="0" y="0"/>
+                      <a:ext cx="5399999" cy="3374999"/>
+                    </a:xfrm>
+                    <a:prstGeom prst="rect">
+                      <a:avLst/>
+                    </a:prstGeom>
+                    <a:noFill/>
+                    <a:ln w="9525">
+                      <a:noFill/>
+                      <a:headEnd/>
+                      <a:tailEnd/>
+                    </a:ln>
+                  </pic:spPr>
+                </pic:pic>
+              </a:graphicData>
+            </a:graphic>
+          </wp:inline>
+        </w:drawing>
+      </w:r>
+    </w:p>
+    <w:p>
+      <w:pPr>
+        <w:pStyle w:val="ImageCaption"/>
+      </w:pPr>
+      <w:r>
+        <w:t>Aushang der Dienste in der Druckvorschau</w:t>
+      </w:r>
+    </w:p>
+    <w:p>
+      <w:pPr>
+        <w:pStyle w:val="BodyText"/>
+      </w:pPr>
+      <w:r>
+        <w:t xml:space="preserve">Auf </w:t>
+      </w:r>
+      <w:r>
+        <w:rPr>
+          <w:b/>
+        </w:rPr>
+        <w:t>Heute</w:t>
+      </w:r>
+      <w:r>
+        <w:t xml:space="preserve"> zeigt die Karte </w:t>
+      </w:r>
+      <w:r>
+        <w:rPr>
+          <w:b/>
+        </w:rPr>
+        <w:t>Dienste</w:t>
+      </w:r>
+      <w:r>
+        <w:t>, wer gerade dran ist. Fehlt ein Kind, ist es durchgestrichen, und LeDoK nennt als Vertretung das nächste Kind der Reihe, das diesmal keinen Dienst hat und da ist.</w:t>
       </w:r>
     </w:p>
     <w:bookmarkEnd w:id="94"/>

</xml_diff>

<commit_message>
Klassenbuch mit Verknüpfung zu den Lernzielen des LehrplanPLUS
Neuer Reiter Klassenbuch: Woche mit Stunden aus dem Stundenplan, Eintrag je
Stunde (Fach, Thema, Hausaufgabe, Bemerkung, Lernziele), Bemerkung zum Tag,
Fehlende aus den Fehltagen, Wochendruck. Unterseite Lernziele zeigt je Fach
die behandelten Kompetenzerwartungen, Stunden und bewertete Kinder. Karte auf
Heute, Hilfe, Bedienungsanleitung, Tests.

Co-Authored-By: Claude Opus 5.5 (1M context) <noreply@anthropic.com>
Claude-Session: https://claude.ai/code/session_01Lq7suyfsAGWzxWAgCvdGfT
</commit_message>
<xml_diff>
--- a/docs/LeDoK-Bedienungsanleitung.docx
+++ b/docs/LeDoK-Bedienungsanleitung.docx
@@ -1878,19 +1878,19 @@
               <w:jc w:val="left"/>
             </w:pPr>
             <w:r>
-              <w:t xml:space="preserve">Reiter Heute, Erfassen, Übersicht, Kind, Sammelexport, Listen</w:t>
-            </w:r>
-          </w:p>
-        </w:tc>
-        <w:tc>
-          <w:tcPr/>
-          <w:p>
-            <w:pPr>
-              <w:pStyle w:val="Compact"/>
-              <w:jc w:val="left"/>
-            </w:pPr>
-            <w:r>
-              <w:t xml:space="preserve">die sechs Arbeitsbereiche (Kapitel 5). Auf kleineren Bildschirmen stehen sie in einer eigenen Zeile unter dem Logo.</w:t>
+              <w:t xml:space="preserve">Reiter Heute, Erfassen, Übersicht, Kind, Sammelexport, Listen, Klassenbuch</w:t>
+            </w:r>
+          </w:p>
+        </w:tc>
+        <w:tc>
+          <w:tcPr/>
+          <w:p>
+            <w:pPr>
+              <w:pStyle w:val="Compact"/>
+              <w:jc w:val="left"/>
+            </w:pPr>
+            <w:r>
+              <w:t xml:space="preserve">die sieben Arbeitsbereiche (Kapitel 5). Auf kleineren Bildschirmen stehen sie in einer eigenen Zeile unter dem Logo.</w:t>
             </w:r>
           </w:p>
         </w:tc>
@@ -3085,7 +3085,7 @@
         <w:t xml:space="preserve"> </w:t>
       </w:r>
       <w:r>
-        <w:t xml:space="preserve">Ein Kind kann in einzelnen Fächern an der nächsthöheren Jahrgangsstufe gemessen werden. Das stellst du in der Klassenliste ein (5.8). Es erscheint als Abzeichen „↑J3“.</w:t>
+        <w:t xml:space="preserve">Ein Kind kann in einzelnen Fächern an der nächsthöheren Jahrgangsstufe gemessen werden. Das stellst du in der Klassenliste ein (5.9). Es erscheint als Abzeichen „↑J3“.</w:t>
       </w:r>
     </w:p>
     <w:bookmarkEnd w:id="46"/>
@@ -3311,6 +3311,45 @@
       </w:pPr>
       <w:r>
         <w:rPr>
+          <w:bCs/>
+          <w:b/>
+        </w:rPr>
+        <w:t xml:space="preserve">Klassenbuch:</w:t>
+      </w:r>
+      <w:r>
+        <w:t xml:space="preserve"> die Stunden des Tages mit dem Stand des Klassenbuchs. Ein Klick öffnet den Eintrag, </w:t>
+      </w:r>
+      <w:r>
+        <w:rPr>
+          <w:bCs/>
+          <w:b/>
+        </w:rPr>
+        <w:t xml:space="preserve">＋ Stunde</w:t>
+      </w:r>
+      <w:r>
+        <w:t xml:space="preserve"> trägt eine weitere Stunde ein, </w:t>
+      </w:r>
+      <w:r>
+        <w:rPr>
+          <w:bCs/>
+          <w:b/>
+        </w:rPr>
+        <w:t xml:space="preserve">Klassenbuch öffnen</w:t>
+      </w:r>
+      <w:r>
+        <w:t xml:space="preserve"> führt zur Woche (Kapitel 5.8).</w:t>
+      </w:r>
+    </w:p>
+    <w:p>
+      <w:pPr>
+        <w:numPr>
+          <w:ilvl w:val="0"/>
+          <w:numId w:val="1010"/>
+        </w:numPr>
+        <w:pStyle w:val="Compact"/>
+      </w:pPr>
+      <w:r>
+        <w:rPr>
           <w:b/>
         </w:rPr>
         <w:t>Dienste:</w:t>
@@ -7064,7 +7103,648 @@
         <w:pStyle w:val="Heading3"/>
       </w:pPr>
       <w:r>
-        <w:t xml:space="preserve">5.8 Einstellungen</w:t>
+        <w:t xml:space="preserve">5.8 Klassenbuch</w:t>
+      </w:r>
+    </w:p>
+    <w:p>
+      <w:pPr>
+        <w:pStyle w:val="FirstParagraph"/>
+      </w:pPr>
+      <w:r>
+        <w:t xml:space="preserve">Im Reiter </w:t>
+      </w:r>
+      <w:r>
+        <w:rPr>
+          <w:bCs/>
+          <w:b/>
+        </w:rPr>
+        <w:t xml:space="preserve">Klassenbuch</w:t>
+      </w:r>
+      <w:r>
+        <w:t xml:space="preserve"> hältst du fest, was du in jeder Stunde unterrichtet hast, und verknüpfst es mit den Lernzielen aus dem LehrplanPLUS. Oben rechts wechselst du zwischen </w:t>
+      </w:r>
+      <w:r>
+        <w:rPr>
+          <w:bCs/>
+          <w:b/>
+        </w:rPr>
+        <w:t xml:space="preserve">Woche</w:t>
+      </w:r>
+      <w:r>
+        <w:t xml:space="preserve"> und </w:t>
+      </w:r>
+      <w:r>
+        <w:rPr>
+          <w:bCs/>
+          <w:b/>
+        </w:rPr>
+        <w:t xml:space="preserve">Lernziele</w:t>
+      </w:r>
+      <w:r>
+        <w:t xml:space="preserve">. Schülernamen stehen im Klassenbuch nicht; wer gefehlt hat, übernimmt LeDoK aus den Fehltagen.</w:t>
+      </w:r>
+    </w:p>
+    <w:p>
+      <w:pPr>
+        <w:pStyle w:val="BodyText"/>
+      </w:pPr>
+      <w:r>
+        <w:rPr>
+          <w:bCs/>
+          <w:b/>
+        </w:rPr>
+        <w:t xml:space="preserve">Woche.</w:t>
+      </w:r>
+      <w:r>
+        <w:t xml:space="preserve"> Du siehst Montag bis Freitag der gewählten Kalenderwoche, heute ist umrandet. Mit </w:t>
+      </w:r>
+      <w:r>
+        <w:rPr>
+          <w:bCs/>
+          <w:b/>
+        </w:rPr>
+        <w:t xml:space="preserve">←</w:t>
+      </w:r>
+      <w:r>
+        <w:t xml:space="preserve"> und </w:t>
+      </w:r>
+      <w:r>
+        <w:rPr>
+          <w:bCs/>
+          <w:b/>
+        </w:rPr>
+        <w:t xml:space="preserve">→</w:t>
+      </w:r>
+      <w:r>
+        <w:t xml:space="preserve"> blätterst du, </w:t>
+      </w:r>
+      <w:r>
+        <w:rPr>
+          <w:bCs/>
+          <w:b/>
+        </w:rPr>
+        <w:t xml:space="preserve">Diese Woche</w:t>
+      </w:r>
+      <w:r>
+        <w:t xml:space="preserve"> springt zurück. Die Stunden kommen aus deinem Stundenplan (Einstellungen → Stundenplan); ohne Stundenplan legst du sie mit </w:t>
+      </w:r>
+      <w:r>
+        <w:rPr>
+          <w:bCs/>
+          <w:b/>
+        </w:rPr>
+        <w:t xml:space="preserve">＋ Stunde</w:t>
+      </w:r>
+      <w:r>
+        <w:t xml:space="preserve"> an.</w:t>
+      </w:r>
+    </w:p>
+    <w:p>
+      <w:pPr>
+        <w:pStyle w:val="CaptionedFigure"/>
+      </w:pPr>
+      <w:r>
+        <w:drawing>
+          <wp:inline>
+            <wp:extent cx="5399999" cy="3374999"/>
+            <wp:effectExtent b="0" l="0" r="0" t="0"/>
+            <wp:docPr descr="Klassenbuch → Woche" title="" id="9002" name="Picture"/>
+            <a:graphic>
+              <a:graphicData uri="http://schemas.openxmlformats.org/drawingml/2006/picture">
+                <pic:pic>
+                  <pic:nvPicPr>
+                    <pic:cNvPr descr="jpg/53-klassenbuch-woche.jpg" id="9003" name="Picture"/>
+                    <pic:cNvPicPr>
+                      <a:picLocks noChangeArrowheads="1" noChangeAspect="1"/>
+                    </pic:cNvPicPr>
+                  </pic:nvPicPr>
+                  <pic:blipFill>
+                    <a:blip r:embed="rIdKb53"/>
+                    <a:stretch>
+                      <a:fillRect/>
+                    </a:stretch>
+                  </pic:blipFill>
+                  <pic:spPr bwMode="auto">
+                    <a:xfrm>
+                      <a:off x="0" y="0"/>
+                      <a:ext cx="5399999" cy="3374999"/>
+                    </a:xfrm>
+                    <a:prstGeom prst="rect">
+                      <a:avLst/>
+                    </a:prstGeom>
+                    <a:noFill/>
+                    <a:ln w="9525">
+                      <a:noFill/>
+                      <a:headEnd/>
+                      <a:tailEnd/>
+                    </a:ln>
+                  </pic:spPr>
+                </pic:pic>
+              </a:graphicData>
+            </a:graphic>
+          </wp:inline>
+        </w:drawing>
+      </w:r>
+    </w:p>
+    <w:p>
+      <w:pPr>
+        <w:pStyle w:val="ImageCaption"/>
+      </w:pPr>
+      <w:r>
+        <w:t xml:space="preserve">Klassenbuch → Woche</w:t>
+      </w:r>
+    </w:p>
+    <w:p>
+      <w:pPr>
+        <w:numPr>
+          <w:ilvl w:val="0"/>
+          <w:numId w:val="1017"/>
+        </w:numPr>
+        <w:pStyle w:val="Compact"/>
+      </w:pPr>
+      <w:r>
+        <w:t xml:space="preserve">Ein Klick auf eine Stunde öffnet den Eintrag: </w:t>
+      </w:r>
+      <w:r>
+        <w:rPr>
+          <w:bCs/>
+          <w:b/>
+        </w:rPr>
+        <w:t xml:space="preserve">Fach</w:t>
+      </w:r>
+      <w:r>
+        <w:t xml:space="preserve"> (aus dem Stundenplan vorausgefüllt), </w:t>
+      </w:r>
+      <w:r>
+        <w:rPr>
+          <w:bCs/>
+          <w:b/>
+        </w:rPr>
+        <w:t xml:space="preserve">Thema / Inhalt</w:t>
+      </w:r>
+      <w:r>
+        <w:t xml:space="preserve">, </w:t>
+      </w:r>
+      <w:r>
+        <w:rPr>
+          <w:bCs/>
+          <w:b/>
+        </w:rPr>
+        <w:t xml:space="preserve">Hausaufgabe</w:t>
+      </w:r>
+      <w:r>
+        <w:t xml:space="preserve"> und eine </w:t>
+      </w:r>
+      <w:r>
+        <w:rPr>
+          <w:bCs/>
+          <w:b/>
+        </w:rPr>
+        <w:t xml:space="preserve">Bemerkung</w:t>
+      </w:r>
+      <w:r>
+        <w:t xml:space="preserve">, z. B. „Vertretung“.</w:t>
+      </w:r>
+    </w:p>
+    <w:p>
+      <w:pPr>
+        <w:numPr>
+          <w:ilvl w:val="0"/>
+          <w:numId w:val="1017"/>
+        </w:numPr>
+        <w:pStyle w:val="Compact"/>
+      </w:pPr>
+      <w:r>
+        <w:rPr>
+          <w:bCs/>
+          <w:b/>
+        </w:rPr>
+        <w:t xml:space="preserve">＋ Bemerkung</w:t>
+      </w:r>
+      <w:r>
+        <w:t xml:space="preserve"> gilt für den ganzen Tag, z. B. „Wandertag“ oder „Unterrichtsausfall“. Sie steht über den Stunden des Tages.</w:t>
+      </w:r>
+    </w:p>
+    <w:p>
+      <w:pPr>
+        <w:numPr>
+          <w:ilvl w:val="0"/>
+          <w:numId w:val="1017"/>
+        </w:numPr>
+        <w:pStyle w:val="Compact"/>
+      </w:pPr>
+      <w:r>
+        <w:t xml:space="preserve">Kinder, die an einem Tag gefehlt haben, stehen neben dem Datum. Ein Klick ändert den Fehltag (Kapitel 5.7).</w:t>
+      </w:r>
+    </w:p>
+    <w:p>
+      <w:pPr>
+        <w:numPr>
+          <w:ilvl w:val="0"/>
+          <w:numId w:val="1017"/>
+        </w:numPr>
+        <w:pStyle w:val="Compact"/>
+      </w:pPr>
+      <w:r>
+        <w:rPr>
+          <w:bCs/>
+          <w:b/>
+        </w:rPr>
+        <w:t xml:space="preserve">Woche drucken</w:t>
+      </w:r>
+      <w:r>
+        <w:t xml:space="preserve"> ergibt die Klassenbuchseite mit allen Stunden, Lernzielen, Hausaufgaben, Bemerkungen und Fehlenden, dazu Zeilen für deine Unterschrift und die Kenntnisnahme der Schulleitung.</w:t>
+      </w:r>
+    </w:p>
+    <w:p>
+      <w:pPr>
+        <w:pStyle w:val="FirstParagraph"/>
+      </w:pPr>
+      <w:r>
+        <w:rPr>
+          <w:bCs/>
+          <w:b/>
+        </w:rPr>
+        <w:t xml:space="preserve">Lernziele verknüpfen.</w:t>
+      </w:r>
+      <w:r>
+        <w:t xml:space="preserve"> Unter dem Text des Eintrags stehen die Lernziele des Fachs als Baum: Lernbereich, Kompetenz, Kompetenzerwartung. Ein Klick wählt ein Lernziel, ein zweiter oder das ✕ am Kärtchen entfernt es. Je Stunde sind bis zu 12 Lernziele möglich.</w:t>
+      </w:r>
+    </w:p>
+    <w:p>
+      <w:pPr>
+        <w:pStyle w:val="CaptionedFigure"/>
+      </w:pPr>
+      <w:r>
+        <w:drawing>
+          <wp:inline>
+            <wp:extent cx="5399999" cy="3374999"/>
+            <wp:effectExtent b="0" l="0" r="0" t="0"/>
+            <wp:docPr descr="Eintrag einer Stunde mit zwei Lernzielen" title="" id="9004" name="Picture"/>
+            <a:graphic>
+              <a:graphicData uri="http://schemas.openxmlformats.org/drawingml/2006/picture">
+                <pic:pic>
+                  <pic:nvPicPr>
+                    <pic:cNvPr descr="jpg/54-klassenbuch-eintrag.jpg" id="9005" name="Picture"/>
+                    <pic:cNvPicPr>
+                      <a:picLocks noChangeArrowheads="1" noChangeAspect="1"/>
+                    </pic:cNvPicPr>
+                  </pic:nvPicPr>
+                  <pic:blipFill>
+                    <a:blip r:embed="rIdKb54"/>
+                    <a:stretch>
+                      <a:fillRect/>
+                    </a:stretch>
+                  </pic:blipFill>
+                  <pic:spPr bwMode="auto">
+                    <a:xfrm>
+                      <a:off x="0" y="0"/>
+                      <a:ext cx="5399999" cy="3374999"/>
+                    </a:xfrm>
+                    <a:prstGeom prst="rect">
+                      <a:avLst/>
+                    </a:prstGeom>
+                    <a:noFill/>
+                    <a:ln w="9525">
+                      <a:noFill/>
+                      <a:headEnd/>
+                      <a:tailEnd/>
+                    </a:ln>
+                  </pic:spPr>
+                </pic:pic>
+              </a:graphicData>
+            </a:graphic>
+          </wp:inline>
+        </w:drawing>
+      </w:r>
+    </w:p>
+    <w:p>
+      <w:pPr>
+        <w:pStyle w:val="ImageCaption"/>
+      </w:pPr>
+      <w:r>
+        <w:t xml:space="preserve">Eintrag einer Stunde mit zwei Lernzielen</w:t>
+      </w:r>
+    </w:p>
+    <w:p>
+      <w:pPr>
+        <w:numPr>
+          <w:ilvl w:val="0"/>
+          <w:numId w:val="1017"/>
+        </w:numPr>
+        <w:pStyle w:val="Compact"/>
+      </w:pPr>
+      <w:r>
+        <w:t xml:space="preserve">Im Suchfeld findest du ein Lernziel über ein Stichwort, z. B. „Zehner“ oder „Silben“. Gibt es im Fach keinen Treffer, sucht LeDoK in allen Fächern; mit </w:t>
+      </w:r>
+      <w:r>
+        <w:rPr>
+          <w:bCs/>
+          <w:b/>
+        </w:rPr>
+        <w:t xml:space="preserve">alle Fächer</w:t>
+      </w:r>
+      <w:r>
+        <w:t xml:space="preserve"> suchst du gleich überall, etwa für fächerübergreifenden Unterricht.</w:t>
+      </w:r>
+    </w:p>
+    <w:p>
+      <w:pPr>
+        <w:numPr>
+          <w:ilvl w:val="0"/>
+          <w:numId w:val="1017"/>
+        </w:numPr>
+        <w:pStyle w:val="Compact"/>
+      </w:pPr>
+      <w:r>
+        <w:rPr>
+          <w:bCs/>
+          <w:b/>
+        </w:rPr>
+        <w:t xml:space="preserve">wie letzte Stunde</w:t>
+      </w:r>
+      <w:r>
+        <w:t xml:space="preserve"> übernimmt die Lernziele der letzten Stunde im selben Fach. Das spart Zeit, wenn ein Thema über mehrere Stunden läuft.</w:t>
+      </w:r>
+    </w:p>
+    <w:p>
+      <w:pPr>
+        <w:numPr>
+          <w:ilvl w:val="0"/>
+          <w:numId w:val="1017"/>
+        </w:numPr>
+        <w:pStyle w:val="Compact"/>
+      </w:pPr>
+      <w:r>
+        <w:t xml:space="preserve">Ist </w:t>
+      </w:r>
+      <w:r>
+        <w:rPr>
+          <w:bCs/>
+          <w:b/>
+        </w:rPr>
+        <w:t xml:space="preserve">gewählte Lernziele als ★ aktuelles Unterrichtsthema markieren</w:t>
+      </w:r>
+      <w:r>
+        <w:t xml:space="preserve"> angehakt, werden sie beim Speichern ★-Themen. Sie erscheinen dann in der Beobachtung oben, auf Heute unter „★ Aktuelle Themen“ und im Stundenplan unter „Heute zum Beobachten“.</w:t>
+      </w:r>
+    </w:p>
+    <w:p>
+      <w:pPr>
+        <w:numPr>
+          <w:ilvl w:val="0"/>
+          <w:numId w:val="1017"/>
+        </w:numPr>
+        <w:pStyle w:val="Compact"/>
+      </w:pPr>
+      <w:r>
+        <w:t xml:space="preserve">Ein Eintrag, in dem alle Felder leer sind, wird beim Speichern entfernt. </w:t>
+      </w:r>
+      <w:r>
+        <w:rPr>
+          <w:bCs/>
+          <w:b/>
+        </w:rPr>
+        <w:t xml:space="preserve">Eintrag löschen</w:t>
+      </w:r>
+      <w:r>
+        <w:t xml:space="preserve"> fragt vorher nach.</w:t>
+      </w:r>
+    </w:p>
+    <w:p>
+      <w:pPr>
+        <w:pStyle w:val="FirstParagraph"/>
+      </w:pPr>
+      <w:r>
+        <w:rPr>
+          <w:bCs/>
+          <w:b/>
+        </w:rPr>
+        <w:t xml:space="preserve">Lernziele.</w:t>
+      </w:r>
+      <w:r>
+        <w:t xml:space="preserve"> Diese Übersicht zeigt je Fach, wie weit du im Lehrplan bist. Oben wählst du das Fach, den Zeitraum (1. Halbjahr, 2. Halbjahr oder Schuljahr) und ob alle, nur behandelte oder nur noch offene Lernziele erscheinen.</w:t>
+      </w:r>
+    </w:p>
+    <w:p>
+      <w:pPr>
+        <w:pStyle w:val="CaptionedFigure"/>
+      </w:pPr>
+      <w:r>
+        <w:drawing>
+          <wp:inline>
+            <wp:extent cx="5399999" cy="3374999"/>
+            <wp:effectExtent b="0" l="0" r="0" t="0"/>
+            <wp:docPr descr="Klassenbuch → Lernziele für Mathematik" title="" id="9006" name="Picture"/>
+            <a:graphic>
+              <a:graphicData uri="http://schemas.openxmlformats.org/drawingml/2006/picture">
+                <pic:pic>
+                  <pic:nvPicPr>
+                    <pic:cNvPr descr="jpg/55-klassenbuch-lernziele.jpg" id="9007" name="Picture"/>
+                    <pic:cNvPicPr>
+                      <a:picLocks noChangeArrowheads="1" noChangeAspect="1"/>
+                    </pic:cNvPicPr>
+                  </pic:nvPicPr>
+                  <pic:blipFill>
+                    <a:blip r:embed="rIdKb55"/>
+                    <a:stretch>
+                      <a:fillRect/>
+                    </a:stretch>
+                  </pic:blipFill>
+                  <pic:spPr bwMode="auto">
+                    <a:xfrm>
+                      <a:off x="0" y="0"/>
+                      <a:ext cx="5399999" cy="3374999"/>
+                    </a:xfrm>
+                    <a:prstGeom prst="rect">
+                      <a:avLst/>
+                    </a:prstGeom>
+                    <a:noFill/>
+                    <a:ln w="9525">
+                      <a:noFill/>
+                      <a:headEnd/>
+                      <a:tailEnd/>
+                    </a:ln>
+                  </pic:spPr>
+                </pic:pic>
+              </a:graphicData>
+            </a:graphic>
+          </wp:inline>
+        </w:drawing>
+      </w:r>
+    </w:p>
+    <w:p>
+      <w:pPr>
+        <w:pStyle w:val="ImageCaption"/>
+      </w:pPr>
+      <w:r>
+        <w:t xml:space="preserve">Klassenbuch → Lernziele für Mathematik</w:t>
+      </w:r>
+    </w:p>
+    <w:p>
+      <w:pPr>
+        <w:numPr>
+          <w:ilvl w:val="0"/>
+          <w:numId w:val="1017"/>
+        </w:numPr>
+        <w:pStyle w:val="Compact"/>
+      </w:pPr>
+      <w:r>
+        <w:t xml:space="preserve">Der Balken zeigt, wie viele Kompetenzerwartungen im Zeitraum mindestens einmal behandelt wurden. Eine Stunde zählt auch für die Kompetenz und den Lernbereich darüber.</w:t>
+      </w:r>
+    </w:p>
+    <w:p>
+      <w:pPr>
+        <w:numPr>
+          <w:ilvl w:val="0"/>
+          <w:numId w:val="1017"/>
+        </w:numPr>
+        <w:pStyle w:val="Compact"/>
+      </w:pPr>
+      <w:r>
+        <w:t xml:space="preserve">Je Zeile stehen die Zahl der Stunden, das Datum der letzten Stunde und bei wie vielen Kindern du dazu schon etwas bewertet hast. Orange heißt: im Unterricht behandelt, aber noch bei keinem Kind bewertet. Das Kästchen „noch nicht beobachtet“ oben zählt diese Lernziele.</w:t>
+      </w:r>
+    </w:p>
+    <w:p>
+      <w:pPr>
+        <w:numPr>
+          <w:ilvl w:val="0"/>
+          <w:numId w:val="1017"/>
+        </w:numPr>
+        <w:pStyle w:val="Compact"/>
+      </w:pPr>
+      <w:r>
+        <w:t xml:space="preserve">Ein Klick auf ein Lernziel zeigt den Text des Lehrplans und alle Stunden dazu. </w:t>
+      </w:r>
+      <w:r>
+        <w:rPr>
+          <w:bCs/>
+          <w:b/>
+        </w:rPr>
+        <w:t xml:space="preserve">In der Beobachtung öffnen</w:t>
+      </w:r>
+      <w:r>
+        <w:t xml:space="preserve"> springt direkt zum Bewerten, </w:t>
+      </w:r>
+      <w:r>
+        <w:rPr>
+          <w:bCs/>
+          <w:b/>
+        </w:rPr>
+        <w:t xml:space="preserve">★ als aktuelles Thema markieren</w:t>
+      </w:r>
+      <w:r>
+        <w:t xml:space="preserve"> setzt oder entfernt den Stern.</w:t>
+      </w:r>
+    </w:p>
+    <w:p>
+      <w:pPr>
+        <w:numPr>
+          <w:ilvl w:val="0"/>
+          <w:numId w:val="1017"/>
+        </w:numPr>
+        <w:pStyle w:val="Compact"/>
+      </w:pPr>
+      <w:r>
+        <w:rPr>
+          <w:bCs/>
+          <w:b/>
+        </w:rPr>
+        <w:t xml:space="preserve">Drucken</w:t>
+      </w:r>
+      <w:r>
+        <w:t xml:space="preserve"> ergibt eine Übersicht des Fachs mit allen Lernzielen und den Daten der Stunden, z. B. als Nachweis zum Halbjahr.</w:t>
+      </w:r>
+    </w:p>
+    <w:p>
+      <w:pPr>
+        <w:pStyle w:val="BodyText"/>
+      </w:pPr>
+      <w:r>
+        <w:t xml:space="preserve">Auf </w:t>
+      </w:r>
+      <w:r>
+        <w:rPr>
+          <w:bCs/>
+          <w:b/>
+        </w:rPr>
+        <w:t xml:space="preserve">Heute</w:t>
+      </w:r>
+      <w:r>
+        <w:t xml:space="preserve"> zeigt die Karte </w:t>
+      </w:r>
+      <w:r>
+        <w:rPr>
+          <w:bCs/>
+          <w:b/>
+        </w:rPr>
+        <w:t xml:space="preserve">Klassenbuch</w:t>
+      </w:r>
+      <w:r>
+        <w:t xml:space="preserve"> die Stunden des Tages und wie viele schon eingetragen sind. Ein Klick genügt, um nach der Stunde Thema und Lernziele einzutragen.</w:t>
+      </w:r>
+    </w:p>
+    <w:p>
+      <w:pPr>
+        <w:pStyle w:val="CaptionedFigure"/>
+      </w:pPr>
+      <w:r>
+        <w:drawing>
+          <wp:inline>
+            <wp:extent cx="1653749" cy="1227655"/>
+            <wp:effectExtent b="0" l="0" r="0" t="0"/>
+            <wp:docPr descr="Die Karte „Klassenbuch“ auf Heute" title="" id="9008" name="Picture"/>
+            <a:graphic>
+              <a:graphicData uri="http://schemas.openxmlformats.org/drawingml/2006/picture">
+                <pic:pic>
+                  <pic:nvPicPr>
+                    <pic:cNvPr descr="jpg/56-klassenbuch-heute.jpg" id="9009" name="Picture"/>
+                    <pic:cNvPicPr>
+                      <a:picLocks noChangeArrowheads="1" noChangeAspect="1"/>
+                    </pic:cNvPicPr>
+                  </pic:nvPicPr>
+                  <pic:blipFill>
+                    <a:blip r:embed="rIdKb56"/>
+                    <a:stretch>
+                      <a:fillRect/>
+                    </a:stretch>
+                  </pic:blipFill>
+                  <pic:spPr bwMode="auto">
+                    <a:xfrm>
+                      <a:off x="0" y="0"/>
+                      <a:ext cx="1653749" cy="1227655"/>
+                    </a:xfrm>
+                    <a:prstGeom prst="rect">
+                      <a:avLst/>
+                    </a:prstGeom>
+                    <a:noFill/>
+                    <a:ln w="9525">
+                      <a:noFill/>
+                      <a:headEnd/>
+                      <a:tailEnd/>
+                    </a:ln>
+                  </pic:spPr>
+                </pic:pic>
+              </a:graphicData>
+            </a:graphic>
+          </wp:inline>
+        </w:drawing>
+      </w:r>
+    </w:p>
+    <w:p>
+      <w:pPr>
+        <w:pStyle w:val="ImageCaption"/>
+      </w:pPr>
+      <w:r>
+        <w:t xml:space="preserve">Die Karte „Klassenbuch“ auf Heute</w:t>
+      </w:r>
+    </w:p>
+    <w:p>
+      <w:pPr>
+        <w:pStyle w:val="Heading3"/>
+      </w:pPr>
+      <w:r>
+        <w:t xml:space="preserve">5.9 Einstellungen</w:t>
       </w:r>
     </w:p>
     <w:p>
@@ -12040,7 +12720,7 @@
         <w:t xml:space="preserve"> </w:t>
       </w:r>
       <w:r>
-        <w:t xml:space="preserve">oben öffnet die eingebaute Kurzanleitung mit den Kapiteln „Ein Tag mit LeDoK“, Skala, Erfassen, Tastenkürzel, Auswerten, Berichte &amp; LEG, Listen, Kasse, Fehltage &amp; Stundenplan, Schuljahresbeginn, Rollen, Datenschutz und „Wenn etwas nicht klappt“. Mit</w:t>
+        <w:t xml:space="preserve">oben öffnet die eingebaute Kurzanleitung mit den Kapiteln „Ein Tag mit LeDoK“, Skala, Erfassen, Tastenkürzel, Auswerten, Berichte &amp; LEG, Listen, Kasse, Fehltage &amp; Stundenplan, Klassenbuch, Schuljahresbeginn, Rollen, Datenschutz und „Wenn etwas nicht klappt“. Mit</w:t>
       </w:r>
       <w:r>
         <w:t xml:space="preserve"> </w:t>

</xml_diff>

<commit_message>
Bedienungsanleitung, CHANGELOG und Technik-Doku: Auslosen
Co-Authored-By: Claude Opus 5.5 (1M context) <noreply@anthropic.com>
Claude-Session: https://claude.ai/code/session_01AScigLmDkRPwh2zu2cLVSa
</commit_message>
<xml_diff>
--- a/docs/LeDoK-Bedienungsanleitung.docx
+++ b/docs/LeDoK-Bedienungsanleitung.docx
@@ -3244,7 +3244,7 @@
         <w:t xml:space="preserve"> </w:t>
       </w:r>
       <w:r>
-        <w:t xml:space="preserve">Tippe ein Kind an, das heute fehlt; ein zweiter Klick ändert die Angaben (Kapitel 5.7, Fehltage).</w:t>
+        <w:t xml:space="preserve">Tippe ein Kind an, das heute fehlt; ein zweiter Klick ändert die Angaben (Kapitel 5.7, Fehltage). 🎲 Auslosen zieht ein Kind in der Großanzeige (Kapitel 5.7, Auslosen).</w:t>
       </w:r>
     </w:p>
     <w:p>
@@ -5589,6 +5589,16 @@
         <w:t xml:space="preserve">Fehltage</w:t>
       </w:r>
       <w:r>
+        <w:t xml:space="preserve">, </w:t>
+      </w:r>
+      <w:r>
+        <w:rPr>
+          <w:bCs/>
+          <w:b/>
+        </w:rPr>
+        <w:t xml:space="preserve">Dienste</w:t>
+      </w:r>
+      <w:r>
         <w:t xml:space="preserve"> und </w:t>
       </w:r>
       <w:r>
@@ -5596,7 +5606,7 @@
           <w:bCs/>
           <w:b/>
         </w:rPr>
-        <w:t xml:space="preserve">Dienste</w:t>
+        <w:t xml:space="preserve">Auslosen</w:t>
       </w:r>
       <w:r>
         <w:t xml:space="preserve">.</w:t>
@@ -7094,6 +7104,453 @@
       </w:r>
       <w:r>
         <w:t>, wer gerade dran ist. Fehlt ein Kind, ist es durchgestrichen, und LeDoK nennt als Vertretung das nächste Kind der Reihe, das diesmal keinen Dienst hat und da ist.</w:t>
+      </w:r>
+    </w:p>
+    <w:bookmarkEnd w:id="94"/>
+    <w:bookmarkStart w:id="110" w:name="einstellungen"/>
+    <w:p>
+      <w:pPr>
+        <w:pStyle w:val="FirstParagraph"/>
+      </w:pPr>
+      <w:r>
+        <w:rPr>
+          <w:bCs/>
+          <w:b/>
+        </w:rPr>
+        <w:t xml:space="preserve">Auslosen.</w:t>
+      </w:r>
+      <w:r>
+        <w:t xml:space="preserve"> Unter </w:t>
+      </w:r>
+      <w:r>
+        <w:rPr>
+          <w:bCs/>
+          <w:b/>
+        </w:rPr>
+        <w:t xml:space="preserve">Listen → Auslosen</w:t>
+      </w:r>
+      <w:r>
+        <w:t xml:space="preserve"> ziehst du schnell ein Kind oder mehrere, bildest Gruppen oder lost eine Reihenfolge aus, zum Beispiel fürs Vorlesen, für Ämter oder für die Reihenfolge beim Vortragen. Am schnellsten geht es über den Knopf </w:t>
+      </w:r>
+      <w:r>
+        <w:rPr>
+          <w:bCs/>
+          <w:b/>
+        </w:rPr>
+        <w:t xml:space="preserve">🎲 Auslosen</w:t>
+      </w:r>
+      <w:r>
+        <w:t xml:space="preserve"> auf </w:t>
+      </w:r>
+      <w:r>
+        <w:rPr>
+          <w:bCs/>
+          <w:b/>
+        </w:rPr>
+        <w:t xml:space="preserve">Heute</w:t>
+      </w:r>
+      <w:r>
+        <w:t xml:space="preserve"> in der Karte „Wer fehlt heute?“ oder über die Schnellsuche (Strg+K bzw. ⌘K, dann „auslosen“).</w:t>
+      </w:r>
+    </w:p>
+    <w:p>
+      <w:pPr>
+        <w:pStyle w:val="BodyText"/>
+      </w:pPr>
+      <w:r>
+        <w:rPr>
+          <w:bCs/>
+          <w:b/>
+        </w:rPr>
+        <w:t xml:space="preserve">Los ziehen:</w:t>
+      </w:r>
+      <w:r>
+        <w:t xml:space="preserve"> Wähle oben 1 bis 5 und klicke </w:t>
+      </w:r>
+      <w:r>
+        <w:rPr>
+          <w:bCs/>
+          <w:b/>
+        </w:rPr>
+        <w:t xml:space="preserve">🎲 Los ziehen</w:t>
+      </w:r>
+      <w:r>
+        <w:t xml:space="preserve">. Das Ergebnis steht groß im grünen Kasten. Darunter siehst du alle Lose im Topf: durchgestrichen ist, wer in dieser Runde schon gezogen wurde, rot umrandet, wer heute fehlt. War ein Kind gerade nicht greifbar, legt </w:t>
+      </w:r>
+      <w:r>
+        <w:rPr>
+          <w:bCs/>
+          <w:b/>
+        </w:rPr>
+        <w:t xml:space="preserve">Zurück in den Topf</w:t>
+      </w:r>
+      <w:r>
+        <w:t xml:space="preserve"> die letzte Ziehung zurück, als hätte es sie nicht gegeben.</w:t>
+      </w:r>
+    </w:p>
+    <w:p>
+      <w:pPr>
+        <w:pStyle w:val="CaptionedFigure"/>
+      </w:pPr>
+      <w:r>
+        <w:drawing>
+          <wp:inline>
+            <wp:extent cx="5399999" cy="3374999"/>
+            <wp:effectExtent b="0" l="0" r="0" t="0"/>
+            <wp:docPr descr="Listen → Auslosen: zwei Lose gezogen, durchgestrichen ist, wer in dieser Runde schon dran war" title="" id="9010" name="Picture"/>
+            <a:graphic>
+              <a:graphicData uri="http://schemas.openxmlformats.org/drawingml/2006/picture">
+                <pic:pic>
+                  <pic:nvPicPr>
+                    <pic:cNvPr descr="jpg/43-auslosen.jpg" id="9011" name="Picture"/>
+                    <pic:cNvPicPr>
+                      <a:picLocks noChangeArrowheads="1" noChangeAspect="1"/>
+                    </pic:cNvPicPr>
+                  </pic:nvPicPr>
+                  <pic:blipFill>
+                    <a:blip r:embed="rIdLos1"/>
+                    <a:stretch>
+                      <a:fillRect/>
+                    </a:stretch>
+                  </pic:blipFill>
+                  <pic:spPr bwMode="auto">
+                    <a:xfrm>
+                      <a:off x="0" y="0"/>
+                      <a:ext cx="5399999" cy="3374999"/>
+                    </a:xfrm>
+                    <a:prstGeom prst="rect">
+                      <a:avLst/>
+                    </a:prstGeom>
+                    <a:noFill/>
+                    <a:ln w="9525">
+                      <a:noFill/>
+                      <a:headEnd/>
+                      <a:tailEnd/>
+                    </a:ln>
+                  </pic:spPr>
+                </pic:pic>
+              </a:graphicData>
+            </a:graphic>
+          </wp:inline>
+        </w:drawing>
+      </w:r>
+    </w:p>
+    <w:p>
+      <w:pPr>
+        <w:pStyle w:val="ImageCaption"/>
+      </w:pPr>
+      <w:r>
+        <w:t xml:space="preserve">Listen → Auslosen: zwei Lose gezogen, durchgestrichen ist, wer in dieser Runde schon dran war</w:t>
+      </w:r>
+    </w:p>
+    <w:p>
+      <w:pPr>
+        <w:pStyle w:val="BodyText"/>
+      </w:pPr>
+      <w:r>
+        <w:rPr>
+          <w:bCs/>
+          <w:b/>
+        </w:rPr>
+        <w:t xml:space="preserve">Gerecht ziehen</w:t>
+      </w:r>
+      <w:r>
+        <w:t xml:space="preserve"> ist bei jeder neuen Los-Liste eingeschaltet: Jedes Los kommt einmal dran, erst dann beginnt eine neue Runde. Die Runde bleibt gespeichert, auch über mehrere Tage. Reichen die übrigen Lose für eine Ziehung nicht, beginnt die neue Runde mitten in der Ziehung, ohne dass jemand doppelt gezogen wird. </w:t>
+      </w:r>
+      <w:r>
+        <w:rPr>
+          <w:bCs/>
+          <w:b/>
+        </w:rPr>
+        <w:t xml:space="preserve">Neue Runde beginnen</w:t>
+      </w:r>
+      <w:r>
+        <w:t xml:space="preserve"> (unter „Lose bearbeiten“) legt alle Lose sofort zurück. Ohne „gerecht ziehen“ ist bei jeder Ziehung jedes Los wieder dabei.</w:t>
+      </w:r>
+    </w:p>
+    <w:p>
+      <w:pPr>
+        <w:pStyle w:val="BodyText"/>
+      </w:pPr>
+      <w:r>
+        <w:rPr>
+          <w:bCs/>
+          <w:b/>
+        </w:rPr>
+        <w:t xml:space="preserve">Gruppen bilden:</w:t>
+      </w:r>
+      <w:r>
+        <w:t xml:space="preserve"> Gib eine Zahl ein und wähle </w:t>
+      </w:r>
+      <w:r>
+        <w:rPr>
+          <w:bCs/>
+          <w:b/>
+        </w:rPr>
+        <w:t xml:space="preserve">Gruppen</w:t>
+      </w:r>
+      <w:r>
+        <w:t xml:space="preserve"> (so viele Gruppen) oder </w:t>
+      </w:r>
+      <w:r>
+        <w:rPr>
+          <w:bCs/>
+          <w:b/>
+        </w:rPr>
+        <w:t xml:space="preserve">je Gruppe</w:t>
+      </w:r>
+      <w:r>
+        <w:t xml:space="preserve"> (so viele Kinder je Gruppe). LeDoK verteilt alle Anwesenden zufällig und gleichmäßig; die Gruppen unterscheiden sich höchstens um ein Kind. </w:t>
+      </w:r>
+      <w:r>
+        <w:rPr>
+          <w:bCs/>
+          <w:b/>
+        </w:rPr>
+        <w:t xml:space="preserve">Reihenfolge auslosen</w:t>
+      </w:r>
+      <w:r>
+        <w:t xml:space="preserve"> mischt alle Lose zu einer nummerierten Liste. Gruppen und Reihenfolge druckst du mit </w:t>
+      </w:r>
+      <w:r>
+        <w:rPr>
+          <w:bCs/>
+          <w:b/>
+        </w:rPr>
+        <w:t xml:space="preserve">Drucken</w:t>
+      </w:r>
+      <w:r>
+        <w:t xml:space="preserve">. Unter </w:t>
+      </w:r>
+      <w:r>
+        <w:rPr>
+          <w:bCs/>
+          <w:b/>
+        </w:rPr>
+        <w:t xml:space="preserve">Zuletzt gezogen</w:t>
+      </w:r>
+      <w:r>
+        <w:t xml:space="preserve"> stehen die letzten 20 Ergebnisse mit Datum und Uhrzeit.</w:t>
+      </w:r>
+    </w:p>
+    <w:p>
+      <w:pPr>
+        <w:pStyle w:val="BodyText"/>
+      </w:pPr>
+      <w:r>
+        <w:rPr>
+          <w:bCs/>
+          <w:b/>
+        </w:rPr>
+        <w:t xml:space="preserve">Eigene Los-Listen:</w:t>
+      </w:r>
+      <w:r>
+        <w:t xml:space="preserve"> Mit </w:t>
+      </w:r>
+      <w:r>
+        <w:rPr>
+          <w:bCs/>
+          <w:b/>
+        </w:rPr>
+        <w:t xml:space="preserve">＋ Neue Los-Liste</w:t>
+      </w:r>
+      <w:r>
+        <w:t xml:space="preserve"> legst du weitere Listen an. Unter </w:t>
+      </w:r>
+      <w:r>
+        <w:rPr>
+          <w:bCs/>
+          <w:b/>
+        </w:rPr>
+        <w:t xml:space="preserve">Lose bearbeiten</w:t>
+      </w:r>
+      <w:r>
+        <w:t xml:space="preserve"> wählst du </w:t>
+      </w:r>
+      <w:r>
+        <w:rPr>
+          <w:bCs/>
+          <w:b/>
+        </w:rPr>
+        <w:t xml:space="preserve">ganze Klasse</w:t>
+      </w:r>
+      <w:r>
+        <w:t xml:space="preserve"> (neue Kinder kommen von selbst dazu) oder </w:t>
+      </w:r>
+      <w:r>
+        <w:rPr>
+          <w:bCs/>
+          <w:b/>
+        </w:rPr>
+        <w:t xml:space="preserve">nur ausgewählte Kinder</w:t>
+      </w:r>
+      <w:r>
+        <w:t xml:space="preserve"> (mit Schnellauswahl alle, keine oder nach Jahrgangsstufe). Dazu kannst du </w:t>
+      </w:r>
+      <w:r>
+        <w:rPr>
+          <w:bCs/>
+          <w:b/>
+        </w:rPr>
+        <w:t xml:space="preserve">eigene Lose</w:t>
+      </w:r>
+      <w:r>
+        <w:t xml:space="preserve"> schreiben, eins pro Zeile, etwa Stationen, Aufgaben oder Themen. Ein Häkchen legt fest, ob Kinder übersprungen werden, die heute unter „Wer fehlt heute?“ als ganztags fehlend eingetragen sind. Die Beispielklasse enthält die Liste „Lernstationen“ mit vier Stationen.</w:t>
+      </w:r>
+    </w:p>
+    <w:p>
+      <w:pPr>
+        <w:pStyle w:val="CaptionedFigure"/>
+      </w:pPr>
+      <w:r>
+        <w:drawing>
+          <wp:inline>
+            <wp:extent cx="5399999" cy="3374999"/>
+            <wp:effectExtent b="0" l="0" r="0" t="0"/>
+            <wp:docPr descr="Gruppen bilden und Lose bearbeiten" title="" id="9012" name="Picture"/>
+            <a:graphic>
+              <a:graphicData uri="http://schemas.openxmlformats.org/drawingml/2006/picture">
+                <pic:pic>
+                  <pic:nvPicPr>
+                    <pic:cNvPr descr="jpg/44-gruppen.jpg" id="9013" name="Picture"/>
+                    <pic:cNvPicPr>
+                      <a:picLocks noChangeArrowheads="1" noChangeAspect="1"/>
+                    </pic:cNvPicPr>
+                  </pic:nvPicPr>
+                  <pic:blipFill>
+                    <a:blip r:embed="rIdLos2"/>
+                    <a:stretch>
+                      <a:fillRect/>
+                    </a:stretch>
+                  </pic:blipFill>
+                  <pic:spPr bwMode="auto">
+                    <a:xfrm>
+                      <a:off x="0" y="0"/>
+                      <a:ext cx="5399999" cy="3374999"/>
+                    </a:xfrm>
+                    <a:prstGeom prst="rect">
+                      <a:avLst/>
+                    </a:prstGeom>
+                    <a:noFill/>
+                    <a:ln w="9525">
+                      <a:noFill/>
+                      <a:headEnd/>
+                      <a:tailEnd/>
+                    </a:ln>
+                  </pic:spPr>
+                </pic:pic>
+              </a:graphicData>
+            </a:graphic>
+          </wp:inline>
+        </w:drawing>
+      </w:r>
+    </w:p>
+    <w:p>
+      <w:pPr>
+        <w:pStyle w:val="ImageCaption"/>
+      </w:pPr>
+      <w:r>
+        <w:t xml:space="preserve">Gruppen bilden und Lose bearbeiten</w:t>
+      </w:r>
+    </w:p>
+    <w:p>
+      <w:pPr>
+        <w:pStyle w:val="BodyText"/>
+      </w:pPr>
+      <w:r>
+        <w:rPr>
+          <w:bCs/>
+          <w:b/>
+        </w:rPr>
+        <w:t xml:space="preserve">Großanzeige:</w:t>
+      </w:r>
+      <w:r>
+        <w:t xml:space="preserve"> </w:t>
+      </w:r>
+      <w:r>
+        <w:rPr>
+          <w:bCs/>
+          <w:b/>
+        </w:rPr>
+        <w:t xml:space="preserve">⛶ Großanzeige</w:t>
+      </w:r>
+      <w:r>
+        <w:t xml:space="preserve"> füllt das ganze Fenster, damit die Klasse am Beamer oder an der Tafel mitsehen kann. Die Leertaste, Enter oder ein Klick in die Mitte zieht; die Namen werden kurz gemischt, dann steht das Ergebnis groß da. Im Kürzel-Modus zeigt LeDoK die Kürzel; </w:t>
+      </w:r>
+      <w:r>
+        <w:rPr>
+          <w:bCs/>
+          <w:b/>
+        </w:rPr>
+        <w:t xml:space="preserve">Vornamen zeigen</w:t>
+      </w:r>
+      <w:r>
+        <w:t xml:space="preserve"> blendet Vorname und Anfangsbuchstaben des Nachnamens ein. Für echtes Vollbild drückst du zusätzlich F11 (Windows) bzw. ⌃⌘F oder nutzt Ansicht → Vollbild. Esc oder </w:t>
+      </w:r>
+      <w:r>
+        <w:rPr>
+          <w:bCs/>
+          <w:b/>
+        </w:rPr>
+        <w:t xml:space="preserve">Schließen</w:t>
+      </w:r>
+      <w:r>
+        <w:t xml:space="preserve"> beendet die Großanzeige.</w:t>
+      </w:r>
+    </w:p>
+    <w:p>
+      <w:pPr>
+        <w:pStyle w:val="CaptionedFigure"/>
+      </w:pPr>
+      <w:r>
+        <w:drawing>
+          <wp:inline>
+            <wp:extent cx="5399999" cy="3374999"/>
+            <wp:effectExtent b="0" l="0" r="0" t="0"/>
+            <wp:docPr descr="Großanzeige für Beamer oder Tafel" title="" id="9014" name="Picture"/>
+            <a:graphic>
+              <a:graphicData uri="http://schemas.openxmlformats.org/drawingml/2006/picture">
+                <pic:pic>
+                  <pic:nvPicPr>
+                    <pic:cNvPr descr="jpg/45-grossanzeige.jpg" id="9015" name="Picture"/>
+                    <pic:cNvPicPr>
+                      <a:picLocks noChangeArrowheads="1" noChangeAspect="1"/>
+                    </pic:cNvPicPr>
+                  </pic:nvPicPr>
+                  <pic:blipFill>
+                    <a:blip r:embed="rIdLos3"/>
+                    <a:stretch>
+                      <a:fillRect/>
+                    </a:stretch>
+                  </pic:blipFill>
+                  <pic:spPr bwMode="auto">
+                    <a:xfrm>
+                      <a:off x="0" y="0"/>
+                      <a:ext cx="5399999" cy="3374999"/>
+                    </a:xfrm>
+                    <a:prstGeom prst="rect">
+                      <a:avLst/>
+                    </a:prstGeom>
+                    <a:noFill/>
+                    <a:ln w="9525">
+                      <a:noFill/>
+                      <a:headEnd/>
+                      <a:tailEnd/>
+                    </a:ln>
+                  </pic:spPr>
+                </pic:pic>
+              </a:graphicData>
+            </a:graphic>
+          </wp:inline>
+        </w:drawing>
+      </w:r>
+    </w:p>
+    <w:p>
+      <w:pPr>
+        <w:pStyle w:val="ImageCaption"/>
+      </w:pPr>
+      <w:r>
+        <w:t xml:space="preserve">Großanzeige für Beamer oder Tafel</w:t>
       </w:r>
     </w:p>
     <w:bookmarkEnd w:id="94"/>

</xml_diff>

<commit_message>
Klassenrat: Briefkasten, Sitzungen mit Protokoll, Umfragen und Beschlüsse
Unter Listen → Klassenrat: Anliegen im Briefkasten sammeln, Sitzungen mit
Rollen reihum, Rückblick auf Beschlüsse, Abstimmungen per Handzeichen,
einzeln oder mit Stimmzetteln, Großansicht für die Tafel, Protokoll und
Aushang drucken. Karte auf „Heute“, Hilfe und Bedienungsanleitung ergänzt.

Co-Authored-By: Claude Opus 5.5 (1M context) <noreply@anthropic.com>
Claude-Session: https://claude.ai/code/session_01RV3QUtUixQ4Z13PAvFVvbG
</commit_message>
<xml_diff>
--- a/docs/LeDoK-Bedienungsanleitung.docx
+++ b/docs/LeDoK-Bedienungsanleitung.docx
@@ -3393,6 +3393,24 @@
       <w:pPr>
         <w:numPr>
           <w:ilvl w:val="0"/>
+          <w:numId w:val="1018"/>
+        </w:numPr>
+        <w:pStyle w:val="Compact"/>
+      </w:pPr>
+      <w:r>
+        <w:rPr>
+          <w:b/>
+        </w:rPr>
+        <w:t>Klassenrat:</w:t>
+      </w:r>
+      <w:r>
+        <w:t xml:space="preserve"> erscheint, wenn heute eine Sitzung läuft, Anliegen im Briefkasten liegen oder ein Beschluss fällig ist. Ein Klick öffnet Sitzung oder Briefkasten (Kapitel 5.7, Klassenrat).</w:t>
+      </w:r>
+    </w:p>
+    <w:p>
+      <w:pPr>
+        <w:numPr>
+          <w:ilvl w:val="0"/>
           <w:numId w:val="1010"/>
         </w:numPr>
         <w:pStyle w:val="Compact"/>
@@ -5599,17 +5617,29 @@
         <w:t xml:space="preserve">Dienste</w:t>
       </w:r>
       <w:r>
+        <w:t xml:space="preserve">, </w:t>
+      </w:r>
+      <w:r>
+        <w:rPr>
+          <w:bCs/>
+          <w:b/>
+        </w:rPr>
+        <w:t xml:space="preserve">Auslosen</w:t>
+      </w:r>
+      <w:r/>
+      <w:r>
+        <w:rPr/>
         <w:t xml:space="preserve"> und </w:t>
       </w:r>
       <w:r>
         <w:rPr>
-          <w:bCs/>
-          <w:b/>
-        </w:rPr>
-        <w:t xml:space="preserve">Auslosen</w:t>
-      </w:r>
-      <w:r>
-        <w:t xml:space="preserve">.</w:t>
+          <w:b/>
+        </w:rPr>
+        <w:t>Klassenrat</w:t>
+      </w:r>
+      <w:r>
+        <w:rPr/>
+        <w:t>.</w:t>
       </w:r>
     </w:p>
     <w:p>
@@ -7553,6 +7583,929 @@
         <w:t xml:space="preserve">Großanzeige für Beamer oder Tafel</w:t>
       </w:r>
     </w:p>
+    <w:p>
+      <w:pPr>
+        <w:pStyle w:val="FirstParagraph"/>
+      </w:pPr>
+      <w:r>
+        <w:rPr>
+          <w:b/>
+        </w:rPr>
+        <w:t>Klassenrat.</w:t>
+      </w:r>
+      <w:r>
+        <w:t xml:space="preserve"> Unter </w:t>
+      </w:r>
+      <w:r>
+        <w:rPr>
+          <w:b/>
+        </w:rPr>
+        <w:t>Listen → Klassenrat</w:t>
+      </w:r>
+      <w:r>
+        <w:t xml:space="preserve"> begleitet LeDoK euren Klassenrat vom Briefkasten bis zum unterschriebenen Protokoll. Oben wechselst du zwischen </w:t>
+      </w:r>
+      <w:r>
+        <w:rPr>
+          <w:b/>
+        </w:rPr>
+        <w:t>Sitzungen</w:t>
+      </w:r>
+      <w:r>
+        <w:t xml:space="preserve">, </w:t>
+      </w:r>
+      <w:r>
+        <w:rPr>
+          <w:b/>
+        </w:rPr>
+        <w:t>Briefkasten</w:t>
+      </w:r>
+      <w:r>
+        <w:t xml:space="preserve">, </w:t>
+      </w:r>
+      <w:r>
+        <w:rPr>
+          <w:b/>
+        </w:rPr>
+        <w:t>Umfragen</w:t>
+      </w:r>
+      <w:r>
+        <w:t xml:space="preserve"> und </w:t>
+      </w:r>
+      <w:r>
+        <w:rPr>
+          <w:b/>
+        </w:rPr>
+        <w:t>Beschlüsse</w:t>
+      </w:r>
+      <w:r>
+        <w:t>.</w:t>
+      </w:r>
+    </w:p>
+    <w:p>
+      <w:pPr>
+        <w:pStyle w:val="BodyText"/>
+      </w:pPr>
+      <w:r>
+        <w:rPr>
+          <w:b/>
+        </w:rPr>
+        <w:t>Briefkasten.</w:t>
+      </w:r>
+      <w:r>
+        <w:t xml:space="preserve"> Hier sammelst du die Anliegen bis zur nächsten Sitzung. Wähle die Art (</w:t>
+      </w:r>
+      <w:r>
+        <w:rPr>
+          <w:b/>
+        </w:rPr>
+        <w:t>👍 Ich lobe …</w:t>
+      </w:r>
+      <w:r>
+        <w:t xml:space="preserve">, </w:t>
+      </w:r>
+      <w:r>
+        <w:rPr>
+          <w:b/>
+        </w:rPr>
+        <w:t>😟 Mich stört …</w:t>
+      </w:r>
+      <w:r>
+        <w:t xml:space="preserve"> oder </w:t>
+      </w:r>
+      <w:r>
+        <w:rPr>
+          <w:b/>
+        </w:rPr>
+        <w:t>💡 Ich wünsche mir …</w:t>
+      </w:r>
+      <w:r>
+        <w:t xml:space="preserve">), tippe das Anliegen ein, wähle auf Wunsch das Kind dazu und drücke Enter oder </w:t>
+      </w:r>
+      <w:r>
+        <w:rPr>
+          <w:b/>
+        </w:rPr>
+        <w:t>In den Briefkasten</w:t>
+      </w:r>
+      <w:r>
+        <w:t xml:space="preserve">. </w:t>
+      </w:r>
+      <w:r>
+        <w:rPr>
+          <w:b/>
+        </w:rPr>
+        <w:t>Anliegen-Zettel drucken</w:t>
+      </w:r>
+      <w:r>
+        <w:t xml:space="preserve"> druckt acht Zettel je Seite zum Ausschneiden für einen echten Briefkasten im Klassenzimmer.</w:t>
+      </w:r>
+    </w:p>
+    <w:p>
+      <w:pPr>
+        <w:pStyle w:val="CaptionedFigure"/>
+      </w:pPr>
+      <w:r>
+        <w:drawing>
+          <wp:inline>
+            <wp:extent cx="5400000" cy="3628125"/>
+            <wp:docPr id="9016" name="Picture 9016"/>
+            <wp:cNvGraphicFramePr>
+              <a:graphicFrameLocks noChangeAspect="1"/>
+            </wp:cNvGraphicFramePr>
+            <a:graphic>
+              <a:graphicData uri="http://schemas.openxmlformats.org/drawingml/2006/picture">
+                <pic:pic>
+                  <pic:nvPicPr>
+                    <pic:cNvPr id="0" name="43-klassenrat-briefkasten.png"/>
+                    <pic:cNvPicPr/>
+                  </pic:nvPicPr>
+                  <pic:blipFill>
+                    <a:blip r:embed="rId15"/>
+                    <a:stretch>
+                      <a:fillRect/>
+                    </a:stretch>
+                  </pic:blipFill>
+                  <pic:spPr>
+                    <a:xfrm>
+                      <a:off x="0" y="0"/>
+                      <a:ext cx="5400000" cy="3628125"/>
+                    </a:xfrm>
+                    <a:prstGeom prst="rect"/>
+                  </pic:spPr>
+                </pic:pic>
+              </a:graphicData>
+            </a:graphic>
+          </wp:inline>
+        </w:drawing>
+      </w:r>
+    </w:p>
+    <w:p>
+      <w:pPr>
+        <w:pStyle w:val="ImageCaption"/>
+      </w:pPr>
+      <w:r>
+        <w:t>Listen → Klassenrat → Briefkasten</w:t>
+      </w:r>
+    </w:p>
+    <w:p>
+      <w:pPr>
+        <w:pStyle w:val="BodyText"/>
+      </w:pPr>
+      <w:r>
+        <w:rPr>
+          <w:b/>
+        </w:rPr>
+        <w:t>Sitzung.</w:t>
+      </w:r>
+      <w:r>
+        <w:t xml:space="preserve"> </w:t>
+      </w:r>
+      <w:r>
+        <w:rPr>
+          <w:b/>
+        </w:rPr>
+        <w:t>＋ Neue Sitzung</w:t>
+      </w:r>
+      <w:r>
+        <w:t xml:space="preserve"> legt die nächste Sitzung mit dem heutigen Datum an, übernimmt alle Anliegen aus dem Briefkasten als Tagesordnung und verteilt die Rollen </w:t>
+      </w:r>
+      <w:r>
+        <w:rPr>
+          <w:b/>
+        </w:rPr>
+        <w:t>Leitung</w:t>
+      </w:r>
+      <w:r>
+        <w:t xml:space="preserve">, </w:t>
+      </w:r>
+      <w:r>
+        <w:rPr>
+          <w:b/>
+        </w:rPr>
+        <w:t>Protokoll</w:t>
+      </w:r>
+      <w:r>
+        <w:t xml:space="preserve">, </w:t>
+      </w:r>
+      <w:r>
+        <w:rPr>
+          <w:b/>
+        </w:rPr>
+        <w:t>Zeitwache</w:t>
+      </w:r>
+      <w:r>
+        <w:t xml:space="preserve"> und </w:t>
+      </w:r>
+      <w:r>
+        <w:rPr>
+          <w:b/>
+        </w:rPr>
+        <w:t>Regelwache</w:t>
+      </w:r>
+      <w:r>
+        <w:t xml:space="preserve"> reihum an die nächsten Kinder, die heute da sind. Mit den Auswahlfeldern änderst du die Rollen, </w:t>
+      </w:r>
+      <w:r>
+        <w:rPr>
+          <w:b/>
+        </w:rPr>
+        <w:t>reihum weitergeben</w:t>
+      </w:r>
+      <w:r>
+        <w:t xml:space="preserve"> verteilt sie neu. Die Sitzung folgt dem üblichen Ablauf:</w:t>
+      </w:r>
+    </w:p>
+    <w:p>
+      <w:pPr>
+        <w:numPr>
+          <w:ilvl w:val="0"/>
+          <w:numId w:val="1018"/>
+        </w:numPr>
+        <w:pStyle w:val="Compact"/>
+      </w:pPr>
+      <w:r>
+        <w:rPr>
+          <w:b/>
+        </w:rPr>
+        <w:t>1 · Positive Runde:</w:t>
+      </w:r>
+      <w:r>
+        <w:t xml:space="preserve"> alle Lob-Anliegen zum Vorlesen.</w:t>
+      </w:r>
+    </w:p>
+    <w:p>
+      <w:pPr>
+        <w:numPr>
+          <w:ilvl w:val="0"/>
+          <w:numId w:val="1018"/>
+        </w:numPr>
+        <w:pStyle w:val="Compact"/>
+      </w:pPr>
+      <w:r>
+        <w:rPr>
+          <w:b/>
+        </w:rPr>
+        <w:t>2 · Rückblick:</w:t>
+      </w:r>
+      <w:r>
+        <w:t xml:space="preserve"> die Beschlüsse der letzten Sitzung und alle älteren, die noch offen sind. Für jeden klickst du </w:t>
+      </w:r>
+      <w:r>
+        <w:rPr>
+          <w:b/>
+        </w:rPr>
+        <w:t>offen</w:t>
+      </w:r>
+      <w:r>
+        <w:t xml:space="preserve">, </w:t>
+      </w:r>
+      <w:r>
+        <w:rPr>
+          <w:b/>
+        </w:rPr>
+        <w:t>umgesetzt</w:t>
+      </w:r>
+      <w:r>
+        <w:t xml:space="preserve"> oder </w:t>
+      </w:r>
+      <w:r>
+        <w:rPr>
+          <w:b/>
+        </w:rPr>
+        <w:t>verworfen</w:t>
+      </w:r>
+      <w:r>
+        <w:t>.</w:t>
+      </w:r>
+    </w:p>
+    <w:p>
+      <w:pPr>
+        <w:numPr>
+          <w:ilvl w:val="0"/>
+          <w:numId w:val="1018"/>
+        </w:numPr>
+        <w:pStyle w:val="Compact"/>
+      </w:pPr>
+      <w:r>
+        <w:rPr>
+          <w:b/>
+        </w:rPr>
+        <w:t>3 · Anliegen:</w:t>
+      </w:r>
+      <w:r>
+        <w:t xml:space="preserve"> je Anliegen ein Feld für Besprechung und Lösungsvorschläge, dazu </w:t>
+      </w:r>
+      <w:r>
+        <w:rPr>
+          <w:b/>
+        </w:rPr>
+        <w:t>Beschluss</w:t>
+      </w:r>
+      <w:r>
+        <w:t xml:space="preserve">, </w:t>
+      </w:r>
+      <w:r>
+        <w:rPr>
+          <w:b/>
+        </w:rPr>
+        <w:t>Wer kümmert sich?</w:t>
+      </w:r>
+      <w:r>
+        <w:t xml:space="preserve"> und </w:t>
+      </w:r>
+      <w:r>
+        <w:rPr>
+          <w:b/>
+        </w:rPr>
+        <w:t>bis</w:t>
+      </w:r>
+      <w:r>
+        <w:t xml:space="preserve">. </w:t>
+      </w:r>
+      <w:r>
+        <w:rPr>
+          <w:b/>
+        </w:rPr>
+        <w:t>vertagen</w:t>
+      </w:r>
+      <w:r>
+        <w:t xml:space="preserve"> legt ein Anliegen zurück in den Briefkasten. Unter </w:t>
+      </w:r>
+      <w:r>
+        <w:rPr>
+          <w:b/>
+        </w:rPr>
+        <w:t>Anliegen nachtragen</w:t>
+      </w:r>
+      <w:r>
+        <w:t xml:space="preserve"> ergänzt du, was erst in der Sitzung aufkommt.</w:t>
+      </w:r>
+    </w:p>
+    <w:p>
+      <w:pPr>
+        <w:numPr>
+          <w:ilvl w:val="0"/>
+          <w:numId w:val="1018"/>
+        </w:numPr>
+        <w:pStyle w:val="Compact"/>
+      </w:pPr>
+      <w:r>
+        <w:rPr>
+          <w:b/>
+        </w:rPr>
+        <w:t>4 · Abstimmungen:</w:t>
+      </w:r>
+      <w:r>
+        <w:t xml:space="preserve"> </w:t>
+      </w:r>
+      <w:r>
+        <w:rPr>
+          <w:b/>
+        </w:rPr>
+        <w:t>Abstimmen …</w:t>
+      </w:r>
+      <w:r>
+        <w:t xml:space="preserve"> bei einem Anliegen oder </w:t>
+      </w:r>
+      <w:r>
+        <w:rPr>
+          <w:b/>
+        </w:rPr>
+        <w:t>＋ Abstimmung</w:t>
+      </w:r>
+      <w:r>
+        <w:t xml:space="preserve"> startet eine Umfrage, die zur Sitzung gehört (siehe unten).</w:t>
+      </w:r>
+    </w:p>
+    <w:p>
+      <w:pPr>
+        <w:numPr>
+          <w:ilvl w:val="0"/>
+          <w:numId w:val="1018"/>
+        </w:numPr>
+        <w:pStyle w:val="Compact"/>
+      </w:pPr>
+      <w:r>
+        <w:rPr>
+          <w:b/>
+        </w:rPr>
+        <w:t>5 · Blitzlicht:</w:t>
+      </w:r>
+      <w:r>
+        <w:t xml:space="preserve"> Wie war der Klassenrat heute? Zähle mit ＋ und − die Kinder je Gesicht 😀 🙂 😐 🙁.</w:t>
+      </w:r>
+    </w:p>
+    <w:p>
+      <w:pPr>
+        <w:pStyle w:val="CaptionedFigure"/>
+      </w:pPr>
+      <w:r>
+        <w:drawing>
+          <wp:inline>
+            <wp:extent cx="5400000" cy="7273125"/>
+            <wp:docPr id="9017" name="Picture 9017"/>
+            <wp:cNvGraphicFramePr>
+              <a:graphicFrameLocks noChangeAspect="1"/>
+            </wp:cNvGraphicFramePr>
+            <a:graphic>
+              <a:graphicData uri="http://schemas.openxmlformats.org/drawingml/2006/picture">
+                <pic:pic>
+                  <pic:nvPicPr>
+                    <pic:cNvPr id="0" name="44-klassenrat-sitzung.png"/>
+                    <pic:cNvPicPr/>
+                  </pic:nvPicPr>
+                  <pic:blipFill>
+                    <a:blip r:embed="rId16"/>
+                    <a:stretch>
+                      <a:fillRect/>
+                    </a:stretch>
+                  </pic:blipFill>
+                  <pic:spPr>
+                    <a:xfrm>
+                      <a:off x="0" y="0"/>
+                      <a:ext cx="5400000" cy="7273125"/>
+                    </a:xfrm>
+                    <a:prstGeom prst="rect"/>
+                  </pic:spPr>
+                </pic:pic>
+              </a:graphicData>
+            </a:graphic>
+          </wp:inline>
+        </w:drawing>
+      </w:r>
+    </w:p>
+    <w:p>
+      <w:pPr>
+        <w:pStyle w:val="ImageCaption"/>
+      </w:pPr>
+      <w:r>
+        <w:t>Eine Sitzung mit Rollen, Rückblick und Anliegen</w:t>
+      </w:r>
+    </w:p>
+    <w:p>
+      <w:pPr>
+        <w:pStyle w:val="BodyText"/>
+      </w:pPr>
+      <w:r>
+        <w:rPr>
+          <w:b/>
+        </w:rPr>
+        <w:t>Sitzung abschließen …</w:t>
+      </w:r>
+      <w:r>
+        <w:t xml:space="preserve"> schließt die Sitzung. Anliegen ohne Besprechung und ohne Beschluss wandern dabei zurück in den Briefkasten. Eine abgeschlossene Sitzung kannst du lesen und drucken; </w:t>
+      </w:r>
+      <w:r>
+        <w:rPr>
+          <w:b/>
+        </w:rPr>
+        <w:t>Wieder öffnen</w:t>
+      </w:r>
+      <w:r>
+        <w:t xml:space="preserve"> macht sie wieder bearbeitbar. </w:t>
+      </w:r>
+      <w:r>
+        <w:rPr>
+          <w:b/>
+        </w:rPr>
+        <w:t>Protokoll drucken</w:t>
+      </w:r>
+      <w:r>
+        <w:t xml:space="preserve"> druckt das Protokoll mit Datum, Anwesenheit (aus den Fehltagen), Rollen, Lob, Rückblick, Anliegen mit Beschlüssen, Abstimmungsergebnissen und Blitzlicht sowie Unterschriftsfeldern für Leitung, Protokoll und Lehrkraft.</w:t>
+      </w:r>
+    </w:p>
+    <w:p>
+      <w:pPr>
+        <w:pStyle w:val="CaptionedFigure"/>
+      </w:pPr>
+      <w:r>
+        <w:drawing>
+          <wp:inline>
+            <wp:extent cx="5400000" cy="3628125"/>
+            <wp:docPr id="9018" name="Picture 9018"/>
+            <wp:cNvGraphicFramePr>
+              <a:graphicFrameLocks noChangeAspect="1"/>
+            </wp:cNvGraphicFramePr>
+            <a:graphic>
+              <a:graphicData uri="http://schemas.openxmlformats.org/drawingml/2006/picture">
+                <pic:pic>
+                  <pic:nvPicPr>
+                    <pic:cNvPr id="0" name="49-klassenrat-protokoll.png"/>
+                    <pic:cNvPicPr/>
+                  </pic:nvPicPr>
+                  <pic:blipFill>
+                    <a:blip r:embed="rId17"/>
+                    <a:stretch>
+                      <a:fillRect/>
+                    </a:stretch>
+                  </pic:blipFill>
+                  <pic:spPr>
+                    <a:xfrm>
+                      <a:off x="0" y="0"/>
+                      <a:ext cx="5400000" cy="3628125"/>
+                    </a:xfrm>
+                    <a:prstGeom prst="rect"/>
+                  </pic:spPr>
+                </pic:pic>
+              </a:graphicData>
+            </a:graphic>
+          </wp:inline>
+        </w:drawing>
+      </w:r>
+    </w:p>
+    <w:p>
+      <w:pPr>
+        <w:pStyle w:val="ImageCaption"/>
+      </w:pPr>
+      <w:r>
+        <w:t>Druckvorschau des Protokolls</w:t>
+      </w:r>
+    </w:p>
+    <w:p>
+      <w:pPr>
+        <w:pStyle w:val="BodyText"/>
+      </w:pPr>
+      <w:r>
+        <w:rPr>
+          <w:b/>
+        </w:rPr>
+        <w:t>Umfragen.</w:t>
+      </w:r>
+      <w:r>
+        <w:t xml:space="preserve"> Abgestimmt wird über eine Umfrage, im Klassenrat oder einfach so, etwa über das Ziel des Wandertags. </w:t>
+      </w:r>
+      <w:r>
+        <w:rPr>
+          <w:b/>
+        </w:rPr>
+        <w:t>＋ Neue Umfrage</w:t>
+      </w:r>
+      <w:r>
+        <w:t xml:space="preserve"> fragt nach der Frage und den Antworten: </w:t>
+      </w:r>
+      <w:r>
+        <w:rPr>
+          <w:b/>
+        </w:rPr>
+        <w:t>Ja oder nein</w:t>
+      </w:r>
+      <w:r>
+        <w:t xml:space="preserve">, </w:t>
+      </w:r>
+      <w:r>
+        <w:rPr>
+          <w:b/>
+        </w:rPr>
+        <w:t>Daumen</w:t>
+      </w:r>
+      <w:r>
+        <w:t xml:space="preserve">, </w:t>
+      </w:r>
+      <w:r>
+        <w:rPr>
+          <w:b/>
+        </w:rPr>
+        <w:t>Stimmungsbarometer</w:t>
+      </w:r>
+      <w:r>
+        <w:t xml:space="preserve"> oder </w:t>
+      </w:r>
+      <w:r>
+        <w:rPr>
+          <w:b/>
+        </w:rPr>
+        <w:t>Eigene Möglichkeiten</w:t>
+      </w:r>
+      <w:r>
+        <w:t xml:space="preserve"> (eine pro Zeile). Startest du die Umfrage mit </w:t>
+      </w:r>
+      <w:r>
+        <w:rPr>
+          <w:b/>
+        </w:rPr>
+        <w:t>Abstimmen …</w:t>
+      </w:r>
+      <w:r>
+        <w:t xml:space="preserve"> bei einem Anliegen, stehen Vorschläge, die du in der Besprechung mit „-“ am Zeilenanfang notiert hast, schon als Möglichkeiten da.</w:t>
+      </w:r>
+    </w:p>
+    <w:p>
+      <w:pPr>
+        <w:pStyle w:val="CaptionedFigure"/>
+      </w:pPr>
+      <w:r>
+        <w:drawing>
+          <wp:inline>
+            <wp:extent cx="5400000" cy="3628125"/>
+            <wp:docPr id="9019" name="Picture 9019"/>
+            <wp:cNvGraphicFramePr>
+              <a:graphicFrameLocks noChangeAspect="1"/>
+            </wp:cNvGraphicFramePr>
+            <a:graphic>
+              <a:graphicData uri="http://schemas.openxmlformats.org/drawingml/2006/picture">
+                <pic:pic>
+                  <pic:nvPicPr>
+                    <pic:cNvPr id="0" name="45-klassenrat-umfrage-neu.png"/>
+                    <pic:cNvPicPr/>
+                  </pic:nvPicPr>
+                  <pic:blipFill>
+                    <a:blip r:embed="rId18"/>
+                    <a:stretch>
+                      <a:fillRect/>
+                    </a:stretch>
+                  </pic:blipFill>
+                  <pic:spPr>
+                    <a:xfrm>
+                      <a:off x="0" y="0"/>
+                      <a:ext cx="5400000" cy="3628125"/>
+                    </a:xfrm>
+                    <a:prstGeom prst="rect"/>
+                  </pic:spPr>
+                </pic:pic>
+              </a:graphicData>
+            </a:graphic>
+          </wp:inline>
+        </w:drawing>
+      </w:r>
+    </w:p>
+    <w:p>
+      <w:pPr>
+        <w:pStyle w:val="ImageCaption"/>
+      </w:pPr>
+      <w:r>
+        <w:t>Neue Umfrage mit Vorschlägen aus der Besprechung</w:t>
+      </w:r>
+    </w:p>
+    <w:p>
+      <w:pPr>
+        <w:pStyle w:val="BodyText"/>
+      </w:pPr>
+      <w:r>
+        <w:t>Es gibt drei Arten abzustimmen:</w:t>
+      </w:r>
+    </w:p>
+    <w:p>
+      <w:pPr>
+        <w:numPr>
+          <w:ilvl w:val="0"/>
+          <w:numId w:val="1018"/>
+        </w:numPr>
+        <w:pStyle w:val="Compact"/>
+      </w:pPr>
+      <w:r>
+        <w:rPr>
+          <w:b/>
+        </w:rPr>
+        <w:t>Handzeichen zählen:</w:t>
+      </w:r>
+      <w:r>
+        <w:t xml:space="preserve"> Hände zählen und je Stimme auf ＋ tippen.</w:t>
+      </w:r>
+    </w:p>
+    <w:p>
+      <w:pPr>
+        <w:numPr>
+          <w:ilvl w:val="0"/>
+          <w:numId w:val="1018"/>
+        </w:numPr>
+        <w:pStyle w:val="Compact"/>
+      </w:pPr>
+      <w:r>
+        <w:rPr>
+          <w:b/>
+        </w:rPr>
+        <w:t>Jedes Kind einzeln:</w:t>
+      </w:r>
+      <w:r>
+        <w:t xml:space="preserve"> bei jedem Kind die Wahl antippen. So siehst du, wer noch nicht abgestimmt hat.</w:t>
+      </w:r>
+    </w:p>
+    <w:p>
+      <w:pPr>
+        <w:numPr>
+          <w:ilvl w:val="0"/>
+          <w:numId w:val="1018"/>
+        </w:numPr>
+        <w:pStyle w:val="Compact"/>
+      </w:pPr>
+      <w:r>
+        <w:rPr>
+          <w:b/>
+        </w:rPr>
+        <w:t>Geheim mit Stimmzetteln:</w:t>
+      </w:r>
+      <w:r>
+        <w:t xml:space="preserve"> </w:t>
+      </w:r>
+      <w:r>
+        <w:rPr>
+          <w:b/>
+        </w:rPr>
+        <w:t>Stimmzettel drucken</w:t>
+      </w:r>
+      <w:r>
+        <w:t xml:space="preserve"> druckt genug Zettel für alle Kinder, die heute da sind. Die Kinder kreuzen an, du zählst die Zettel mit ＋ aus.</w:t>
+      </w:r>
+    </w:p>
+    <w:p>
+      <w:pPr>
+        <w:pStyle w:val="CaptionedFigure"/>
+      </w:pPr>
+      <w:r>
+        <w:drawing>
+          <wp:inline>
+            <wp:extent cx="5400000" cy="3628125"/>
+            <wp:docPr id="9020" name="Picture 9020"/>
+            <wp:cNvGraphicFramePr>
+              <a:graphicFrameLocks noChangeAspect="1"/>
+            </wp:cNvGraphicFramePr>
+            <a:graphic>
+              <a:graphicData uri="http://schemas.openxmlformats.org/drawingml/2006/picture">
+                <pic:pic>
+                  <pic:nvPicPr>
+                    <pic:cNvPr id="0" name="46-klassenrat-umfrage.png"/>
+                    <pic:cNvPicPr/>
+                  </pic:nvPicPr>
+                  <pic:blipFill>
+                    <a:blip r:embed="rId19"/>
+                    <a:stretch>
+                      <a:fillRect/>
+                    </a:stretch>
+                  </pic:blipFill>
+                  <pic:spPr>
+                    <a:xfrm>
+                      <a:off x="0" y="0"/>
+                      <a:ext cx="5400000" cy="3628125"/>
+                    </a:xfrm>
+                    <a:prstGeom prst="rect"/>
+                  </pic:spPr>
+                </pic:pic>
+              </a:graphicData>
+            </a:graphic>
+          </wp:inline>
+        </w:drawing>
+      </w:r>
+    </w:p>
+    <w:p>
+      <w:pPr>
+        <w:pStyle w:val="ImageCaption"/>
+      </w:pPr>
+      <w:r>
+        <w:t>Umfrage mit Handzeichen und Ergebnis</w:t>
+      </w:r>
+    </w:p>
+    <w:p>
+      <w:pPr>
+        <w:pStyle w:val="BodyText"/>
+      </w:pPr>
+      <w:r>
+        <w:t xml:space="preserve">LeDoK zeigt die Stimmen als Balken und nennt, welche Möglichkeit die meisten Stimmen hat und ob das mehr als die Hälfte ist, oder einen Gleichstand. </w:t>
+      </w:r>
+      <w:r>
+        <w:rPr>
+          <w:b/>
+        </w:rPr>
+        <w:t>Groß zeigen</w:t>
+      </w:r>
+      <w:r>
+        <w:t xml:space="preserve"> öffnet eine Großansicht ohne Namen für Tafel oder Beamer; bei Handzeichen und Stimmzetteln zählst du dort direkt mit ＋ und −. Gehört die Umfrage zu einem Anliegen, trägt </w:t>
+      </w:r>
+      <w:r>
+        <w:rPr>
+          <w:b/>
+        </w:rPr>
+        <w:t>… als Beschluss übernehmen</w:t>
+      </w:r>
+      <w:r>
+        <w:t xml:space="preserve"> die Gewinner-Möglichkeit als Beschluss ein.</w:t>
+      </w:r>
+    </w:p>
+    <w:p>
+      <w:pPr>
+        <w:pStyle w:val="CaptionedFigure"/>
+      </w:pPr>
+      <w:r>
+        <w:drawing>
+          <wp:inline>
+            <wp:extent cx="5400000" cy="3628125"/>
+            <wp:docPr id="9021" name="Picture 9021"/>
+            <wp:cNvGraphicFramePr>
+              <a:graphicFrameLocks noChangeAspect="1"/>
+            </wp:cNvGraphicFramePr>
+            <a:graphic>
+              <a:graphicData uri="http://schemas.openxmlformats.org/drawingml/2006/picture">
+                <pic:pic>
+                  <pic:nvPicPr>
+                    <pic:cNvPr id="0" name="47-klassenrat-gross.png"/>
+                    <pic:cNvPicPr/>
+                  </pic:nvPicPr>
+                  <pic:blipFill>
+                    <a:blip r:embed="rId20"/>
+                    <a:stretch>
+                      <a:fillRect/>
+                    </a:stretch>
+                  </pic:blipFill>
+                  <pic:spPr>
+                    <a:xfrm>
+                      <a:off x="0" y="0"/>
+                      <a:ext cx="5400000" cy="3628125"/>
+                    </a:xfrm>
+                    <a:prstGeom prst="rect"/>
+                  </pic:spPr>
+                </pic:pic>
+              </a:graphicData>
+            </a:graphic>
+          </wp:inline>
+        </w:drawing>
+      </w:r>
+    </w:p>
+    <w:p>
+      <w:pPr>
+        <w:pStyle w:val="ImageCaption"/>
+      </w:pPr>
+      <w:r>
+        <w:t>Großansicht für Tafel oder Beamer</w:t>
+      </w:r>
+    </w:p>
+    <w:p>
+      <w:pPr>
+        <w:pStyle w:val="FirstParagraph"/>
+      </w:pPr>
+      <w:r>
+        <w:rPr>
+          <w:b/>
+        </w:rPr>
+        <w:t>Beschlüsse.</w:t>
+      </w:r>
+      <w:r>
+        <w:t xml:space="preserve"> Hier stehen alle Beschlüsse mit Sitzung, Anliegen, Zuständigen und Frist, wahlweise nur die offenen oder alle. Überschrittene Fristen sind markiert. </w:t>
+      </w:r>
+      <w:r>
+        <w:rPr>
+          <w:b/>
+        </w:rPr>
+        <w:t>Als Aushang drucken</w:t>
+      </w:r>
+      <w:r>
+        <w:t xml:space="preserve"> druckt die Beschlüsse in großer Schrift für die Wand im Klassenzimmer, verworfene nicht.</w:t>
+      </w:r>
+    </w:p>
+    <w:p>
+      <w:pPr>
+        <w:pStyle w:val="CaptionedFigure"/>
+      </w:pPr>
+      <w:r>
+        <w:drawing>
+          <wp:inline>
+            <wp:extent cx="5400000" cy="3628125"/>
+            <wp:docPr id="9022" name="Picture 9022"/>
+            <wp:cNvGraphicFramePr>
+              <a:graphicFrameLocks noChangeAspect="1"/>
+            </wp:cNvGraphicFramePr>
+            <a:graphic>
+              <a:graphicData uri="http://schemas.openxmlformats.org/drawingml/2006/picture">
+                <pic:pic>
+                  <pic:nvPicPr>
+                    <pic:cNvPr id="0" name="48-klassenrat-beschluesse.png"/>
+                    <pic:cNvPicPr/>
+                  </pic:nvPicPr>
+                  <pic:blipFill>
+                    <a:blip r:embed="rId21"/>
+                    <a:stretch>
+                      <a:fillRect/>
+                    </a:stretch>
+                  </pic:blipFill>
+                  <pic:spPr>
+                    <a:xfrm>
+                      <a:off x="0" y="0"/>
+                      <a:ext cx="5400000" cy="3628125"/>
+                    </a:xfrm>
+                    <a:prstGeom prst="rect"/>
+                  </pic:spPr>
+                </pic:pic>
+              </a:graphicData>
+            </a:graphic>
+          </wp:inline>
+        </w:drawing>
+      </w:r>
+    </w:p>
+    <w:p>
+      <w:pPr>
+        <w:pStyle w:val="ImageCaption"/>
+      </w:pPr>
+      <w:r>
+        <w:t>Listen → Klassenrat → Beschlüsse</w:t>
+      </w:r>
+    </w:p>
+    <w:p>
+      <w:pPr>
+        <w:pStyle w:val="BodyText"/>
+      </w:pPr>
+      <w:r>
+        <w:t>Löschst du ein Kind, bleiben seine Anliegen ohne Namen und seine Stimmen im Ergebnis erhalten. Wie alles in LeDoK werden Anliegen, Protokolle und Abstimmungen nur verschlüsselt gespeichert.</w:t>
+      </w:r>
+    </w:p>
     <w:bookmarkEnd w:id="94"/>
     <w:bookmarkStart w:id="110" w:name="einstellungen"/>
     <w:p>
@@ -13177,7 +14130,7 @@
         <w:t xml:space="preserve"> </w:t>
       </w:r>
       <w:r>
-        <w:t xml:space="preserve">oben öffnet die eingebaute Kurzanleitung mit den Kapiteln „Ein Tag mit LeDoK“, Skala, Erfassen, Tastenkürzel, Auswerten, Berichte &amp; LEG, Listen, Kasse, Fehltage &amp; Stundenplan, Klassenbuch, Schuljahresbeginn, Rollen, Datenschutz und „Wenn etwas nicht klappt“. Mit</w:t>
+        <w:t>oben öffnet die eingebaute Kurzanleitung mit den Kapiteln „Ein Tag mit LeDoK“, Skala, Erfassen, Tastenkürzel, Auswerten, Berichte &amp; LEG, Listen, Kasse, Fehltage, Klassenrat &amp; Stundenplan, Klassenbuch, Schuljahresbeginn, Rollen, Datenschutz und „Wenn etwas nicht klappt“. Mit</w:t>
       </w:r>
       <w:r>
         <w:t xml:space="preserve"> </w:t>

</xml_diff>

<commit_message>
Erfassen: Ergebnisse aus Lern-Apps mit Quelle „Lern-App“ eintragen
Neuer Modus Erfassen → Lern-App: App-Name und Übung oben, je Kind Prozent
(Umrechnung wie bei der Probe) oder Wert 1–9. Einträge mit q "a",
getrennt von Beobachtungen desselben Tages. Anleitung, CHANGELOG,
TECHNIK.md und Test ergänzt.

Co-Authored-By: Claude Opus 5.5 (1M context) <noreply@anthropic.com>
Claude-Session: https://claude.ai/code/session_01NprTnR4Cyf8qYegqQNZPqF
</commit_message>
<xml_diff>
--- a/docs/LeDoK-Bedienungsanleitung.docx
+++ b/docs/LeDoK-Bedienungsanleitung.docx
@@ -3401,7 +3401,7 @@
         <w:t xml:space="preserve">Erfassen</w:t>
       </w:r>
       <w:r>
-        <w:t xml:space="preserve"> bewertest du, im Unterricht oder danach. Oben wählst du einen von vier Modi und rechts das Datum.</w:t>
+        <w:t xml:space="preserve"> bewertest du, im Unterricht oder danach. Oben wählst du einen von fünf Modi und rechts das Datum.</w:t>
       </w:r>
     </w:p>
     <w:p>
@@ -3572,6 +3572,84 @@
       </w:r>
       <w:r>
         <w:t xml:space="preserve"> 1. Fach wählen, 2. Kompetenzen wählen, 3. Punkte oder Prozent je Kind eintragen. LeDoK rechnet linear um: 0 % = 1, 50 % = 5, 100 % = 9. Fehlende Kinder markierst du als „fehlt“.</w:t>
+      </w:r>
+    </w:p>
+    <w:p>
+      <w:pPr>
+        <w:pStyle w:val="BodyText"/>
+      </w:pPr>
+      <w:r>
+        <w:rPr>
+          <w:bCs/>
+          <w:b/>
+        </w:rPr>
+        <w:t xml:space="preserve">Lern-App.</w:t>
+      </w:r>
+      <w:r>
+        <w:t xml:space="preserve"> Hier überträgst du Ergebnisse aus einer Lern-App wie ANTON, die die Kinder in der Schule nutzen. Trage oben den Namen der App ein (LeDoK merkt ihn sich) und auf Wunsch die Übung. Dann gibst du je Kind entweder den Prozentwert ein, den die App zeigt, und drückst Enter, oder du klickst gleich einen Wert von 1 bis 9. LeDoK rechnet Prozent wie bei der Probe um und springt zum nächsten Kind. Hier stehen alle Themen des Fachs, auch solche, die sonst am Fokustag dran sind.</w:t>
+      </w:r>
+    </w:p>
+    <w:p>
+      <w:pPr>
+        <w:pStyle w:val="BodyText"/>
+      </w:pPr>
+      <w:r>
+        <w:t xml:space="preserve">Die Werte zählen wie Beobachtungen. In den Einträgen des Kindes, im Verlauf und im CSV-Export steht als Quelle „Lern-App“, in der Notiz App, Übung und Prozent. Eine Beobachtung am selben Tag zum selben Thema bleibt davon getrennt. LeDoK verbindet sich nicht mit der App: Es gelangt nur hinein, was du selbst einträgst. Ergebnisse aus einer App zeigen den Übungsstand und ersetzen nicht deine eigene Beobachtung.</w:t>
+      </w:r>
+    </w:p>
+    <w:p>
+      <w:pPr>
+        <w:pStyle w:val="CaptionedFigure"/>
+      </w:pPr>
+      <w:r>
+        <w:drawing>
+          <wp:inline>
+            <wp:extent cx="5399999" cy="3628124"/>
+            <wp:effectExtent b="0" l="0" r="0" t="0"/>
+            <wp:docPr descr="Erfassen im Modus „Lern-App“" title="" id="9201" name="Picture"/>
+            <a:graphic>
+              <a:graphicData uri="http://schemas.openxmlformats.org/drawingml/2006/picture">
+                <pic:pic>
+                  <pic:nvPicPr>
+                    <pic:cNvPr descr="lernapp.jpg" id="9202" name="Picture"/>
+                    <pic:cNvPicPr>
+                      <a:picLocks noChangeArrowheads="1" noChangeAspect="1"/>
+                    </pic:cNvPicPr>
+                  </pic:nvPicPr>
+                  <pic:blipFill>
+                    <a:blip r:embed="rIdLernApp"/>
+                    <a:stretch>
+                      <a:fillRect/>
+                    </a:stretch>
+                  </pic:blipFill>
+                  <pic:spPr bwMode="auto">
+                    <a:xfrm>
+                      <a:off x="0" y="0"/>
+                      <a:ext cx="5399999" cy="3628124"/>
+                    </a:xfrm>
+                    <a:prstGeom prst="rect">
+                      <a:avLst/>
+                    </a:prstGeom>
+                    <a:noFill/>
+                    <a:ln w="9525">
+                      <a:noFill/>
+                      <a:headEnd/>
+                      <a:tailEnd/>
+                    </a:ln>
+                  </pic:spPr>
+                </pic:pic>
+              </a:graphicData>
+            </a:graphic>
+          </wp:inline>
+        </w:drawing>
+      </w:r>
+    </w:p>
+    <w:p>
+      <w:pPr>
+        <w:pStyle w:val="ImageCaption"/>
+      </w:pPr>
+      <w:r>
+        <w:t xml:space="preserve">Erfassen im Modus „Lern-App“</w:t>
       </w:r>
     </w:p>
     <w:p>

</xml_diff>

<commit_message>
Heute: Karten in drei Bereichen, zuklappbar, Sicherung nur als Hinweis
Jetzt im Unterricht, Lernstand im Blick und Organisation; leere Karten
und Bereiche fallen weg, zugeklappte Bereiche in S.meta.heuteZu.
Schwierigkeiten zeigt zuerst 4 Kinder, Erklärungen aufklappbar.
Anleitung (5.2 mit neuem Bild), CHANGELOG, TECHNIK.md und Test ergänzt.

Co-Authored-By: Claude Opus 5.5 (1M context) <noreply@anthropic.com>
Claude-Session: https://claude.ai/code/session_01NprTnR4Cyf8qYegqQNZPqF
</commit_message>
<xml_diff>
--- a/docs/LeDoK-Bedienungsanleitung.docx
+++ b/docs/LeDoK-Bedienungsanleitung.docx
@@ -2794,14 +2794,7 @@
         <w:pStyle w:val="FirstParagraph"/>
       </w:pPr>
       <w:r>
-        <w:rPr>
-          <w:bCs/>
-          <w:b/>
-        </w:rPr>
-        <w:t xml:space="preserve">Heute</w:t>
-      </w:r>
-      <w:r>
-        <w:t xml:space="preserve"> ist deine Startseite. Sie zeigt auf einen Blick, was ansteht.</w:t>
+        <w:t xml:space="preserve">Heute ist deine Startseite. Oben stehen, wenn nötig, der Hinweis zur Sicherung und der Balken Dein Tag. Darunter ordnet LeDoK die Karten in drei Bereiche: Jetzt im Unterricht, Lernstand im Blick und Organisation. Mit einem Klick auf die Überschrift klappst du einen Bereich zu oder wieder auf; LeDoK merkt sich das. Karten ohne Inhalt, zum Beispiel Offene Listen ohne offene Liste, erscheinen nicht.</w:t>
       </w:r>
     </w:p>
     <w:p>
@@ -2811,7 +2804,7 @@
       <w:r>
         <w:drawing>
           <wp:inline>
-            <wp:extent cx="5399999" cy="3377454"/>
+            <wp:extent cx="5399999" cy="4893749"/>
             <wp:effectExtent b="0" l="0" r="0" t="0"/>
             <wp:docPr descr="Der Reiter „Heute“" title="" id="48" name="Picture"/>
             <a:graphic>
@@ -2832,7 +2825,7 @@
                   <pic:spPr bwMode="auto">
                     <a:xfrm>
                       <a:off x="0" y="0"/>
-                      <a:ext cx="5399999" cy="3377454"/>
+                      <a:ext cx="5399999" cy="4893749"/>
                     </a:xfrm>
                     <a:prstGeom prst="rect">
                       <a:avLst/>
@@ -2911,6 +2904,323 @@
           <w:bCs/>
           <w:b/>
         </w:rPr>
+        <w:t xml:space="preserve">Sicherung:</w:t>
+      </w:r>
+      <w:r>
+        <w:t xml:space="preserve"> Ist eine Sicherungskopie fällig (noch keine oder älter als eine Woche), steht ganz oben ein Hinweis mit dem Knopf Sicherungskopie herunterladen. Sonst zeigt nur die Kopfzeile unter „Kopie“, wann du zuletzt gesichert hast.</w:t>
+      </w:r>
+    </w:p>
+    <w:p>
+      <w:pPr>
+        <w:pStyle w:val="BodyText"/>
+      </w:pPr>
+      <w:r>
+        <w:rPr>
+          <w:bCs/>
+          <w:b/>
+        </w:rPr>
+        <w:t xml:space="preserve">Jetzt im Unterricht</w:t>
+      </w:r>
+      <w:r>
+        <w:t xml:space="preserve"/>
+      </w:r>
+    </w:p>
+    <w:p>
+      <w:pPr>
+        <w:numPr>
+          <w:ilvl w:val="0"/>
+          <w:numId w:val="1010"/>
+        </w:numPr>
+        <w:pStyle w:val="Compact"/>
+      </w:pPr>
+      <w:r>
+        <w:t xml:space="preserve">Als Klassenlehrkraft siehst du oben außerdem eine Karte </w:t>
+      </w:r>
+      <w:r>
+        <w:rPr>
+          <w:bCs/>
+          <w:b/>
+        </w:rPr>
+        <w:t xml:space="preserve">Fachlehrkräfte</w:t>
+      </w:r>
+      <w:r>
+        <w:t xml:space="preserve"> mit dem Stand der Rückmeldungen; als Fachlehrkraft eine Karte </w:t>
+      </w:r>
+      <w:r>
+        <w:rPr>
+          <w:bCs/>
+          <w:b/>
+        </w:rPr>
+        <w:t xml:space="preserve">Rückmeldungen</w:t>
+      </w:r>
+      <w:r>
+        <w:t xml:space="preserve">.</w:t>
+      </w:r>
+    </w:p>
+    <w:p>
+      <w:pPr>
+        <w:numPr>
+          <w:ilvl w:val="0"/>
+          <w:numId w:val="1010"/>
+        </w:numPr>
+        <w:pStyle w:val="Compact"/>
+      </w:pPr>
+      <w:r>
+        <w:rPr>
+          <w:bCs/>
+          <w:b/>
+        </w:rPr>
+        <w:t xml:space="preserve">Wer fehlt heute?</w:t>
+      </w:r>
+      <w:r>
+        <w:t xml:space="preserve"> Tippe ein Kind an, das heute fehlt; ein zweiter Klick ändert die Angaben (Kapitel 5.7, Fehltage). 🎲 Auslosen zieht ein Kind in der Großanzeige (Kapitel 5.7, Auslosen).</w:t>
+      </w:r>
+    </w:p>
+    <w:p>
+      <w:pPr>
+        <w:numPr>
+          <w:ilvl w:val="0"/>
+          <w:numId w:val="1010"/>
+        </w:numPr>
+        <w:pStyle w:val="Compact"/>
+      </w:pPr>
+      <w:r>
+        <w:rPr>
+          <w:bCs/>
+          <w:b/>
+        </w:rPr>
+        <w:t xml:space="preserve">Stundenplan:</w:t>
+      </w:r>
+      <w:r>
+        <w:t xml:space="preserve"> die Stunden des Tages, die laufende hervorgehoben. </w:t>
+      </w:r>
+      <w:r>
+        <w:rPr>
+          <w:bCs/>
+          <w:b/>
+        </w:rPr>
+        <w:t xml:space="preserve">beobachten</w:t>
+      </w:r>
+      <w:r>
+        <w:t xml:space="preserve"> öffnet das Fach direkt in der Beobachtung. Darunter schlägt LeDoK bis zu zwei ★-Themen dieser Fächer vor, die du in den letzten 14 Tagen wenig beobachtet hast. </w:t>
+      </w:r>
+      <w:r>
+        <w:rPr>
+          <w:bCs/>
+          <w:b/>
+        </w:rPr>
+        <w:t xml:space="preserve">ändern</w:t>
+      </w:r>
+      <w:r>
+        <w:t xml:space="preserve"> führt zu Einstellungen → Stundenplan. Die Karte erscheint, sobald ein Stundenplan eingetragen ist.</w:t>
+      </w:r>
+    </w:p>
+    <w:p>
+      <w:pPr>
+        <w:numPr>
+          <w:ilvl w:val="0"/>
+          <w:numId w:val="1010"/>
+        </w:numPr>
+        <w:pStyle w:val="Compact"/>
+      </w:pPr>
+      <w:r>
+        <w:rPr>
+          <w:bCs/>
+          <w:b/>
+        </w:rPr>
+        <w:t xml:space="preserve">Fokustag:</w:t>
+      </w:r>
+      <w:r>
+        <w:t xml:space="preserve"> Kinder des heutigen Wochentags und wie viele Fokus-Themen bei jedem schon bewertet sind. </w:t>
+      </w:r>
+      <w:r>
+        <w:rPr>
+          <w:bCs/>
+          <w:b/>
+        </w:rPr>
+        <w:t xml:space="preserve">Fokustag starten</w:t>
+      </w:r>
+      <w:r>
+        <w:t xml:space="preserve"> springt direkt ins Erfassen.</w:t>
+      </w:r>
+    </w:p>
+    <w:p>
+      <w:pPr>
+        <w:numPr>
+          <w:ilvl w:val="0"/>
+          <w:numId w:val="1010"/>
+        </w:numPr>
+        <w:pStyle w:val="Compact"/>
+      </w:pPr>
+      <w:r>
+        <w:rPr>
+          <w:bCs/>
+          <w:b/>
+        </w:rPr>
+        <w:t xml:space="preserve">Klassenbuch:</w:t>
+      </w:r>
+      <w:r>
+        <w:t xml:space="preserve"> die Stunden des Tages mit dem Stand des Klassenbuchs. Ein Klick öffnet den Eintrag, </w:t>
+      </w:r>
+      <w:r>
+        <w:rPr>
+          <w:bCs/>
+          <w:b/>
+        </w:rPr>
+        <w:t xml:space="preserve">＋ Stunde</w:t>
+      </w:r>
+      <w:r>
+        <w:t xml:space="preserve"> trägt eine weitere Stunde ein, </w:t>
+      </w:r>
+      <w:r>
+        <w:rPr>
+          <w:bCs/>
+          <w:b/>
+        </w:rPr>
+        <w:t xml:space="preserve">Klassenbuch öffnen</w:t>
+      </w:r>
+      <w:r>
+        <w:t xml:space="preserve"> führt zur Woche (Kapitel 5.8).</w:t>
+      </w:r>
+    </w:p>
+    <w:p>
+      <w:pPr>
+        <w:numPr>
+          <w:ilvl w:val="0"/>
+          <w:numId w:val="1010"/>
+        </w:numPr>
+        <w:pStyle w:val="Compact"/>
+      </w:pPr>
+      <w:r>
+        <w:rPr>
+          <w:bCs/>
+          <w:b/>
+        </w:rPr>
+        <w:t xml:space="preserve">Fokuswoche:</w:t>
+      </w:r>
+      <w:r>
+        <w:t xml:space="preserve"> welche Wochentagsgruppe diese Woche im Arbeits- und Sozialverhalten dran ist.</w:t>
+      </w:r>
+    </w:p>
+    <w:p>
+      <w:pPr>
+        <w:pStyle w:val="BodyText"/>
+      </w:pPr>
+      <w:r>
+        <w:rPr>
+          <w:bCs/>
+          <w:b/>
+        </w:rPr>
+        <w:t xml:space="preserve">Lernstand im Blick</w:t>
+      </w:r>
+      <w:r>
+        <w:t xml:space="preserve"/>
+      </w:r>
+    </w:p>
+    <w:p>
+      <w:pPr>
+        <w:numPr>
+          <w:ilvl w:val="0"/>
+          <w:numId w:val="1010"/>
+        </w:numPr>
+        <w:pStyle w:val="Compact"/>
+      </w:pPr>
+      <w:r>
+        <w:rPr>
+          <w:bCs/>
+          <w:b/>
+        </w:rPr>
+        <w:t xml:space="preserve">Größte Schwierigkeiten:</w:t>
+      </w:r>
+      <w:r>
+        <w:t xml:space="preserve"> Kinder, die bei aktuellen Themen mehr als 1 Punkt unter der Erwartung liegen. Zuerst stehen die vier Kinder mit dem größten Abstand, mehr anzeigen zeigt bis zu acht. Wie wird das berechnet? klappt die Erklärung auf, ebenso bei Fallender Trend.</w:t>
+      </w:r>
+    </w:p>
+    <w:p>
+      <w:pPr>
+        <w:numPr>
+          <w:ilvl w:val="0"/>
+          <w:numId w:val="1010"/>
+        </w:numPr>
+        <w:pStyle w:val="Compact"/>
+      </w:pPr>
+      <w:r>
+        <w:rPr>
+          <w:bCs/>
+          <w:b/>
+        </w:rPr>
+        <w:t xml:space="preserve">Fallender Trend:</w:t>
+      </w:r>
+      <w:r>
+        <w:t xml:space="preserve"> Kinder, deren Stand in einem Fach im Schuljahr deutlich gesunken ist.</w:t>
+      </w:r>
+    </w:p>
+    <w:p>
+      <w:pPr>
+        <w:numPr>
+          <w:ilvl w:val="0"/>
+          <w:numId w:val="1010"/>
+        </w:numPr>
+        <w:pStyle w:val="Compact"/>
+      </w:pPr>
+      <w:r>
+        <w:rPr>
+          <w:bCs/>
+          <w:b/>
+        </w:rPr>
+        <w:t xml:space="preserve">Wenig beobachtet:</w:t>
+      </w:r>
+      <w:r>
+        <w:t xml:space="preserve"> Kinder mit wenigen Einträgen in den letzten 4 Wochen.</w:t>
+      </w:r>
+    </w:p>
+    <w:p>
+      <w:pPr>
+        <w:numPr>
+          <w:ilvl w:val="0"/>
+          <w:numId w:val="1010"/>
+        </w:numPr>
+        <w:pStyle w:val="Compact"/>
+      </w:pPr>
+      <w:r>
+        <w:rPr>
+          <w:bCs/>
+          <w:b/>
+        </w:rPr>
+        <w:t xml:space="preserve">Aktuelle Themen (★):</w:t>
+      </w:r>
+      <w:r>
+        <w:t xml:space="preserve"> was gerade im Unterricht dran ist und wie viele Kinder du dazu in den letzten 14 Tagen bewertet hast.</w:t>
+      </w:r>
+    </w:p>
+    <w:p>
+      <w:pPr>
+        <w:pStyle w:val="BodyText"/>
+      </w:pPr>
+      <w:r>
+        <w:rPr>
+          <w:bCs/>
+          <w:b/>
+        </w:rPr>
+        <w:t xml:space="preserve">Organisation</w:t>
+      </w:r>
+      <w:r>
+        <w:t xml:space="preserve"/>
+      </w:r>
+    </w:p>
+    <w:p>
+      <w:pPr>
+        <w:numPr>
+          <w:ilvl w:val="0"/>
+          <w:numId w:val="1010"/>
+        </w:numPr>
+        <w:pStyle w:val="Compact"/>
+      </w:pPr>
+      <w:r>
+        <w:rPr>
+          <w:bCs/>
+          <w:b/>
+        </w:rPr>
         <w:t xml:space="preserve">Ferien:</w:t>
       </w:r>
       <w:r>
@@ -2937,13 +3247,21 @@
       </w:pPr>
       <w:r>
         <w:rPr>
-          <w:bCs/>
-          <w:b/>
-        </w:rPr>
-        <w:t xml:space="preserve">Wer fehlt heute?</w:t>
-      </w:r>
-      <w:r>
-        <w:t xml:space="preserve"> Tippe ein Kind an, das heute fehlt; ein zweiter Klick ändert die Angaben (Kapitel 5.7, Fehltage). 🎲 Auslosen zieht ein Kind in der Großanzeige (Kapitel 5.7, Auslosen).</w:t>
+          <w:b/>
+        </w:rPr>
+        <w:t>Dienste:</w:t>
+      </w:r>
+      <w:r>
+        <w:t xml:space="preserve"> wer in dieser Runde Tafeldienst, Austeildienst usw. hat. Fehlt ein Kind, steht daneben eine Vertretung. </w:t>
+      </w:r>
+      <w:r>
+        <w:rPr>
+          <w:b/>
+        </w:rPr>
+        <w:t>Plan</w:t>
+      </w:r>
+      <w:r>
+        <w:t xml:space="preserve"> öffnet Listen → Dienste (Kapitel 5.7).</w:t>
       </w:r>
     </w:p>
     <w:p>
@@ -2959,111 +3277,6 @@
           <w:bCs/>
           <w:b/>
         </w:rPr>
-        <w:t xml:space="preserve">Stundenplan:</w:t>
-      </w:r>
-      <w:r>
-        <w:t xml:space="preserve"> die Stunden des Tages, die laufende hervorgehoben. </w:t>
-      </w:r>
-      <w:r>
-        <w:rPr>
-          <w:bCs/>
-          <w:b/>
-        </w:rPr>
-        <w:t xml:space="preserve">beobachten</w:t>
-      </w:r>
-      <w:r>
-        <w:t xml:space="preserve"> öffnet das Fach direkt in der Beobachtung. Darunter schlägt LeDoK bis zu zwei ★-Themen dieser Fächer vor, die du in den letzten 14 Tagen wenig beobachtet hast. </w:t>
-      </w:r>
-      <w:r>
-        <w:rPr>
-          <w:bCs/>
-          <w:b/>
-        </w:rPr>
-        <w:t xml:space="preserve">ändern</w:t>
-      </w:r>
-      <w:r>
-        <w:t xml:space="preserve"> führt zu Einstellungen → Stundenplan. Die Karte erscheint, sobald ein Stundenplan eingetragen ist.</w:t>
-      </w:r>
-    </w:p>
-    <w:p>
-      <w:pPr>
-        <w:numPr>
-          <w:ilvl w:val="0"/>
-          <w:numId w:val="1010"/>
-        </w:numPr>
-        <w:pStyle w:val="Compact"/>
-      </w:pPr>
-      <w:r>
-        <w:rPr>
-          <w:bCs/>
-          <w:b/>
-        </w:rPr>
-        <w:t xml:space="preserve">Klassenbuch:</w:t>
-      </w:r>
-      <w:r>
-        <w:t xml:space="preserve"> die Stunden des Tages mit dem Stand des Klassenbuchs. Ein Klick öffnet den Eintrag, </w:t>
-      </w:r>
-      <w:r>
-        <w:rPr>
-          <w:bCs/>
-          <w:b/>
-        </w:rPr>
-        <w:t xml:space="preserve">＋ Stunde</w:t>
-      </w:r>
-      <w:r>
-        <w:t xml:space="preserve"> trägt eine weitere Stunde ein, </w:t>
-      </w:r>
-      <w:r>
-        <w:rPr>
-          <w:bCs/>
-          <w:b/>
-        </w:rPr>
-        <w:t xml:space="preserve">Klassenbuch öffnen</w:t>
-      </w:r>
-      <w:r>
-        <w:t xml:space="preserve"> führt zur Woche (Kapitel 5.8).</w:t>
-      </w:r>
-    </w:p>
-    <w:p>
-      <w:pPr>
-        <w:numPr>
-          <w:ilvl w:val="0"/>
-          <w:numId w:val="1010"/>
-        </w:numPr>
-        <w:pStyle w:val="Compact"/>
-      </w:pPr>
-      <w:r>
-        <w:rPr>
-          <w:b/>
-        </w:rPr>
-        <w:t>Dienste:</w:t>
-      </w:r>
-      <w:r>
-        <w:t xml:space="preserve"> wer in dieser Runde Tafeldienst, Austeildienst usw. hat. Fehlt ein Kind, steht daneben eine Vertretung. </w:t>
-      </w:r>
-      <w:r>
-        <w:rPr>
-          <w:b/>
-        </w:rPr>
-        <w:t>Plan</w:t>
-      </w:r>
-      <w:r>
-        <w:t xml:space="preserve"> öffnet Listen → Dienste (Kapitel 5.7).</w:t>
-      </w:r>
-    </w:p>
-    <w:p>
-      <w:pPr>
-        <w:numPr>
-          <w:ilvl w:val="0"/>
-          <w:numId w:val="1010"/>
-        </w:numPr>
-        <w:pStyle w:val="Compact"/>
-      </w:pPr>
-      <w:r>
-        <w:rPr>
-          <w:bCs/>
-          <w:b/>
-        </w:rPr>
         <w:t xml:space="preserve">Offene Listen:</w:t>
       </w:r>
       <w:r>
@@ -3086,181 +3299,6 @@
       </w:r>
       <w:r>
         <w:t xml:space="preserve"> erscheint, wenn heute eine Sitzung läuft, Anliegen im Briefkasten liegen oder ein Beschluss fällig ist. Ein Klick öffnet Sitzung oder Briefkasten (Kapitel 5.7, Klassenrat).</w:t>
-      </w:r>
-    </w:p>
-    <w:p>
-      <w:pPr>
-        <w:numPr>
-          <w:ilvl w:val="0"/>
-          <w:numId w:val="1010"/>
-        </w:numPr>
-        <w:pStyle w:val="Compact"/>
-      </w:pPr>
-      <w:r>
-        <w:rPr>
-          <w:bCs/>
-          <w:b/>
-        </w:rPr>
-        <w:t xml:space="preserve">Fokustag:</w:t>
-      </w:r>
-      <w:r>
-        <w:t xml:space="preserve"> Kinder des heutigen Wochentags und wie viele Fokus-Themen bei jedem schon bewertet sind. </w:t>
-      </w:r>
-      <w:r>
-        <w:rPr>
-          <w:bCs/>
-          <w:b/>
-        </w:rPr>
-        <w:t xml:space="preserve">Fokustag starten</w:t>
-      </w:r>
-      <w:r>
-        <w:t xml:space="preserve"> springt direkt ins Erfassen.</w:t>
-      </w:r>
-    </w:p>
-    <w:p>
-      <w:pPr>
-        <w:numPr>
-          <w:ilvl w:val="0"/>
-          <w:numId w:val="1010"/>
-        </w:numPr>
-        <w:pStyle w:val="Compact"/>
-      </w:pPr>
-      <w:r>
-        <w:rPr>
-          <w:bCs/>
-          <w:b/>
-        </w:rPr>
-        <w:t xml:space="preserve">Fokuswoche:</w:t>
-      </w:r>
-      <w:r>
-        <w:t xml:space="preserve"> welche Wochentagsgruppe diese Woche im Arbeits- und Sozialverhalten dran ist.</w:t>
-      </w:r>
-    </w:p>
-    <w:p>
-      <w:pPr>
-        <w:numPr>
-          <w:ilvl w:val="0"/>
-          <w:numId w:val="1010"/>
-        </w:numPr>
-        <w:pStyle w:val="Compact"/>
-      </w:pPr>
-      <w:r>
-        <w:rPr>
-          <w:bCs/>
-          <w:b/>
-        </w:rPr>
-        <w:t xml:space="preserve">Fallender Trend:</w:t>
-      </w:r>
-      <w:r>
-        <w:t xml:space="preserve"> Kinder, deren Stand in einem Fach im Schuljahr deutlich gesunken ist.</w:t>
-      </w:r>
-    </w:p>
-    <w:p>
-      <w:pPr>
-        <w:numPr>
-          <w:ilvl w:val="0"/>
-          <w:numId w:val="1010"/>
-        </w:numPr>
-        <w:pStyle w:val="Compact"/>
-      </w:pPr>
-      <w:r>
-        <w:rPr>
-          <w:bCs/>
-          <w:b/>
-        </w:rPr>
-        <w:t xml:space="preserve">Größte Schwierigkeiten:</w:t>
-      </w:r>
-      <w:r>
-        <w:t xml:space="preserve"> Kinder, die bei aktuellen Themen mehr als 1 Punkt unter der Erwartung liegen.</w:t>
-      </w:r>
-    </w:p>
-    <w:p>
-      <w:pPr>
-        <w:numPr>
-          <w:ilvl w:val="0"/>
-          <w:numId w:val="1010"/>
-        </w:numPr>
-        <w:pStyle w:val="Compact"/>
-      </w:pPr>
-      <w:r>
-        <w:rPr>
-          <w:bCs/>
-          <w:b/>
-        </w:rPr>
-        <w:t xml:space="preserve">Aktuelle Themen (★):</w:t>
-      </w:r>
-      <w:r>
-        <w:t xml:space="preserve"> was gerade im Unterricht dran ist und wie viele Kinder du dazu in den letzten 14 Tagen bewertet hast.</w:t>
-      </w:r>
-    </w:p>
-    <w:p>
-      <w:pPr>
-        <w:numPr>
-          <w:ilvl w:val="0"/>
-          <w:numId w:val="1010"/>
-        </w:numPr>
-        <w:pStyle w:val="Compact"/>
-      </w:pPr>
-      <w:r>
-        <w:rPr>
-          <w:bCs/>
-          <w:b/>
-        </w:rPr>
-        <w:t xml:space="preserve">Wenig beobachtet:</w:t>
-      </w:r>
-      <w:r>
-        <w:t xml:space="preserve"> Kinder mit wenigen Einträgen in den letzten 4 Wochen.</w:t>
-      </w:r>
-    </w:p>
-    <w:p>
-      <w:pPr>
-        <w:numPr>
-          <w:ilvl w:val="0"/>
-          <w:numId w:val="1010"/>
-        </w:numPr>
-        <w:pStyle w:val="Compact"/>
-      </w:pPr>
-      <w:r>
-        <w:rPr>
-          <w:bCs/>
-          <w:b/>
-        </w:rPr>
-        <w:t xml:space="preserve">Sicherung:</w:t>
-      </w:r>
-      <w:r>
-        <w:t xml:space="preserve"> wann du die letzte Sicherungskopie angelegt hast.</w:t>
-      </w:r>
-    </w:p>
-    <w:p>
-      <w:pPr>
-        <w:numPr>
-          <w:ilvl w:val="0"/>
-          <w:numId w:val="1010"/>
-        </w:numPr>
-        <w:pStyle w:val="Compact"/>
-      </w:pPr>
-      <w:r>
-        <w:t xml:space="preserve">Als Klassenlehrkraft siehst du oben außerdem eine Karte </w:t>
-      </w:r>
-      <w:r>
-        <w:rPr>
-          <w:bCs/>
-          <w:b/>
-        </w:rPr>
-        <w:t xml:space="preserve">Fachlehrkräfte</w:t>
-      </w:r>
-      <w:r>
-        <w:t xml:space="preserve"> mit dem Stand der Rückmeldungen; als Fachlehrkraft eine Karte </w:t>
-      </w:r>
-      <w:r>
-        <w:rPr>
-          <w:bCs/>
-          <w:b/>
-        </w:rPr>
-        <w:t xml:space="preserve">Rückmeldungen</w:t>
-      </w:r>
-      <w:r>
-        <w:t xml:space="preserve">.</w:t>
       </w:r>
     </w:p>
     <w:p>

</xml_diff>

<commit_message>
Einstellungen → Ansicht: Reiter, Erfassen-Arten, Listen und Heute-Karten ausblenden
S.meta.aus mit tab:/mode:/liste:/karte:-Einträgen; Kopfzeile, Erfassen,
Listen, Heute und Schnellsuche richten sich danach. Daten bleiben, Links
öffnen ausgeblendete Bereiche weiterhin. Anleitung 5.9 mit Bild,
CHANGELOG, TECHNIK.md und Test ergänzt.

Co-Authored-By: Claude Opus 5.5 (1M context) <noreply@anthropic.com>
Claude-Session: https://claude.ai/code/session_01NprTnR4Cyf8qYegqQNZPqF
</commit_message>
<xml_diff>
--- a/docs/LeDoK-Bedienungsanleitung.docx
+++ b/docs/LeDoK-Bedienungsanleitung.docx
@@ -2794,7 +2794,7 @@
         <w:pStyle w:val="FirstParagraph"/>
       </w:pPr>
       <w:r>
-        <w:t xml:space="preserve">Heute ist deine Startseite. Oben stehen, wenn nötig, der Hinweis zur Sicherung und der Balken Dein Tag. Darunter ordnet LeDoK die Karten in drei Bereiche: Jetzt im Unterricht, Lernstand im Blick und Organisation. Mit einem Klick auf die Überschrift klappst du einen Bereich zu oder wieder auf; LeDoK merkt sich das. Karten ohne Inhalt, zum Beispiel Offene Listen ohne offene Liste, erscheinen nicht.</w:t>
+        <w:t xml:space="preserve">Heute ist deine Startseite. Oben stehen, wenn nötig, der Hinweis zur Sicherung und der Balken Dein Tag. Darunter ordnet LeDoK die Karten in drei Bereiche: Jetzt im Unterricht, Lernstand im Blick und Organisation. Mit einem Klick auf die Überschrift klappst du einen Bereich zu oder wieder auf; LeDoK merkt sich das. Karten ohne Inhalt, zum Beispiel Offene Listen ohne offene Liste, erscheinen nicht. Karten, die du nie brauchst, blendest du unter Einstellungen → Ansicht ganz aus (Kapitel 5.9).</w:t>
       </w:r>
     </w:p>
     <w:p>
@@ -8794,7 +8794,7 @@
         <w:t xml:space="preserve">⚙ Einstellungen</w:t>
       </w:r>
       <w:r>
-        <w:t xml:space="preserve"> erreichst du neun Bereiche (als Fachlehrkraft zwei).</w:t>
+        <w:t xml:space="preserve"> erreichst du zehn Bereiche (als Fachlehrkraft drei).</w:t>
       </w:r>
     </w:p>
     <w:p>
@@ -10127,6 +10127,84 @@
       </w:r>
       <w:r>
         <w:t xml:space="preserve">.</w:t>
+      </w:r>
+    </w:p>
+    <w:p>
+      <w:pPr>
+        <w:pStyle w:val="BodyText"/>
+      </w:pPr>
+      <w:r>
+        <w:rPr>
+          <w:bCs/>
+          <w:b/>
+        </w:rPr>
+        <w:t xml:space="preserve">Ansicht.</w:t>
+      </w:r>
+      <w:r>
+        <w:t xml:space="preserve"> Hier blendest du aus, was du nicht brauchst: Reiter (außer Heute), Arten zu erfassen (Beobachtung, Fokustag, Fokuswoche, Probe, Lern-App; eine bleibt immer sichtbar), die Bereiche im Reiter Listen und die Karten auf Heute. Entferne dazu den Haken; die Änderung gilt sofort. Sind alle Bereiche unter Listen ausgeblendet, verschwindet auch der Reiter Listen.</w:t>
+      </w:r>
+    </w:p>
+    <w:p>
+      <w:pPr>
+        <w:pStyle w:val="BodyText"/>
+      </w:pPr>
+      <w:r>
+        <w:t xml:space="preserve">Ausblenden versteckt nur Knöpfe und Karten. Deine Daten bleiben vollständig erhalten, und Links aus anderen Bereichen führen weiterhin hin, zum Beispiel Fokustag starten auf Heute. Hängt eine Karte an einem ausgeblendeten Bereich, etwa die Karte Klassenbuch am Reiter Klassenbuch, verschwindet sie mit und LeDoK sagt dir das in der Liste. Auch die Schnellsuche bietet ausgeblendete Reiter und Listen nicht mehr an. Alles wieder einblenden stellt den Ausgangszustand her. Die Einstellung gilt für dieses LeDoK.</w:t>
+      </w:r>
+    </w:p>
+    <w:p>
+      <w:pPr>
+        <w:pStyle w:val="CaptionedFigure"/>
+      </w:pPr>
+      <w:r>
+        <w:drawing>
+          <wp:inline>
+            <wp:extent cx="5399999" cy="4260936"/>
+            <wp:effectExtent b="0" l="0" r="0" t="0"/>
+            <wp:docPr descr="Einstellungen → Ansicht" title="" id="9301" name="Picture"/>
+            <a:graphic>
+              <a:graphicData uri="http://schemas.openxmlformats.org/drawingml/2006/picture">
+                <pic:pic>
+                  <pic:nvPicPr>
+                    <pic:cNvPr descr="jpg/27-dokumente.jpg" id="9302" name="Picture"/>
+                    <pic:cNvPicPr>
+                      <a:picLocks noChangeArrowheads="1" noChangeAspect="1"/>
+                    </pic:cNvPicPr>
+                  </pic:nvPicPr>
+                  <pic:blipFill>
+                    <a:blip r:embed="rIdAnsicht"/>
+                    <a:stretch>
+                      <a:fillRect/>
+                    </a:stretch>
+                  </pic:blipFill>
+                  <pic:spPr bwMode="auto">
+                    <a:xfrm>
+                      <a:off x="0" y="0"/>
+                      <a:ext cx="5399999" cy="4260936"/>
+                    </a:xfrm>
+                    <a:prstGeom prst="rect">
+                      <a:avLst/>
+                    </a:prstGeom>
+                    <a:noFill/>
+                    <a:ln w="9525">
+                      <a:noFill/>
+                      <a:headEnd/>
+                      <a:tailEnd/>
+                    </a:ln>
+                  </pic:spPr>
+                </pic:pic>
+              </a:graphicData>
+            </a:graphic>
+          </wp:inline>
+        </w:drawing>
+      </w:r>
+    </w:p>
+    <w:p>
+      <w:pPr>
+        <w:pStyle w:val="ImageCaption"/>
+      </w:pPr>
+      <w:r>
+        <w:t xml:space="preserve">Einstellungen → Ansicht</w:t>
       </w:r>
     </w:p>
     <w:p>

</xml_diff>

<commit_message>
Bewertungsebene pauschal für ein Fach oder einen Bereich festlegen
Co-Authored-By: Claude Opus 5.5 (1M context) <noreply@anthropic.com>
Claude-Session: https://claude.ai/code/session_01UqJ8QpSF6LFnPNXxY8Qnyh
</commit_message>
<xml_diff>
--- a/docs/LeDoK-Bedienungsanleitung.docx
+++ b/docs/LeDoK-Bedienungsanleitung.docx
@@ -3756,7 +3756,7 @@
         <w:t xml:space="preserve">Worauf achten:</w:t>
       </w:r>
       <w:r>
-        <w:t xml:space="preserve"> Ist ein Oberbereich im Raster als Bewertungsebene markiert (◎ Hier bewerten), bewertest du ihn als Ganzes. Seine Unterbereiche erscheinen dann nur noch als Hinweis „Worauf achten“.</w:t>
+        <w:t xml:space="preserve"> Ist ein Oberbereich im Raster als Bewertungsebene markiert (◎ Hier bewerten, auch pauschal für ein ganzes Fach), bewertest du ihn als Ganzes. Seine Unterbereiche erscheinen dann nur noch als Hinweis „Worauf achten“.</w:t>
       </w:r>
     </w:p>
     <w:p>
@@ -9348,6 +9348,25 @@
       </w:r>
       <w:r>
         <w:t xml:space="preserve"> Setzt du bei einem Oberbereich „Hier bewerten“, bewertest du ihn als Ganzes. Seine Unterbereiche werden nicht mehr einzeln erfasst, sondern erscheinen beim Bewerten als „Worauf achten“. Das ist praktisch, wenn dir der Lehrplan zu kleinteilig ist.</w:t>
+      </w:r>
+    </w:p>
+    <w:p>
+      <w:pPr>
+        <w:numPr>
+          <w:ilvl w:val="0"/>
+          <w:numId w:val="1020"/>
+        </w:numPr>
+        <w:pStyle w:val="Compact"/>
+      </w:pPr>
+      <w:r>
+        <w:rPr>
+          <w:bCs/>
+          <w:b/>
+        </w:rPr>
+        <w:t>Bewertungsebene pauschal festlegen:</w:t>
+      </w:r>
+      <w:r>
+        <w:t xml:space="preserve"> Mit „Bewertungsebene in …“ über dem Raster legst du für ein ganzes Fach fest, ob du auf der Ebene der Lernbereiche (LB), Kompetenzen (K) oder Kompetenzerwartungen (KE) bewertest oder „einzeln“ bis zu den Teilbereichen. LeDoK setzt dann bei allen Bereichen dieser Ebene „Hier bewerten“. Einzelne Bereiche stellst du danach anders ein: Klicke zum Beispiel einen Lernbereich an und wähle unter „Bewertungsebene für alle Unterbereiche“ eine feinere Ebene. Ist ein Fach unterschiedlich eingestellt, steht dort „gemischt“. Die Erfassung (Beobachtung, Fokustag …) übernimmt jeder Bereich von seinen Unterbereichen; am häufigsten gewählt gewinnt. Bisherige Bewertungen bleiben erhalten und fließen weiter in Übersicht, Bericht und LEG-Bogen ein.</w:t>
       </w:r>
     </w:p>
     <w:p>

</xml_diff>

<commit_message>
LEG-Planer: höchstens n Termine pro Tag und späteste Uhrzeit
Beim fortlaufenden Vergeben geht es nach vollem Tag am nächsten Schultag
weiter (Wochenenden, Ferien, Feiertage übersprungen). Vorschau im Dialog,
Angaben werden in S.meta.legTermin gemerkt. Anleitung und CHANGELOG ergänzt.

Co-Authored-By: Claude Opus 5.5 (1M context) <noreply@anthropic.com>
Claude-Session: https://claude.ai/code/session_01MmHHA2fLf5zatXhLn1rbu5
</commit_message>
<xml_diff>
--- a/docs/LeDoK-Bedienungsanleitung.docx
+++ b/docs/LeDoK-Bedienungsanleitung.docx
@@ -5137,7 +5137,26 @@
         <w:t xml:space="preserve">Termine fortlaufend vergeben …:</w:t>
       </w:r>
       <w:r>
-        <w:t xml:space="preserve"> Du wählst Tag, Beginn, Minuten je Gespräch (vorgegeben 20) und Pause dazwischen (vorgegeben 5). LeDoK vergibt die Termine in der Reihenfolge der Liste, auf Wunsch nur für Kinder ohne Termin.</w:t>
+        <w:t xml:space="preserve"> Du wählst den ersten Tag, Beginn, Minuten je Gespräch (vorgegeben 20) und Pause dazwischen (vorgegeben 5). LeDoK vergibt die Termine in der Reihenfolge der Liste, auf Wunsch nur für Kinder ohne Termin. Unter dem Formular siehst du vorab, wie viele Termine es werden, auf wie viele Tage sie sich verteilen und wann der letzte ist.</w:t>
+      </w:r>
+    </w:p>
+    <w:p>
+      <w:pPr>
+        <w:numPr>
+          <w:ilvl w:val="0"/>
+          <w:numId w:val="1016"/>
+        </w:numPr>
+        <w:pStyle w:val="Compact"/>
+      </w:pPr>
+      <w:r>
+        <w:rPr>
+          <w:bCs/>
+          <w:b/>
+        </w:rPr>
+        <w:t>Termine pro Tag:</w:t>
+      </w:r>
+      <w:r>
+        <w:t xml:space="preserve"> Mit Höchstens Termine pro Tag (vorgegeben 8) und Letztes Gespräch endet spätestens (vorgegeben 18:00 Uhr) begrenzt du einen Gesprächstag. Ist der Tag voll, plant LeDoK am nächsten Schultag weiter, wieder ab der Beginn-Uhrzeit; Wochenenden, Ferien, Feiertage und die freien Tage deiner Schule überspringt es. Bei 28 Kindern, 20 Minuten je Gespräch und 5 Minuten Pause werden es so zum Beispiel vier Nachmittage statt eines Abends bis nach 22 Uhr. Lässt du ein Feld leer, gilt dafür keine Grenze. LeDoK merkt sich deine Angaben für das nächste Mal.</w:t>
       </w:r>
     </w:p>
     <w:p>

</xml_diff>

<commit_message>
Kind → Kompetenzen im Detail: Überblick bis zur Ebene und Zeilen je Ebene ausblenden
- „Überblick bis“: Bewertungsebene (Voreinstellung, folgt Fächer & Raster), LB, K, KE, alles
- einzelne Bereiche mit ▸/▾ auf- und zuklappen, „wie gewählt“ setzt zurück
- „Zeilen zeigen“: ganze Ebenen aus- und einblenden, eine bleibt sichtbar
- Auswahl in S.meta.kompBaum gemerkt, ◎ markiert die Bewertungsebene
- Test, Bedienungsanleitung, Hilfe, CHANGELOG, TECHNIK.md

Co-Authored-By: Claude Opus 5.5 (1M context) <noreply@anthropic.com>
Claude-Session: https://claude.ai/code/session_014oxUQhFYa5bXdph9uZJWwB
</commit_message>
<xml_diff>
--- a/docs/LeDoK-Bedienungsanleitung.docx
+++ b/docs/LeDoK-Bedienungsanleitung.docx
@@ -4504,7 +4504,7 @@
         <w:t xml:space="preserve">Kompetenzen im Detail:</w:t>
       </w:r>
       <w:r>
-        <w:t xml:space="preserve"> der ganze Kompetenzbaum des Kindes mit allen Werten.</w:t>
+        <w:t xml:space="preserve"> der ganze Kompetenzbaum des Kindes mit allen Werten, aufgeklappt bis zur Bewertungsebene. Siehe unten.</w:t>
       </w:r>
     </w:p>
     <w:p>
@@ -4648,6 +4648,291 @@
       </w:r>
       <w:r>
         <w:t xml:space="preserve"> Ausgangslage, Ziele, Maßnahmen und Stand der Überprüfung für ein Kind, siehe unten.</w:t>
+      </w:r>
+    </w:p>
+    <w:p>
+      <w:pPr>
+        <w:pStyle w:val="FirstParagraph"/>
+      </w:pPr>
+      <w:r>
+        <w:rPr>
+          <w:bCs/>
+          <w:b/>
+        </w:rPr>
+        <w:t xml:space="preserve">Kompetenzen im Detail.</w:t>
+      </w:r>
+      <w:r>
+        <w:t xml:space="preserve"> Die Tabelle zeigt für jedes Fach die Lernbereiche (</w:t>
+      </w:r>
+      <w:r>
+        <w:rPr>
+          <w:bCs/>
+          <w:b/>
+        </w:rPr>
+        <w:t xml:space="preserve">LB</w:t>
+      </w:r>
+      <w:r>
+        <w:t xml:space="preserve">), Kompetenzen (</w:t>
+      </w:r>
+      <w:r>
+        <w:rPr>
+          <w:bCs/>
+          <w:b/>
+        </w:rPr>
+        <w:t xml:space="preserve">K</w:t>
+      </w:r>
+      <w:r>
+        <w:t xml:space="preserve">), Kompetenzerwartungen (</w:t>
+      </w:r>
+      <w:r>
+        <w:rPr>
+          <w:bCs/>
+          <w:b/>
+        </w:rPr>
+        <w:t xml:space="preserve">KE</w:t>
+      </w:r>
+      <w:r>
+        <w:t xml:space="preserve">) und Teilbereiche (</w:t>
+      </w:r>
+      <w:r>
+        <w:rPr>
+          <w:bCs/>
+          <w:b/>
+        </w:rPr>
+        <w:t xml:space="preserve">TB</w:t>
+      </w:r>
+      <w:r>
+        <w:t xml:space="preserve">). Oberbereiche tragen ein Σ: Ihr Wert ist aus den Unterbereichen berechnet. Mit ◎ sind die Bereiche markiert, die du als Ganzes bewertest.</w:t>
+      </w:r>
+    </w:p>
+    <w:p>
+      <w:pPr>
+        <w:pStyle w:val="BodyText"/>
+      </w:pPr>
+      <w:r>
+        <w:rPr>
+          <w:bCs/>
+          <w:b/>
+        </w:rPr>
+        <w:t xml:space="preserve">Überblick bis</w:t>
+      </w:r>
+      <w:r>
+        <w:t xml:space="preserve">: Mit den Knöpfen über der Tabelle legst du fest, wie weit der Baum aufgeklappt ist. </w:t>
+      </w:r>
+      <w:r>
+        <w:rPr>
+          <w:bCs/>
+          <w:b/>
+        </w:rPr>
+        <w:t xml:space="preserve">Bewertungsebene</w:t>
+      </w:r>
+      <w:r>
+        <w:t xml:space="preserve"> (Voreinstellung) klappt jedes Fach so weit auf, wie du es unter </w:t>
+      </w:r>
+      <w:r>
+        <w:rPr>
+          <w:bCs/>
+          <w:b/>
+        </w:rPr>
+        <w:t xml:space="preserve">Einstellungen → Fächer &amp; Raster</w:t>
+      </w:r>
+      <w:r>
+        <w:t xml:space="preserve"> bei „Bewertungsebene in …“ eingestellt hast; ist ein Lernbereich feiner eingestellt, geht es dort tiefer. </w:t>
+      </w:r>
+      <w:r>
+        <w:rPr>
+          <w:bCs/>
+          <w:b/>
+        </w:rPr>
+        <w:t xml:space="preserve">LB</w:t>
+      </w:r>
+      <w:r>
+        <w:t xml:space="preserve">, </w:t>
+      </w:r>
+      <w:r>
+        <w:rPr>
+          <w:bCs/>
+          <w:b/>
+        </w:rPr>
+        <w:t xml:space="preserve">K</w:t>
+      </w:r>
+      <w:r>
+        <w:t xml:space="preserve"> und </w:t>
+      </w:r>
+      <w:r>
+        <w:rPr>
+          <w:bCs/>
+          <w:b/>
+        </w:rPr>
+        <w:t xml:space="preserve">KE</w:t>
+      </w:r>
+      <w:r>
+        <w:t xml:space="preserve"> zeigen alle Fächer bis zu dieser Ebene, </w:t>
+      </w:r>
+      <w:r>
+        <w:rPr>
+          <w:bCs/>
+          <w:b/>
+        </w:rPr>
+        <w:t xml:space="preserve">alles</w:t>
+      </w:r>
+      <w:r>
+        <w:t xml:space="preserve"> klappt alles auf. Für einen schnellen Überblick wählst du zum Beispiel </w:t>
+      </w:r>
+      <w:r>
+        <w:rPr>
+          <w:bCs/>
+          <w:b/>
+        </w:rPr>
+        <w:t xml:space="preserve">LB</w:t>
+      </w:r>
+      <w:r>
+        <w:t xml:space="preserve">: Du siehst je Fach nur die Lernbereiche mit den zusammengefassten Werten.</w:t>
+      </w:r>
+    </w:p>
+    <w:p>
+      <w:pPr>
+        <w:pStyle w:val="BodyText"/>
+      </w:pPr>
+      <w:r>
+        <w:rPr>
+          <w:bCs/>
+          <w:b/>
+        </w:rPr>
+        <w:t xml:space="preserve">Einzelne Bereiche</w:t>
+      </w:r>
+      <w:r>
+        <w:t xml:space="preserve"> klappst du mit ▸ und ▾ vor der Zeile auf und zu. </w:t>
+      </w:r>
+      <w:r>
+        <w:rPr>
+          <w:bCs/>
+          <w:b/>
+        </w:rPr>
+        <w:t xml:space="preserve">wie gewählt</w:t>
+      </w:r>
+      <w:r>
+        <w:t xml:space="preserve"> stellt wieder die gewählte Ebene für alle Bereiche her.</w:t>
+      </w:r>
+    </w:p>
+    <w:p>
+      <w:pPr>
+        <w:pStyle w:val="BodyText"/>
+      </w:pPr>
+      <w:r>
+        <w:rPr>
+          <w:bCs/>
+          <w:b/>
+        </w:rPr>
+        <w:t xml:space="preserve">Zeilen zeigen</w:t>
+      </w:r>
+      <w:r>
+        <w:t xml:space="preserve">: Mit den Knöpfen </w:t>
+      </w:r>
+      <w:r>
+        <w:rPr>
+          <w:bCs/>
+          <w:b/>
+        </w:rPr>
+        <w:t xml:space="preserve">Lernbereiche</w:t>
+      </w:r>
+      <w:r>
+        <w:t xml:space="preserve">, </w:t>
+      </w:r>
+      <w:r>
+        <w:rPr>
+          <w:bCs/>
+          <w:b/>
+        </w:rPr>
+        <w:t xml:space="preserve">Kompetenzen</w:t>
+      </w:r>
+      <w:r>
+        <w:t xml:space="preserve">, </w:t>
+      </w:r>
+      <w:r>
+        <w:rPr>
+          <w:bCs/>
+          <w:b/>
+        </w:rPr>
+        <w:t xml:space="preserve">Kompetenzerwartungen</w:t>
+      </w:r>
+      <w:r>
+        <w:t xml:space="preserve"> und </w:t>
+      </w:r>
+      <w:r>
+        <w:rPr>
+          <w:bCs/>
+          <w:b/>
+        </w:rPr>
+        <w:t xml:space="preserve">Teilbereiche</w:t>
+      </w:r>
+      <w:r>
+        <w:t xml:space="preserve"> blendest du alle Zeilen einer Ebene aus und wieder ein. Blendest du zum Beispiel Lernbereiche und Kompetenzen aus und wählst </w:t>
+      </w:r>
+      <w:r>
+        <w:rPr>
+          <w:bCs/>
+          <w:b/>
+        </w:rPr>
+        <w:t xml:space="preserve">KE</w:t>
+      </w:r>
+      <w:r>
+        <w:t xml:space="preserve">, stehen nur noch die Kompetenzerwartungen untereinander. Eine Ebene bleibt immer sichtbar. LeDoK merkt sich deine Auswahl, auch für die anderen Kinder.</w:t>
+      </w:r>
+    </w:p>
+    <w:p>
+      <w:pPr>
+        <w:pStyle w:val="CaptionedFigure"/>
+      </w:pPr>
+      <w:r>
+        <w:drawing>
+          <wp:inline>
+            <wp:extent cx="5399999" cy="1564569"/>
+            <wp:effectExtent b="0" l="0" r="0" t="0"/>
+            <wp:docPr descr="Kompetenzen im Detail im Überblick bis LB" title="" id="9401" name="Picture"/>
+            <a:graphic>
+              <a:graphicData uri="http://schemas.openxmlformats.org/drawingml/2006/picture">
+                <pic:pic>
+                  <pic:nvPicPr>
+                    <pic:cNvPr descr="kompetenzen-ebenen.jpg" id="9402" name="Picture"/>
+                    <pic:cNvPicPr>
+                      <a:picLocks noChangeArrowheads="1" noChangeAspect="1"/>
+                    </pic:cNvPicPr>
+                  </pic:nvPicPr>
+                  <pic:blipFill>
+                    <a:blip r:embed="rIdKompEb"/>
+                    <a:stretch>
+                      <a:fillRect/>
+                    </a:stretch>
+                  </pic:blipFill>
+                  <pic:spPr bwMode="auto">
+                    <a:xfrm>
+                      <a:off x="0" y="0"/>
+                      <a:ext cx="5399999" cy="1564569"/>
+                    </a:xfrm>
+                    <a:prstGeom prst="rect">
+                      <a:avLst/>
+                    </a:prstGeom>
+                    <a:noFill/>
+                    <a:ln w="9525">
+                      <a:noFill/>
+                      <a:headEnd/>
+                      <a:tailEnd/>
+                    </a:ln>
+                  </pic:spPr>
+                </pic:pic>
+              </a:graphicData>
+            </a:graphic>
+          </wp:inline>
+        </w:drawing>
+      </w:r>
+    </w:p>
+    <w:p>
+      <w:pPr>
+        <w:pStyle w:val="ImageCaption"/>
+      </w:pPr>
+      <w:r>
+        <w:t xml:space="preserve">Kind → Kompetenzen im Detail im Überblick bis zu den Lernbereichen</w:t>
       </w:r>
     </w:p>
     <w:p>

</xml_diff>

<commit_message>
Einstellungen: Seitenleiste mit vier Gruppen statt Kachelraster
Die zehn Bereiche stehen links in einer Seitenleiste, gruppiert nach
Klasse & Team, Schuljahr & Zeit, Bewerten & Dokumente und Programm.
Der aktive Bereich ist markiert und zeigt seine Beschreibung; die Leiste
bleibt beim Scrollen stehen. Unter 1100 px stehen die Gruppen
nebeneinander über dem Inhalt. Bedienungsanleitung mit neuen
Screenshots, CHANGELOG und Tests ergänzt.

Co-Authored-By: Claude Opus 5.5 (1M context) <noreply@anthropic.com>
Claude-Session: https://claude.ai/code/session_01HqBe8xTkBAwTWw2U1mT15v
</commit_message>
<xml_diff>
--- a/docs/LeDoK-Bedienungsanleitung.docx
+++ b/docs/LeDoK-Bedienungsanleitung.docx
@@ -9098,7 +9098,83 @@
         <w:t xml:space="preserve">⚙ Einstellungen</w:t>
       </w:r>
       <w:r>
-        <w:t xml:space="preserve"> erreichst du zehn Bereiche (als Fachlehrkraft drei).</w:t>
+        <w:t xml:space="preserve"> erreichst du zehn Bereiche (als Fachlehrkraft drei). Sie stehen links in einer Seitenleiste, in vier Gruppen geordnet:</w:t>
+      </w:r>
+    </w:p>
+    <w:p>
+      <w:pPr>
+        <w:numPr>
+          <w:ilvl w:val="0"/>
+          <w:numId w:val="1020"/>
+        </w:numPr>
+        <w:pStyle w:val="Compact"/>
+      </w:pPr>
+      <w:r>
+        <w:rPr>
+          <w:bCs/>
+          <w:b/>
+        </w:rPr>
+        <w:t xml:space="preserve">Klasse &amp; Team:</w:t>
+      </w:r>
+      <w:r>
+        <w:t xml:space="preserve"> Klasse, Fachlehrkräfte (als Fachlehrkraft: Fachpakete)</w:t>
+      </w:r>
+    </w:p>
+    <w:p>
+      <w:pPr>
+        <w:numPr>
+          <w:ilvl w:val="0"/>
+          <w:numId w:val="1020"/>
+        </w:numPr>
+        <w:pStyle w:val="Compact"/>
+      </w:pPr>
+      <w:r>
+        <w:rPr>
+          <w:bCs/>
+          <w:b/>
+        </w:rPr>
+        <w:t xml:space="preserve">Schuljahr &amp; Zeit:</w:t>
+      </w:r>
+      <w:r>
+        <w:t xml:space="preserve"> Schuljahr, Stundenplan, Ferien &amp; Feiertage</w:t>
+      </w:r>
+    </w:p>
+    <w:p>
+      <w:pPr>
+        <w:numPr>
+          <w:ilvl w:val="0"/>
+          <w:numId w:val="1020"/>
+        </w:numPr>
+        <w:pStyle w:val="Compact"/>
+      </w:pPr>
+      <w:r>
+        <w:rPr>
+          <w:bCs/>
+          <w:b/>
+        </w:rPr>
+        <w:t xml:space="preserve">Bewerten &amp; Dokumente:</w:t>
+      </w:r>
+      <w:r>
+        <w:t xml:space="preserve"> Fächer &amp; Raster, Textbausteine, Dokumente</w:t>
+      </w:r>
+    </w:p>
+    <w:p>
+      <w:pPr>
+        <w:numPr>
+          <w:ilvl w:val="0"/>
+          <w:numId w:val="1020"/>
+        </w:numPr>
+        <w:pStyle w:val="Compact"/>
+      </w:pPr>
+      <w:r>
+        <w:rPr>
+          <w:bCs/>
+          <w:b/>
+        </w:rPr>
+        <w:t xml:space="preserve">Programm:</w:t>
+      </w:r>
+      <w:r>
+        <w:t xml:space="preserve"> Ansicht, Daten &amp; Sicherheit</w:t>
       </w:r>
     </w:p>
     <w:p>
@@ -9106,6 +9182,24 @@
         <w:pStyle w:val="BodyText"/>
       </w:pPr>
       <w:r>
+        <w:t xml:space="preserve">Der Bereich, in dem du gerade bist, ist farbig markiert und zeigt darunter in einer Zeile, was du dort einstellst. Die Seitenleiste bleibt beim Scrollen stehen, so wechselst du auch von weit unten mit einem Klick, etwa vom Raster zu den Textbausteinen. Mit </w:t>
+      </w:r>
+      <w:r>
+        <w:rPr>
+          <w:bCs/>
+          <w:b/>
+        </w:rPr>
+        <w:t xml:space="preserve">← Zurück zum Erfassen</w:t>
+      </w:r>
+      <w:r>
+        <w:t xml:space="preserve"> unter der Leiste geht es zurück. Auf schmalen Bildschirmen (Tablet, Handy) stehen die vier Gruppen nebeneinander über dem Inhalt. Mit der Schnellsuche (Strg+K) erreichst du jeden Bereich auch direkt.</w:t>
+      </w:r>
+    </w:p>
+    <w:p>
+      <w:pPr>
+        <w:pStyle w:val="BodyText"/>
+      </w:pPr>
+      <w:r>
         <w:rPr>
           <w:bCs/>
           <w:b/>
@@ -9144,6 +9238,235 @@
       </w:r>
       <w:r>
         <w:t xml:space="preserve"> verteilt alle Kinder gleichmäßig auf Montag bis Freitag.</w:t>
+      </w:r>
+    </w:p>
+    <w:p>
+      <w:pPr>
+        <w:pStyle w:val="BodyText"/>
+      </w:pPr>
+      <w:r>
+        <w:rPr>
+          <w:bCs/>
+          <w:b/>
+        </w:rPr>
+        <w:t xml:space="preserve">Fachlehrkräfte.</w:t>
+      </w:r>
+      <w:r>
+        <w:t xml:space="preserve"> Siehe Kapitel 6.</w:t>
+      </w:r>
+    </w:p>
+    <w:p>
+      <w:pPr>
+        <w:pStyle w:val="BodyText"/>
+      </w:pPr>
+      <w:r>
+        <w:rPr>
+          <w:bCs/>
+          <w:b/>
+        </w:rPr>
+        <w:t xml:space="preserve">Schuljahr.</w:t>
+      </w:r>
+      <w:r>
+        <w:t xml:space="preserve"> Der Schuljahres-Assistent führt in 12 Schritten durch den Wechsel. Die Haken setzt du selbst; sie werden je Schuljahr gespeichert.</w:t>
+      </w:r>
+    </w:p>
+    <w:p>
+      <w:pPr>
+        <w:pStyle w:val="CaptionedFigure"/>
+      </w:pPr>
+      <w:r>
+        <w:drawing>
+          <wp:inline>
+            <wp:extent cx="5399999" cy="3377454"/>
+            <wp:effectExtent b="0" l="0" r="0" t="0"/>
+            <wp:docPr descr="Der Schuljahres-Assistent" title="" id="99" name="Picture"/>
+            <a:graphic>
+              <a:graphicData uri="http://schemas.openxmlformats.org/drawingml/2006/picture">
+                <pic:pic>
+                  <pic:nvPicPr>
+                    <pic:cNvPr descr="jpg/13-schuljahr.jpg" id="100" name="Picture"/>
+                    <pic:cNvPicPr>
+                      <a:picLocks noChangeArrowheads="1" noChangeAspect="1"/>
+                    </pic:cNvPicPr>
+                  </pic:nvPicPr>
+                  <pic:blipFill>
+                    <a:blip r:embed="rId98"/>
+                    <a:stretch>
+                      <a:fillRect/>
+                    </a:stretch>
+                  </pic:blipFill>
+                  <pic:spPr bwMode="auto">
+                    <a:xfrm>
+                      <a:off x="0" y="0"/>
+                      <a:ext cx="5399999" cy="3377454"/>
+                    </a:xfrm>
+                    <a:prstGeom prst="rect">
+                      <a:avLst/>
+                    </a:prstGeom>
+                    <a:noFill/>
+                    <a:ln w="9525">
+                      <a:noFill/>
+                      <a:headEnd/>
+                      <a:tailEnd/>
+                    </a:ln>
+                  </pic:spPr>
+                </pic:pic>
+              </a:graphicData>
+            </a:graphic>
+          </wp:inline>
+        </w:drawing>
+      </w:r>
+    </w:p>
+    <w:p>
+      <w:pPr>
+        <w:pStyle w:val="ImageCaption"/>
+      </w:pPr>
+      <w:r>
+        <w:t xml:space="preserve">Der Schuljahres-Assistent</w:t>
+      </w:r>
+    </w:p>
+    <w:p>
+      <w:pPr>
+        <w:numPr>
+          <w:ilvl w:val="0"/>
+          <w:numId w:val="1019"/>
+        </w:numPr>
+        <w:pStyle w:val="Compact"/>
+      </w:pPr>
+      <w:r>
+        <w:t xml:space="preserve">Sicherungskopie des alten Schuljahres</w:t>
+      </w:r>
+    </w:p>
+    <w:p>
+      <w:pPr>
+        <w:numPr>
+          <w:ilvl w:val="0"/>
+          <w:numId w:val="1019"/>
+        </w:numPr>
+        <w:pStyle w:val="Compact"/>
+      </w:pPr>
+      <w:r>
+        <w:t xml:space="preserve">Berichte und LEG-Bögen sichern (optional)</w:t>
+      </w:r>
+    </w:p>
+    <w:p>
+      <w:pPr>
+        <w:numPr>
+          <w:ilvl w:val="0"/>
+          <w:numId w:val="1019"/>
+        </w:numPr>
+        <w:pStyle w:val="Compact"/>
+      </w:pPr>
+      <w:r>
+        <w:t xml:space="preserve">Schuljahreswechsel: Abgänger entfernen, alle anderen rücken eine Jahrgangsstufe vor („1c“ wird „2c“). Die Arbeitsdaten der Abgänger werden gelöscht; vorher legt LeDoK automatisch eine Sicherung an.</w:t>
+      </w:r>
+    </w:p>
+    <w:p>
+      <w:pPr>
+        <w:numPr>
+          <w:ilvl w:val="0"/>
+          <w:numId w:val="1019"/>
+        </w:numPr>
+        <w:pStyle w:val="Compact"/>
+      </w:pPr>
+      <w:r>
+        <w:t xml:space="preserve">Neue Kinder aufnehmen</w:t>
+      </w:r>
+    </w:p>
+    <w:p>
+      <w:pPr>
+        <w:numPr>
+          <w:ilvl w:val="0"/>
+          <w:numId w:val="1019"/>
+        </w:numPr>
+        <w:pStyle w:val="Compact"/>
+      </w:pPr>
+      <w:r>
+        <w:t xml:space="preserve">Lernniveau prüfen</w:t>
+      </w:r>
+    </w:p>
+    <w:p>
+      <w:pPr>
+        <w:numPr>
+          <w:ilvl w:val="0"/>
+          <w:numId w:val="1019"/>
+        </w:numPr>
+        <w:pStyle w:val="Compact"/>
+      </w:pPr>
+      <w:r>
+        <w:t xml:space="preserve">Lehrplan einspielen (Standardvorlage oder eigene CSV)</w:t>
+      </w:r>
+    </w:p>
+    <w:p>
+      <w:pPr>
+        <w:numPr>
+          <w:ilvl w:val="0"/>
+          <w:numId w:val="1019"/>
+        </w:numPr>
+        <w:pStyle w:val="Compact"/>
+      </w:pPr>
+      <w:r>
+        <w:t xml:space="preserve">Fächer prüfen</w:t>
+      </w:r>
+    </w:p>
+    <w:p>
+      <w:pPr>
+        <w:numPr>
+          <w:ilvl w:val="0"/>
+          <w:numId w:val="1019"/>
+        </w:numPr>
+        <w:pStyle w:val="Compact"/>
+      </w:pPr>
+      <w:r>
+        <w:t xml:space="preserve">Fokustage verteilen</w:t>
+      </w:r>
+    </w:p>
+    <w:p>
+      <w:pPr>
+        <w:numPr>
+          <w:ilvl w:val="0"/>
+          <w:numId w:val="1019"/>
+        </w:numPr>
+        <w:pStyle w:val="Compact"/>
+      </w:pPr>
+      <w:r>
+        <w:t xml:space="preserve">Halbjahr auf 1 stellen</w:t>
+      </w:r>
+    </w:p>
+    <w:p>
+      <w:pPr>
+        <w:numPr>
+          <w:ilvl w:val="0"/>
+          <w:numId w:val="1019"/>
+        </w:numPr>
+        <w:pStyle w:val="Compact"/>
+      </w:pPr>
+      <w:r>
+        <w:t xml:space="preserve">Ferien und freie Tage prüfen</w:t>
+      </w:r>
+    </w:p>
+    <w:p>
+      <w:pPr>
+        <w:numPr>
+          <w:ilvl w:val="0"/>
+          <w:numId w:val="1019"/>
+        </w:numPr>
+        <w:pStyle w:val="Compact"/>
+      </w:pPr>
+      <w:r>
+        <w:t xml:space="preserve">★-Markierungen zurücksetzen</w:t>
+      </w:r>
+    </w:p>
+    <w:p>
+      <w:pPr>
+        <w:numPr>
+          <w:ilvl w:val="0"/>
+          <w:numId w:val="1019"/>
+        </w:numPr>
+        <w:pStyle w:val="Compact"/>
+      </w:pPr>
+      <w:r>
+        <w:t xml:space="preserve">Sicherungskopie des neuen Stands</w:t>
       </w:r>
     </w:p>
     <w:p>
@@ -9244,235 +9567,6 @@
       </w:pPr>
       <w:r>
         <w:t xml:space="preserve">Einstellungen → Stundenplan</w:t>
-      </w:r>
-    </w:p>
-    <w:p>
-      <w:pPr>
-        <w:pStyle w:val="BodyText"/>
-      </w:pPr>
-      <w:r>
-        <w:rPr>
-          <w:bCs/>
-          <w:b/>
-        </w:rPr>
-        <w:t xml:space="preserve">Fachlehrkräfte.</w:t>
-      </w:r>
-      <w:r>
-        <w:t xml:space="preserve"> Siehe Kapitel 6.</w:t>
-      </w:r>
-    </w:p>
-    <w:p>
-      <w:pPr>
-        <w:pStyle w:val="BodyText"/>
-      </w:pPr>
-      <w:r>
-        <w:rPr>
-          <w:bCs/>
-          <w:b/>
-        </w:rPr>
-        <w:t xml:space="preserve">Schuljahr.</w:t>
-      </w:r>
-      <w:r>
-        <w:t xml:space="preserve"> Der Schuljahres-Assistent führt in 12 Schritten durch den Wechsel. Die Haken setzt du selbst; sie werden je Schuljahr gespeichert.</w:t>
-      </w:r>
-    </w:p>
-    <w:p>
-      <w:pPr>
-        <w:pStyle w:val="CaptionedFigure"/>
-      </w:pPr>
-      <w:r>
-        <w:drawing>
-          <wp:inline>
-            <wp:extent cx="5399999" cy="3377454"/>
-            <wp:effectExtent b="0" l="0" r="0" t="0"/>
-            <wp:docPr descr="Der Schuljahres-Assistent" title="" id="99" name="Picture"/>
-            <a:graphic>
-              <a:graphicData uri="http://schemas.openxmlformats.org/drawingml/2006/picture">
-                <pic:pic>
-                  <pic:nvPicPr>
-                    <pic:cNvPr descr="jpg/13-schuljahr.jpg" id="100" name="Picture"/>
-                    <pic:cNvPicPr>
-                      <a:picLocks noChangeArrowheads="1" noChangeAspect="1"/>
-                    </pic:cNvPicPr>
-                  </pic:nvPicPr>
-                  <pic:blipFill>
-                    <a:blip r:embed="rId98"/>
-                    <a:stretch>
-                      <a:fillRect/>
-                    </a:stretch>
-                  </pic:blipFill>
-                  <pic:spPr bwMode="auto">
-                    <a:xfrm>
-                      <a:off x="0" y="0"/>
-                      <a:ext cx="5399999" cy="3377454"/>
-                    </a:xfrm>
-                    <a:prstGeom prst="rect">
-                      <a:avLst/>
-                    </a:prstGeom>
-                    <a:noFill/>
-                    <a:ln w="9525">
-                      <a:noFill/>
-                      <a:headEnd/>
-                      <a:tailEnd/>
-                    </a:ln>
-                  </pic:spPr>
-                </pic:pic>
-              </a:graphicData>
-            </a:graphic>
-          </wp:inline>
-        </w:drawing>
-      </w:r>
-    </w:p>
-    <w:p>
-      <w:pPr>
-        <w:pStyle w:val="ImageCaption"/>
-      </w:pPr>
-      <w:r>
-        <w:t xml:space="preserve">Der Schuljahres-Assistent</w:t>
-      </w:r>
-    </w:p>
-    <w:p>
-      <w:pPr>
-        <w:numPr>
-          <w:ilvl w:val="0"/>
-          <w:numId w:val="1019"/>
-        </w:numPr>
-        <w:pStyle w:val="Compact"/>
-      </w:pPr>
-      <w:r>
-        <w:t xml:space="preserve">Sicherungskopie des alten Schuljahres</w:t>
-      </w:r>
-    </w:p>
-    <w:p>
-      <w:pPr>
-        <w:numPr>
-          <w:ilvl w:val="0"/>
-          <w:numId w:val="1019"/>
-        </w:numPr>
-        <w:pStyle w:val="Compact"/>
-      </w:pPr>
-      <w:r>
-        <w:t xml:space="preserve">Berichte und LEG-Bögen sichern (optional)</w:t>
-      </w:r>
-    </w:p>
-    <w:p>
-      <w:pPr>
-        <w:numPr>
-          <w:ilvl w:val="0"/>
-          <w:numId w:val="1019"/>
-        </w:numPr>
-        <w:pStyle w:val="Compact"/>
-      </w:pPr>
-      <w:r>
-        <w:t xml:space="preserve">Schuljahreswechsel: Abgänger entfernen, alle anderen rücken eine Jahrgangsstufe vor („1c“ wird „2c“). Die Arbeitsdaten der Abgänger werden gelöscht; vorher legt LeDoK automatisch eine Sicherung an.</w:t>
-      </w:r>
-    </w:p>
-    <w:p>
-      <w:pPr>
-        <w:numPr>
-          <w:ilvl w:val="0"/>
-          <w:numId w:val="1019"/>
-        </w:numPr>
-        <w:pStyle w:val="Compact"/>
-      </w:pPr>
-      <w:r>
-        <w:t xml:space="preserve">Neue Kinder aufnehmen</w:t>
-      </w:r>
-    </w:p>
-    <w:p>
-      <w:pPr>
-        <w:numPr>
-          <w:ilvl w:val="0"/>
-          <w:numId w:val="1019"/>
-        </w:numPr>
-        <w:pStyle w:val="Compact"/>
-      </w:pPr>
-      <w:r>
-        <w:t xml:space="preserve">Lernniveau prüfen</w:t>
-      </w:r>
-    </w:p>
-    <w:p>
-      <w:pPr>
-        <w:numPr>
-          <w:ilvl w:val="0"/>
-          <w:numId w:val="1019"/>
-        </w:numPr>
-        <w:pStyle w:val="Compact"/>
-      </w:pPr>
-      <w:r>
-        <w:t xml:space="preserve">Lehrplan einspielen (Standardvorlage oder eigene CSV)</w:t>
-      </w:r>
-    </w:p>
-    <w:p>
-      <w:pPr>
-        <w:numPr>
-          <w:ilvl w:val="0"/>
-          <w:numId w:val="1019"/>
-        </w:numPr>
-        <w:pStyle w:val="Compact"/>
-      </w:pPr>
-      <w:r>
-        <w:t xml:space="preserve">Fächer prüfen</w:t>
-      </w:r>
-    </w:p>
-    <w:p>
-      <w:pPr>
-        <w:numPr>
-          <w:ilvl w:val="0"/>
-          <w:numId w:val="1019"/>
-        </w:numPr>
-        <w:pStyle w:val="Compact"/>
-      </w:pPr>
-      <w:r>
-        <w:t xml:space="preserve">Fokustage verteilen</w:t>
-      </w:r>
-    </w:p>
-    <w:p>
-      <w:pPr>
-        <w:numPr>
-          <w:ilvl w:val="0"/>
-          <w:numId w:val="1019"/>
-        </w:numPr>
-        <w:pStyle w:val="Compact"/>
-      </w:pPr>
-      <w:r>
-        <w:t xml:space="preserve">Halbjahr auf 1 stellen</w:t>
-      </w:r>
-    </w:p>
-    <w:p>
-      <w:pPr>
-        <w:numPr>
-          <w:ilvl w:val="0"/>
-          <w:numId w:val="1019"/>
-        </w:numPr>
-        <w:pStyle w:val="Compact"/>
-      </w:pPr>
-      <w:r>
-        <w:t xml:space="preserve">Ferien und freie Tage prüfen</w:t>
-      </w:r>
-    </w:p>
-    <w:p>
-      <w:pPr>
-        <w:numPr>
-          <w:ilvl w:val="0"/>
-          <w:numId w:val="1019"/>
-        </w:numPr>
-        <w:pStyle w:val="Compact"/>
-      </w:pPr>
-      <w:r>
-        <w:t xml:space="preserve">★-Markierungen zurücksetzen</w:t>
-      </w:r>
-    </w:p>
-    <w:p>
-      <w:pPr>
-        <w:numPr>
-          <w:ilvl w:val="0"/>
-          <w:numId w:val="1019"/>
-        </w:numPr>
-        <w:pStyle w:val="Compact"/>
-      </w:pPr>
-      <w:r>
-        <w:t xml:space="preserve">Sicherungskopie des neuen Stands</w:t>
       </w:r>
     </w:p>
     <w:p>

</xml_diff>